<commit_message>
Mise a jour finale : labels corriges, tableau de bord dynamique Plotly, historique, auteur, lien repo
</commit_message>
<xml_diff>
--- a/reports/rapport.docx
+++ b/reports/rapport.docx
@@ -23,7 +23,7 @@
         <w:pStyle w:val="Author"/>
       </w:pPr>
       <w:r>
-        <w:t xml:space="preserve">M2 FD&amp;IA</w:t>
+        <w:t xml:space="preserve">Yipene Harold Ezekiel BASSOLE</w:t>
       </w:r>
     </w:p>
     <w:p>
@@ -2426,7 +2426,7 @@
         </w:numPr>
       </w:pPr>
       <w:r>
-        <w:t xml:space="preserve">Code source : https://github.com/… (à compléter)</w:t>
+        <w:t xml:space="preserve">Code source : https://github.com/Heathclifffs/tweet-suspect-detection</w:t>
       </w:r>
     </w:p>
     <w:p>
@@ -2438,7 +2438,7 @@
         </w:numPr>
       </w:pPr>
       <w:r>
-        <w:t xml:space="preserve">Dataset : Google Drive</w:t>
+        <w:t xml:space="preserve">Dataset : Google Drive (ID: 1US0luOWPOeVPpUQnpyxr41zrBmeg4Gjk)</w:t>
       </w:r>
     </w:p>
     <w:bookmarkEnd w:id="57"/>

</xml_diff>

<commit_message>
Bonus : BERT, MLflow, GitHub Actions, HF Spaces config
</commit_message>
<xml_diff>
--- a/reports/rapport.docx
+++ b/reports/rapport.docx
@@ -2138,7 +2138,7 @@
     </w:p>
     <w:bookmarkEnd w:id="50"/>
     <w:bookmarkEnd w:id="51"/>
-    <w:bookmarkStart w:id="55" w:name="discussion"/>
+    <w:bookmarkStart w:id="56" w:name="discussion"/>
     <w:p>
       <w:pPr>
         <w:pStyle w:val="Heading1"/>
@@ -2251,13 +2251,21 @@
       </w:r>
     </w:p>
     <w:bookmarkEnd w:id="53"/>
-    <w:bookmarkStart w:id="54" w:name="perspectives-damélioration"/>
+    <w:bookmarkStart w:id="54" w:name="travail-realise-bonus"/>
     <w:p>
       <w:pPr>
         <w:pStyle w:val="Heading2"/>
       </w:pPr>
       <w:r>
-        <w:t xml:space="preserve">Perspectives d’amélioration</w:t>
+        <w:t xml:space="preserve">Travail realise (Bonus)</w:t>
+      </w:r>
+    </w:p>
+    <w:p>
+      <w:pPr>
+        <w:pStyle w:val="FirstParagraph"/>
+      </w:pPr>
+      <w:r>
+        <w:t xml:space="preserve">En complément du cahier des charges initial, les fonctionnalités bonus suivantes ont été implémentées :</w:t>
       </w:r>
     </w:p>
     <w:p>
@@ -2269,39 +2277,32 @@
         </w:numPr>
       </w:pPr>
       <w:r>
-        <w:t xml:space="preserve">Utilisation de</w:t>
-      </w:r>
-      <w:r>
-        <w:t xml:space="preserve"> </w:t>
-      </w:r>
-      <w:r>
         <w:rPr>
           <w:b/>
           <w:bCs/>
         </w:rPr>
-        <w:t xml:space="preserve">Sentence Transformers</w:t>
-      </w:r>
-      <w:r>
-        <w:t xml:space="preserve"> </w:t>
-      </w:r>
-      <w:r>
-        <w:t xml:space="preserve">ou</w:t>
-      </w:r>
-      <w:r>
-        <w:t xml:space="preserve"> </w:t>
-      </w:r>
-      <w:r>
-        <w:rPr>
-          <w:b/>
-          <w:bCs/>
-        </w:rPr>
-        <w:t xml:space="preserve">BERT</w:t>
-      </w:r>
-      <w:r>
-        <w:t xml:space="preserve"> </w:t>
-      </w:r>
-      <w:r>
-        <w:t xml:space="preserve">pour une meilleure représentation sémantique</w:t>
+        <w:t xml:space="preserve">Modele BERT</w:t>
+      </w:r>
+      <w:r>
+        <w:t xml:space="preserve"> </w:t>
+      </w:r>
+      <w:r>
+        <w:t xml:space="preserve">: script d’entraînement</w:t>
+      </w:r>
+      <w:r>
+        <w:t xml:space="preserve"> </w:t>
+      </w:r>
+      <w:r>
+        <w:rPr>
+          <w:rStyle w:val="VerbatimChar"/>
+        </w:rPr>
+        <w:t xml:space="preserve">src/models/train_bert.py</w:t>
+      </w:r>
+      <w:r>
+        <w:t xml:space="preserve"> </w:t>
+      </w:r>
+      <w:r>
+        <w:t xml:space="preserve">utilisant DistilBERT</w:t>
       </w:r>
     </w:p>
     <w:p>
@@ -2313,7 +2314,26 @@
         </w:numPr>
       </w:pPr>
       <w:r>
-        <w:t xml:space="preserve">Déploiement sur le cloud (Hugging Face Spaces / Render)</w:t>
+        <w:rPr>
+          <w:b/>
+          <w:bCs/>
+        </w:rPr>
+        <w:t xml:space="preserve">MLflow</w:t>
+      </w:r>
+      <w:r>
+        <w:t xml:space="preserve"> </w:t>
+      </w:r>
+      <w:r>
+        <w:t xml:space="preserve">: tracking des expérimentations avec</w:t>
+      </w:r>
+      <w:r>
+        <w:t xml:space="preserve"> </w:t>
+      </w:r>
+      <w:r>
+        <w:rPr>
+          <w:rStyle w:val="VerbatimChar"/>
+        </w:rPr>
+        <w:t xml:space="preserve">src/models/train_with_mlflow.py</w:t>
       </w:r>
     </w:p>
     <w:p>
@@ -2325,7 +2345,32 @@
         </w:numPr>
       </w:pPr>
       <w:r>
-        <w:t xml:space="preserve">Intégration CI/CD avec GitHub Actions pour automatiser le pipeline DVC</w:t>
+        <w:rPr>
+          <w:b/>
+          <w:bCs/>
+        </w:rPr>
+        <w:t xml:space="preserve">CI/CD</w:t>
+      </w:r>
+      <w:r>
+        <w:t xml:space="preserve"> </w:t>
+      </w:r>
+      <w:r>
+        <w:t xml:space="preserve">: workflow GitHub Actions pour exécuter</w:t>
+      </w:r>
+      <w:r>
+        <w:t xml:space="preserve"> </w:t>
+      </w:r>
+      <w:r>
+        <w:rPr>
+          <w:rStyle w:val="VerbatimChar"/>
+        </w:rPr>
+        <w:t xml:space="preserve">dvc repro</w:t>
+      </w:r>
+      <w:r>
+        <w:t xml:space="preserve"> </w:t>
+      </w:r>
+      <w:r>
+        <w:t xml:space="preserve">automatiquement</w:t>
       </w:r>
     </w:p>
     <w:p>
@@ -2337,72 +2382,27 @@
         </w:numPr>
       </w:pPr>
       <w:r>
-        <w:t xml:space="preserve">Expérimentation avec MLflow pour le suivi des runs et la comparaison d’expériences</w:t>
-      </w:r>
-    </w:p>
-    <w:p>
-      <w:pPr>
-        <w:pStyle w:val="Compact"/>
-        <w:numPr>
-          <w:ilvl w:val="0"/>
-          <w:numId w:val="1008"/>
-        </w:numPr>
-      </w:pPr>
-      <w:r>
-        <w:t xml:space="preserve">Ajout d’un dataset spécialisé hate speech pour améliorer la détection des contenus sensibles</w:t>
-      </w:r>
-    </w:p>
-    <w:p>
-      <w:pPr>
-        <w:pStyle w:val="Compact"/>
-        <w:numPr>
-          <w:ilvl w:val="0"/>
-          <w:numId w:val="1008"/>
-        </w:numPr>
-      </w:pPr>
-      <w:r>
-        <w:t xml:space="preserve">Export CSV de l’historique des analyses</w:t>
-      </w:r>
-    </w:p>
-    <w:p>
-      <w:pPr>
-        <w:pStyle w:val="Compact"/>
-        <w:numPr>
-          <w:ilvl w:val="0"/>
-          <w:numId w:val="1008"/>
-        </w:numPr>
-      </w:pPr>
-      <w:r>
-        <w:t xml:space="preserve">Mode batch pour analyser un fichier CSV de tweets</w:t>
+        <w:rPr>
+          <w:b/>
+          <w:bCs/>
+        </w:rPr>
+        <w:t xml:space="preserve">Hugging Face Spaces</w:t>
+      </w:r>
+      <w:r>
+        <w:t xml:space="preserve"> </w:t>
+      </w:r>
+      <w:r>
+        <w:t xml:space="preserve">: configuration YAML intégrée au README pour un déploiement cloud en un clic</w:t>
       </w:r>
     </w:p>
     <w:bookmarkEnd w:id="54"/>
-    <w:bookmarkEnd w:id="55"/>
-    <w:bookmarkStart w:id="56" w:name="conclusion"/>
-    <w:p>
-      <w:pPr>
-        <w:pStyle w:val="Heading1"/>
-      </w:pPr>
-      <w:r>
-        <w:t xml:space="preserve">Conclusion</w:t>
-      </w:r>
-    </w:p>
-    <w:p>
-      <w:pPr>
-        <w:pStyle w:val="FirstParagraph"/>
-      </w:pPr>
-      <w:r>
-        <w:t xml:space="preserve">Ce projet a permis de mettre en œuvre un pipeline complet de Machine Learning pour la détection de tweets suspects. Les meilleurs résultats (F1 &gt; 98%) montrent la faisabilité de la tâche avec des approches classiques. L’utilisation de DVC assure la reproductibilité du pipeline, et le déploiement via Streamlit/FastAPI permet une utilisation en conditions réelles.</w:t>
-      </w:r>
-    </w:p>
-    <w:bookmarkEnd w:id="56"/>
-    <w:bookmarkStart w:id="57" w:name="références"/>
-    <w:p>
-      <w:pPr>
-        <w:pStyle w:val="Heading1"/>
-      </w:pPr>
-      <w:r>
-        <w:t xml:space="preserve">Références</w:t>
+    <w:bookmarkStart w:id="55" w:name="perspectives-damélioration"/>
+    <w:p>
+      <w:pPr>
+        <w:pStyle w:val="Heading2"/>
+      </w:pPr>
+      <w:r>
+        <w:t xml:space="preserve">Perspectives d’amélioration</w:t>
       </w:r>
     </w:p>
     <w:p>
@@ -2414,7 +2414,7 @@
         </w:numPr>
       </w:pPr>
       <w:r>
-        <w:t xml:space="preserve">Sujet : Détection_de_Tweet_Suspect_2026.md</w:t>
+        <w:t xml:space="preserve">Ajout d’un dataset spécialisé hate speech pour améliorer la détection des contenus sensibles</w:t>
       </w:r>
     </w:p>
     <w:p>
@@ -2426,7 +2426,7 @@
         </w:numPr>
       </w:pPr>
       <w:r>
-        <w:t xml:space="preserve">Code source : https://github.com/Heathclifffs/tweet-suspect-detection</w:t>
+        <w:t xml:space="preserve">Export CSV de l’historique des analyses</w:t>
       </w:r>
     </w:p>
     <w:p>
@@ -2438,10 +2438,75 @@
         </w:numPr>
       </w:pPr>
       <w:r>
+        <w:t xml:space="preserve">Mode batch pour analyser un fichier CSV de tweets</w:t>
+      </w:r>
+    </w:p>
+    <w:bookmarkEnd w:id="55"/>
+    <w:bookmarkEnd w:id="56"/>
+    <w:bookmarkStart w:id="57" w:name="conclusion"/>
+    <w:p>
+      <w:pPr>
+        <w:pStyle w:val="Heading1"/>
+      </w:pPr>
+      <w:r>
+        <w:t xml:space="preserve">Conclusion</w:t>
+      </w:r>
+    </w:p>
+    <w:p>
+      <w:pPr>
+        <w:pStyle w:val="FirstParagraph"/>
+      </w:pPr>
+      <w:r>
+        <w:t xml:space="preserve">Ce projet a permis de mettre en œuvre un pipeline complet de Machine Learning pour la détection de tweets suspects. Les meilleurs résultats (F1 &gt; 98%) montrent la faisabilité de la tâche avec des approches classiques. L’utilisation de DVC assure la reproductibilité du pipeline, et le déploiement via Streamlit/FastAPI permet une utilisation en conditions réelles.</w:t>
+      </w:r>
+    </w:p>
+    <w:bookmarkEnd w:id="57"/>
+    <w:bookmarkStart w:id="58" w:name="références"/>
+    <w:p>
+      <w:pPr>
+        <w:pStyle w:val="Heading1"/>
+      </w:pPr>
+      <w:r>
+        <w:t xml:space="preserve">Références</w:t>
+      </w:r>
+    </w:p>
+    <w:p>
+      <w:pPr>
+        <w:pStyle w:val="Compact"/>
+        <w:numPr>
+          <w:ilvl w:val="0"/>
+          <w:numId w:val="1010"/>
+        </w:numPr>
+      </w:pPr>
+      <w:r>
+        <w:t xml:space="preserve">Sujet : Détection_de_Tweet_Suspect_2026.md</w:t>
+      </w:r>
+    </w:p>
+    <w:p>
+      <w:pPr>
+        <w:pStyle w:val="Compact"/>
+        <w:numPr>
+          <w:ilvl w:val="0"/>
+          <w:numId w:val="1010"/>
+        </w:numPr>
+      </w:pPr>
+      <w:r>
+        <w:t xml:space="preserve">Code source : https://github.com/Heathclifffs/tweet-suspect-detection</w:t>
+      </w:r>
+    </w:p>
+    <w:p>
+      <w:pPr>
+        <w:pStyle w:val="Compact"/>
+        <w:numPr>
+          <w:ilvl w:val="0"/>
+          <w:numId w:val="1010"/>
+        </w:numPr>
+      </w:pPr>
+      <w:r>
         <w:t xml:space="preserve">Dataset : Google Drive (ID: 1US0luOWPOeVPpUQnpyxr41zrBmeg4Gjk)</w:t>
       </w:r>
     </w:p>
-    <w:bookmarkEnd w:id="57"/>
+    <w:bookmarkEnd w:id="58"/>
     <w:sectPr>
       <w:footnotePr>
         <w:numRestart w:val="eachSect"/>
@@ -2822,6 +2887,9 @@
     <w:abstractNumId w:val="991"/>
   </w:num>
   <w:num w:numId="1009">
+    <w:abstractNumId w:val="991"/>
+  </w:num>
+  <w:num w:numId="1010">
     <w:abstractNumId w:val="991"/>
   </w:num>
 </w:numbering>

</xml_diff>

<commit_message>
docs: document BERT (F1=99.02%), MLflow, CI/CD, HF Spaces dans rapport + README avec processus de reproduction integral
</commit_message>
<xml_diff>
--- a/reports/rapport.docx
+++ b/reports/rapport.docx
@@ -31,7 +31,7 @@
         <w:pStyle w:val="Date"/>
       </w:pPr>
       <w:r>
-        <w:t xml:space="preserve">Juin 2026</w:t>
+        <w:t xml:space="preserve">Juillet 2026</w:t>
       </w:r>
     </w:p>
     <w:sdt>
@@ -904,15 +904,16 @@
     <w:tbl>
       <w:tblPr>
         <w:tblStyle w:val="Table"/>
-        <w:tblW w:type="auto" w:w="0"/>
+        <w:tblW w:type="pct" w:w="5000"/>
+        <w:tblLayout w:type="fixed"/>
         <w:tblLook w:firstRow="1" w:lastRow="0" w:firstColumn="0" w:lastColumn="0" w:noHBand="0" w:noVBand="0" w:val="0020"/>
       </w:tblPr>
       <w:tblGrid>
-        <w:gridCol w:w="1584"/>
-        <w:gridCol w:w="1584"/>
-        <w:gridCol w:w="1584"/>
-        <w:gridCol w:w="1584"/>
-        <w:gridCol w:w="1584"/>
+        <w:gridCol w:w="1348"/>
+        <w:gridCol w:w="1685"/>
+        <w:gridCol w:w="1853"/>
+        <w:gridCol w:w="1348"/>
+        <w:gridCol w:w="1685"/>
       </w:tblGrid>
       <w:tr>
         <w:trPr>
@@ -1145,6 +1146,89 @@
           </w:p>
         </w:tc>
       </w:tr>
+      <w:tr>
+        <w:tc>
+          <w:tcPr/>
+          <w:p>
+            <w:pPr>
+              <w:pStyle w:val="Compact"/>
+            </w:pPr>
+            <w:r>
+              <w:rPr>
+                <w:b/>
+                <w:bCs/>
+              </w:rPr>
+              <w:t xml:space="preserve">DistilBERT</w:t>
+            </w:r>
+            <w:r>
+              <w:t xml:space="preserve"> </w:t>
+            </w:r>
+            <w:r>
+              <w:t xml:space="preserve">(bonus)</w:t>
+            </w:r>
+          </w:p>
+        </w:tc>
+        <w:tc>
+          <w:tcPr/>
+          <w:p>
+            <w:pPr>
+              <w:pStyle w:val="Compact"/>
+            </w:pPr>
+            <w:r>
+              <w:rPr>
+                <w:b/>
+                <w:bCs/>
+              </w:rPr>
+              <w:t xml:space="preserve">98.24%</w:t>
+            </w:r>
+          </w:p>
+        </w:tc>
+        <w:tc>
+          <w:tcPr/>
+          <w:p>
+            <w:pPr>
+              <w:pStyle w:val="Compact"/>
+            </w:pPr>
+            <w:r>
+              <w:rPr>
+                <w:b/>
+                <w:bCs/>
+              </w:rPr>
+              <w:t xml:space="preserve">98.85%</w:t>
+            </w:r>
+          </w:p>
+        </w:tc>
+        <w:tc>
+          <w:tcPr/>
+          <w:p>
+            <w:pPr>
+              <w:pStyle w:val="Compact"/>
+            </w:pPr>
+            <w:r>
+              <w:rPr>
+                <w:b/>
+                <w:bCs/>
+              </w:rPr>
+              <w:t xml:space="preserve">99.19%</w:t>
+            </w:r>
+          </w:p>
+        </w:tc>
+        <w:tc>
+          <w:tcPr/>
+          <w:p>
+            <w:pPr>
+              <w:pStyle w:val="Compact"/>
+            </w:pPr>
+            <w:r>
+              <w:rPr>
+                <w:b/>
+                <w:bCs/>
+              </w:rPr>
+              <w:t xml:space="preserve">99.02%</w:t>
+            </w:r>
+          </w:p>
+        </w:tc>
+      </w:tr>
     </w:tbl>
     <w:p>
       <w:pPr>
@@ -1167,7 +1251,7 @@
         <w:t xml:space="preserve"> </w:t>
       </w:r>
       <w:r>
-        <w:t xml:space="preserve">obtient les meilleures performances globales avec un F1-Score de</w:t>
+        <w:t xml:space="preserve">obtient les meilleures performances globales parmi les approches classiques avec un F1-Score de</w:t>
       </w:r>
       <w:r>
         <w:t xml:space="preserve"> </w:t>
@@ -1180,7 +1264,36 @@
         <w:t xml:space="preserve">98.64%</w:t>
       </w:r>
       <w:r>
-        <w:t xml:space="preserve">.</w:t>
+        <w:t xml:space="preserve">. Le</w:t>
+      </w:r>
+      <w:r>
+        <w:t xml:space="preserve"> </w:t>
+      </w:r>
+      <w:r>
+        <w:rPr>
+          <w:b/>
+          <w:bCs/>
+        </w:rPr>
+        <w:t xml:space="preserve">DistilBERT</w:t>
+      </w:r>
+      <w:r>
+        <w:t xml:space="preserve">, entraîné sur une seule époque, atteint</w:t>
+      </w:r>
+      <w:r>
+        <w:t xml:space="preserve"> </w:t>
+      </w:r>
+      <w:r>
+        <w:rPr>
+          <w:b/>
+          <w:bCs/>
+        </w:rPr>
+        <w:t xml:space="preserve">99.02%</w:t>
+      </w:r>
+      <w:r>
+        <w:t xml:space="preserve"> </w:t>
+      </w:r>
+      <w:r>
+        <w:t xml:space="preserve">de F1-Score, démontrant la puissance des transformers pour cette tâche.</w:t>
       </w:r>
     </w:p>
     <w:bookmarkEnd w:id="19"/>
@@ -1207,7 +1320,7 @@
               <a:graphicData uri="http://schemas.openxmlformats.org/drawingml/2006/picture">
                 <pic:pic>
                   <pic:nvPicPr>
-                    <pic:cNvPr descr="reports/figures/confusion_matrices_notebook.png" id="22" name="Picture"/>
+                    <pic:cNvPr descr="figures/confusion_matrices_notebook.png" id="22" name="Picture"/>
                     <pic:cNvPicPr>
                       <a:picLocks noChangeArrowheads="1" noChangeAspect="1"/>
                     </pic:cNvPicPr>
@@ -1280,7 +1393,7 @@
               <a:graphicData uri="http://schemas.openxmlformats.org/drawingml/2006/picture">
                 <pic:pic>
                   <pic:nvPicPr>
-                    <pic:cNvPr descr="reports/figures/roc_curves_notebook.png" id="26" name="Picture"/>
+                    <pic:cNvPr descr="figures/roc_curves_notebook.png" id="26" name="Picture"/>
                     <pic:cNvPicPr>
                       <a:picLocks noChangeArrowheads="1" noChangeAspect="1"/>
                     </pic:cNvPicPr>
@@ -1393,7 +1506,7 @@
     </w:p>
     <w:bookmarkEnd w:id="28"/>
     <w:bookmarkEnd w:id="29"/>
-    <w:bookmarkStart w:id="32" w:name="pipeline-dvc"/>
+    <w:bookmarkStart w:id="33" w:name="pipeline-dvc"/>
     <w:p>
       <w:pPr>
         <w:pStyle w:val="Heading1"/>
@@ -1440,7 +1553,16 @@
         <w:t xml:space="preserve"> </w:t>
       </w:r>
       <w:r>
-        <w:t xml:space="preserve">: nettoyage du texte</w:t>
+        <w:t xml:space="preserve">: nettoyage du texte (</w:t>
+      </w:r>
+      <w:r>
+        <w:rPr>
+          <w:rStyle w:val="VerbatimChar"/>
+        </w:rPr>
+        <w:t xml:space="preserve">src/preprocessing.py</w:t>
+      </w:r>
+      <w:r>
+        <w:t xml:space="preserve">)</w:t>
       </w:r>
     </w:p>
     <w:p>
@@ -1462,7 +1584,16 @@
         <w:t xml:space="preserve"> </w:t>
       </w:r>
       <w:r>
-        <w:t xml:space="preserve">: entraînement des 3 modèles avec TF-IDF</w:t>
+        <w:t xml:space="preserve">: entraînement des 3 modèles avec TF-IDF (</w:t>
+      </w:r>
+      <w:r>
+        <w:rPr>
+          <w:rStyle w:val="VerbatimChar"/>
+        </w:rPr>
+        <w:t xml:space="preserve">src/models/train.py</w:t>
+      </w:r>
+      <w:r>
+        <w:t xml:space="preserve">)</w:t>
       </w:r>
     </w:p>
     <w:p>
@@ -1484,16 +1615,48 @@
         <w:t xml:space="preserve"> </w:t>
       </w:r>
       <w:r>
-        <w:t xml:space="preserve">: calcul des métriques et génération des graphiques</w:t>
-      </w:r>
-    </w:p>
-    <w:bookmarkStart w:id="30" w:name="commandes-essentielles"/>
+        <w:t xml:space="preserve">: calcul des métriques et génération des graphiques (</w:t>
+      </w:r>
+      <w:r>
+        <w:rPr>
+          <w:rStyle w:val="VerbatimChar"/>
+        </w:rPr>
+        <w:t xml:space="preserve">src/models/evaluate.py</w:t>
+      </w:r>
+      <w:r>
+        <w:t xml:space="preserve">)</w:t>
+      </w:r>
+    </w:p>
+    <w:p>
+      <w:pPr>
+        <w:pStyle w:val="FirstParagraph"/>
+      </w:pPr>
+      <w:r>
+        <w:t xml:space="preserve">Le dataset est téléchargeable via</w:t>
+      </w:r>
+      <w:r>
+        <w:t xml:space="preserve"> </w:t>
+      </w:r>
+      <w:r>
+        <w:rPr>
+          <w:rStyle w:val="VerbatimChar"/>
+        </w:rPr>
+        <w:t xml:space="preserve">uv run python src/download.py</w:t>
+      </w:r>
+      <w:r>
+        <w:t xml:space="preserve"> </w:t>
+      </w:r>
+      <w:r>
+        <w:t xml:space="preserve">(téléchargement interactif depuis Google Drive).</w:t>
+      </w:r>
+    </w:p>
+    <w:bookmarkStart w:id="30" w:name="commandes-essentielles-dvc"/>
     <w:p>
       <w:pPr>
         <w:pStyle w:val="Heading3"/>
       </w:pPr>
       <w:r>
-        <w:t xml:space="preserve">Commandes essentielles</w:t>
+        <w:t xml:space="preserve">Commandes essentielles DVC</w:t>
       </w:r>
     </w:p>
     <w:p>
@@ -1504,7 +1667,7 @@
         <w:rPr>
           <w:rStyle w:val="VerbatimChar"/>
         </w:rPr>
-        <w:t xml:space="preserve">uv run dvc repro          # Exécuter le pipeline</w:t>
+        <w:t xml:space="preserve">uv run dvc repro          # Exécuter le pipeline complet</w:t>
       </w:r>
       <w:r>
         <w:br/>
@@ -1513,7 +1676,7 @@
         <w:rPr>
           <w:rStyle w:val="VerbatimChar"/>
         </w:rPr>
-        <w:t xml:space="preserve">uv run dvc status         # Vérifier l'état</w:t>
+        <w:t xml:space="preserve">uv run dvc status         # Vérifier l'état (étapes modifiées)</w:t>
       </w:r>
       <w:r>
         <w:br/>
@@ -1522,7 +1685,7 @@
         <w:rPr>
           <w:rStyle w:val="VerbatimChar"/>
         </w:rPr>
-        <w:t xml:space="preserve">uv run dvc checkout       # Restaurer depuis le cache</w:t>
+        <w:t xml:space="preserve">uv run dvc checkout       # Restaurer depuis le cache DVC</w:t>
       </w:r>
       <w:r>
         <w:br/>
@@ -1531,7 +1694,7 @@
         <w:rPr>
           <w:rStyle w:val="VerbatimChar"/>
         </w:rPr>
-        <w:t xml:space="preserve">uv run dvc pull           # Récupérer depuis le remote</w:t>
+        <w:t xml:space="preserve">uv run dvc pull           # Récupérer depuis le cache distant</w:t>
       </w:r>
       <w:r>
         <w:br/>
@@ -1540,17 +1703,17 @@
         <w:rPr>
           <w:rStyle w:val="VerbatimChar"/>
         </w:rPr>
-        <w:t xml:space="preserve">uv run dvc push           # Pousser vers le remote</w:t>
+        <w:t xml:space="preserve">uv run dvc push           # Pousser vers le cache distant</w:t>
       </w:r>
     </w:p>
     <w:bookmarkEnd w:id="30"/>
-    <w:bookmarkStart w:id="31" w:name="reproductibilité-complète"/>
+    <w:bookmarkStart w:id="31" w:name="reproduction-intégrale-core-bonus"/>
     <w:p>
       <w:pPr>
         <w:pStyle w:val="Heading3"/>
       </w:pPr>
       <w:r>
-        <w:t xml:space="preserve">Reproductibilité complète</w:t>
+        <w:t xml:space="preserve">Reproduction intégrale (core + bonus)</w:t>
       </w:r>
     </w:p>
     <w:p>
@@ -1561,6 +1724,138 @@
         <w:rPr>
           <w:rStyle w:val="VerbatimChar"/>
         </w:rPr>
+        <w:t xml:space="preserve"># 1. Pipeline classique (preprocess → train → evaluate)</w:t>
+      </w:r>
+      <w:r>
+        <w:br/>
+      </w:r>
+      <w:r>
+        <w:rPr>
+          <w:rStyle w:val="VerbatimChar"/>
+        </w:rPr>
+        <w:t xml:space="preserve">uv run dvc repro</w:t>
+      </w:r>
+      <w:r>
+        <w:br/>
+      </w:r>
+      <w:r>
+        <w:br/>
+      </w:r>
+      <w:r>
+        <w:rPr>
+          <w:rStyle w:val="VerbatimChar"/>
+        </w:rPr>
+        <w:t xml:space="preserve"># 2. Bonus — DistilBERT (nécessite torch)</w:t>
+      </w:r>
+      <w:r>
+        <w:br/>
+      </w:r>
+      <w:r>
+        <w:rPr>
+          <w:rStyle w:val="VerbatimChar"/>
+        </w:rPr>
+        <w:t xml:space="preserve">uv add torch</w:t>
+      </w:r>
+      <w:r>
+        <w:br/>
+      </w:r>
+      <w:r>
+        <w:rPr>
+          <w:rStyle w:val="VerbatimChar"/>
+        </w:rPr>
+        <w:t xml:space="preserve">uv run python src/models/train_bert.py</w:t>
+      </w:r>
+      <w:r>
+        <w:br/>
+      </w:r>
+      <w:r>
+        <w:br/>
+      </w:r>
+      <w:r>
+        <w:rPr>
+          <w:rStyle w:val="VerbatimChar"/>
+        </w:rPr>
+        <w:t xml:space="preserve"># 3. Bonus — MLflow (tracking des expérimentations)</w:t>
+      </w:r>
+      <w:r>
+        <w:br/>
+      </w:r>
+      <w:r>
+        <w:rPr>
+          <w:rStyle w:val="VerbatimChar"/>
+        </w:rPr>
+        <w:t xml:space="preserve">uv run python src/models/train_with_mlflow.py</w:t>
+      </w:r>
+      <w:r>
+        <w:br/>
+      </w:r>
+      <w:r>
+        <w:rPr>
+          <w:rStyle w:val="VerbatimChar"/>
+        </w:rPr>
+        <w:t xml:space="preserve">uv run mlflow ui          # Interface web MLflow</w:t>
+      </w:r>
+      <w:r>
+        <w:br/>
+      </w:r>
+      <w:r>
+        <w:br/>
+      </w:r>
+      <w:r>
+        <w:rPr>
+          <w:rStyle w:val="VerbatimChar"/>
+        </w:rPr>
+        <w:t xml:space="preserve"># 4. Bonus — CI/CD</w:t>
+      </w:r>
+      <w:r>
+        <w:br/>
+      </w:r>
+      <w:r>
+        <w:rPr>
+          <w:rStyle w:val="VerbatimChar"/>
+        </w:rPr>
+        <w:t xml:space="preserve"># Automatique : .github/workflows/ci.yml s'exécute à chaque push</w:t>
+      </w:r>
+      <w:r>
+        <w:br/>
+      </w:r>
+      <w:r>
+        <w:br/>
+      </w:r>
+      <w:r>
+        <w:rPr>
+          <w:rStyle w:val="VerbatimChar"/>
+        </w:rPr>
+        <w:t xml:space="preserve"># 5. Bonus — Hugging Face Spaces</w:t>
+      </w:r>
+      <w:r>
+        <w:br/>
+      </w:r>
+      <w:r>
+        <w:rPr>
+          <w:rStyle w:val="VerbatimChar"/>
+        </w:rPr>
+        <w:t xml:space="preserve"># Créer un Space sur huggingface.co/new-space, lier ce dépôt</w:t>
+      </w:r>
+    </w:p>
+    <w:bookmarkEnd w:id="31"/>
+    <w:bookmarkStart w:id="32" w:name="X5fa5a55a40d1cda33634e6ef1b54b5dd444a5a1"/>
+    <w:p>
+      <w:pPr>
+        <w:pStyle w:val="Heading3"/>
+      </w:pPr>
+      <w:r>
+        <w:t xml:space="preserve">Reproductibilité complète (depuis un clone frais)</w:t>
+      </w:r>
+    </w:p>
+    <w:p>
+      <w:pPr>
+        <w:pStyle w:val="SourceCode"/>
+      </w:pPr>
+      <w:r>
+        <w:rPr>
+          <w:rStyle w:val="VerbatimChar"/>
+        </w:rPr>
         <w:t xml:space="preserve">git clone &lt;repo-url&gt;</w:t>
       </w:r>
       <w:r>
@@ -1588,7 +1883,7 @@
         <w:rPr>
           <w:rStyle w:val="VerbatimChar"/>
         </w:rPr>
-        <w:t xml:space="preserve">uv run dvc pull</w:t>
+        <w:t xml:space="preserve">uv run dvc pull           # Récupère les données du cache distant</w:t>
       </w:r>
       <w:r>
         <w:br/>
@@ -1597,35 +1892,30 @@
         <w:rPr>
           <w:rStyle w:val="VerbatimChar"/>
         </w:rPr>
-        <w:t xml:space="preserve">uv run dvc repro</w:t>
-      </w:r>
-    </w:p>
-    <w:p>
-      <w:pPr>
-        <w:pStyle w:val="FirstParagraph"/>
-      </w:pPr>
-      <w:r>
-        <w:t xml:space="preserve">Le dataset est téléchargeable via</w:t>
-      </w:r>
-      <w:r>
-        <w:t xml:space="preserve"> </w:t>
-      </w:r>
-      <w:r>
-        <w:rPr>
-          <w:rStyle w:val="VerbatimChar"/>
-        </w:rPr>
-        <w:t xml:space="preserve">uv run python src/download.py</w:t>
-      </w:r>
-      <w:r>
-        <w:t xml:space="preserve"> </w:t>
-      </w:r>
-      <w:r>
-        <w:t xml:space="preserve">(téléchargement interactif depuis Google Drive).</w:t>
-      </w:r>
-    </w:p>
-    <w:bookmarkEnd w:id="31"/>
+        <w:t xml:space="preserve">uv run dvc repro           # Reproduit le pipeline complet</w:t>
+      </w:r>
+      <w:r>
+        <w:br/>
+      </w:r>
+      <w:r>
+        <w:rPr>
+          <w:rStyle w:val="VerbatimChar"/>
+        </w:rPr>
+        <w:t xml:space="preserve">cat models/metrics.json    # Affiche les métriques</w:t>
+      </w:r>
+      <w:r>
+        <w:br/>
+      </w:r>
+      <w:r>
+        <w:rPr>
+          <w:rStyle w:val="VerbatimChar"/>
+        </w:rPr>
+        <w:t xml:space="preserve">uv run streamlit run src/deploy/streamlit_app.py   # Interface</w:t>
+      </w:r>
+    </w:p>
     <w:bookmarkEnd w:id="32"/>
-    <w:bookmarkStart w:id="33" w:name="optimisation"/>
+    <w:bookmarkEnd w:id="33"/>
+    <w:bookmarkStart w:id="34" w:name="optimisation"/>
     <w:p>
       <w:pPr>
         <w:pStyle w:val="Heading1"/>
@@ -1751,8 +2041,8 @@
         <w:t xml:space="preserve">.</w:t>
       </w:r>
     </w:p>
-    <w:bookmarkEnd w:id="33"/>
-    <w:bookmarkStart w:id="51" w:name="déploiement"/>
+    <w:bookmarkEnd w:id="34"/>
+    <w:bookmarkStart w:id="52" w:name="déploiement"/>
     <w:p>
       <w:pPr>
         <w:pStyle w:val="Heading1"/>
@@ -1785,7 +2075,7 @@
         <w:t xml:space="preserve">est déployée localement et propose 3 onglets avec une interface interactive :</w:t>
       </w:r>
     </w:p>
-    <w:bookmarkStart w:id="40" w:name="prediction"/>
+    <w:bookmarkStart w:id="41" w:name="prediction"/>
     <w:p>
       <w:pPr>
         <w:pStyle w:val="Heading3"/>
@@ -1811,18 +2101,18 @@
           <wp:inline>
             <wp:extent cx="5334000" cy="3750468"/>
             <wp:effectExtent b="0" l="0" r="0" t="0"/>
-            <wp:docPr descr="Interface Streamlit" title="" id="35" name="Picture"/>
+            <wp:docPr descr="Interface Streamlit" title="" id="36" name="Picture"/>
             <a:graphic>
               <a:graphicData uri="http://schemas.openxmlformats.org/drawingml/2006/picture">
                 <pic:pic>
                   <pic:nvPicPr>
-                    <pic:cNvPr descr="reports/figures/streamlit_app.png" id="36" name="Picture"/>
+                    <pic:cNvPr descr="figures/streamlit_app.png" id="37" name="Picture"/>
                     <pic:cNvPicPr>
                       <a:picLocks noChangeArrowheads="1" noChangeAspect="1"/>
                     </pic:cNvPicPr>
                   </pic:nvPicPr>
                   <pic:blipFill>
-                    <a:blip r:embed="rId34"/>
+                    <a:blip r:embed="rId35"/>
                     <a:stretch>
                       <a:fillRect/>
                     </a:stretch>
@@ -1856,18 +2146,18 @@
           <wp:inline>
             <wp:extent cx="5334000" cy="3750468"/>
             <wp:effectExtent b="0" l="0" r="0" t="0"/>
-            <wp:docPr descr="Prédiction Streamlit" title="" id="38" name="Picture"/>
+            <wp:docPr descr="Prédiction Streamlit" title="" id="39" name="Picture"/>
             <a:graphic>
               <a:graphicData uri="http://schemas.openxmlformats.org/drawingml/2006/picture">
                 <pic:pic>
                   <pic:nvPicPr>
-                    <pic:cNvPr descr="reports/figures/streamlit_prediction.png" id="39" name="Picture"/>
+                    <pic:cNvPr descr="figures/streamlit_prediction.png" id="40" name="Picture"/>
                     <pic:cNvPicPr>
                       <a:picLocks noChangeArrowheads="1" noChangeAspect="1"/>
                     </pic:cNvPicPr>
                   </pic:nvPicPr>
                   <pic:blipFill>
-                    <a:blip r:embed="rId37"/>
+                    <a:blip r:embed="rId38"/>
                     <a:stretch>
                       <a:fillRect/>
                     </a:stretch>
@@ -1894,8 +2184,8 @@
         </w:drawing>
       </w:r>
     </w:p>
-    <w:bookmarkEnd w:id="40"/>
-    <w:bookmarkStart w:id="44" w:name="tableau-de-bord-dynamique"/>
+    <w:bookmarkEnd w:id="41"/>
+    <w:bookmarkStart w:id="45" w:name="tableau-de-bord-dynamique"/>
     <w:p>
       <w:pPr>
         <w:pStyle w:val="Heading3"/>
@@ -1967,18 +2257,18 @@
           <wp:inline>
             <wp:extent cx="5334000" cy="3750468"/>
             <wp:effectExtent b="0" l="0" r="0" t="0"/>
-            <wp:docPr descr="Tableau de bord dynamique" title="" id="42" name="Picture"/>
+            <wp:docPr descr="Tableau de bord dynamique" title="" id="43" name="Picture"/>
             <a:graphic>
               <a:graphicData uri="http://schemas.openxmlformats.org/drawingml/2006/picture">
                 <pic:pic>
                   <pic:nvPicPr>
-                    <pic:cNvPr descr="reports/figures/streamlit_dashboard.png" id="43" name="Picture"/>
+                    <pic:cNvPr descr="figures/streamlit_dashboard.png" id="44" name="Picture"/>
                     <pic:cNvPicPr>
                       <a:picLocks noChangeArrowheads="1" noChangeAspect="1"/>
                     </pic:cNvPicPr>
                   </pic:nvPicPr>
                   <pic:blipFill>
-                    <a:blip r:embed="rId41"/>
+                    <a:blip r:embed="rId42"/>
                     <a:stretch>
                       <a:fillRect/>
                     </a:stretch>
@@ -2013,8 +2303,8 @@
         <w:t xml:space="preserve">Tableau de bord dynamique</w:t>
       </w:r>
     </w:p>
-    <w:bookmarkEnd w:id="44"/>
-    <w:bookmarkStart w:id="48" w:name="historique"/>
+    <w:bookmarkEnd w:id="45"/>
+    <w:bookmarkStart w:id="49" w:name="historique"/>
     <w:p>
       <w:pPr>
         <w:pStyle w:val="Heading3"/>
@@ -2040,18 +2330,18 @@
           <wp:inline>
             <wp:extent cx="5334000" cy="3750468"/>
             <wp:effectExtent b="0" l="0" r="0" t="0"/>
-            <wp:docPr descr="Historique des analyses" title="" id="46" name="Picture"/>
+            <wp:docPr descr="Historique des analyses" title="" id="47" name="Picture"/>
             <a:graphic>
               <a:graphicData uri="http://schemas.openxmlformats.org/drawingml/2006/picture">
                 <pic:pic>
                   <pic:nvPicPr>
-                    <pic:cNvPr descr="reports/figures/streamlit_history.png" id="47" name="Picture"/>
+                    <pic:cNvPr descr="figures/streamlit_history.png" id="48" name="Picture"/>
                     <pic:cNvPicPr>
                       <a:picLocks noChangeArrowheads="1" noChangeAspect="1"/>
                     </pic:cNvPicPr>
                   </pic:nvPicPr>
                   <pic:blipFill>
-                    <a:blip r:embed="rId45"/>
+                    <a:blip r:embed="rId46"/>
                     <a:stretch>
                       <a:fillRect/>
                     </a:stretch>
@@ -2086,8 +2376,8 @@
         <w:t xml:space="preserve">Historique des analyses</w:t>
       </w:r>
     </w:p>
-    <w:bookmarkEnd w:id="48"/>
-    <w:bookmarkStart w:id="49" w:name="commande-de-lancement"/>
+    <w:bookmarkEnd w:id="49"/>
+    <w:bookmarkStart w:id="50" w:name="commande-de-lancement"/>
     <w:p>
       <w:pPr>
         <w:pStyle w:val="Heading3"/>
@@ -2107,8 +2397,8 @@
         <w:t xml:space="preserve">uv run streamlit run src/deploy/streamlit_app.py</w:t>
       </w:r>
     </w:p>
-    <w:bookmarkEnd w:id="49"/>
-    <w:bookmarkStart w:id="50" w:name="api-fastapi"/>
+    <w:bookmarkEnd w:id="50"/>
+    <w:bookmarkStart w:id="51" w:name="api-fastapi"/>
     <w:p>
       <w:pPr>
         <w:pStyle w:val="Heading3"/>
@@ -2136,9 +2426,9 @@
         <w:t xml:space="preserve">uv run uvicorn src.deploy.api:app --reload</w:t>
       </w:r>
     </w:p>
-    <w:bookmarkEnd w:id="50"/>
     <w:bookmarkEnd w:id="51"/>
-    <w:bookmarkStart w:id="56" w:name="discussion"/>
+    <w:bookmarkEnd w:id="52"/>
+    <w:bookmarkStart w:id="62" w:name="discussion"/>
     <w:p>
       <w:pPr>
         <w:pStyle w:val="Heading1"/>
@@ -2147,7 +2437,7 @@
         <w:t xml:space="preserve">Discussion</w:t>
       </w:r>
     </w:p>
-    <w:bookmarkStart w:id="52" w:name="limites"/>
+    <w:bookmarkStart w:id="53" w:name="limites"/>
     <w:p>
       <w:pPr>
         <w:pStyle w:val="Heading2"/>
@@ -2204,8 +2494,8 @@
         <w:t xml:space="preserve">Pas de détection multilingue (stop words english uniquement)</w:t>
       </w:r>
     </w:p>
-    <w:bookmarkEnd w:id="52"/>
-    <w:bookmarkStart w:id="53" w:name="difficultés-rencontrées"/>
+    <w:bookmarkEnd w:id="53"/>
+    <w:bookmarkStart w:id="54" w:name="difficultés-rencontrées"/>
     <w:p>
       <w:pPr>
         <w:pStyle w:val="Heading2"/>
@@ -2250,8 +2540,8 @@
         <w:t xml:space="preserve">Mise en place du pipeline DVC avec téléchargement depuis Google Drive</w:t>
       </w:r>
     </w:p>
-    <w:bookmarkEnd w:id="53"/>
-    <w:bookmarkStart w:id="54" w:name="travail-realise-bonus"/>
+    <w:bookmarkEnd w:id="54"/>
+    <w:bookmarkStart w:id="60" w:name="travail-realise-bonus"/>
     <w:p>
       <w:pPr>
         <w:pStyle w:val="Heading2"/>
@@ -2265,7 +2555,516 @@
         <w:pStyle w:val="FirstParagraph"/>
       </w:pPr>
       <w:r>
-        <w:t xml:space="preserve">En complément du cahier des charges initial, les fonctionnalités bonus suivantes ont été implémentées :</w:t>
+        <w:t xml:space="preserve">En complément du cahier des charges initial, 4 fonctionnalités bonus ont été implémentées avec succès :</w:t>
+      </w:r>
+    </w:p>
+    <w:bookmarkStart w:id="55" w:name="b.1-distilbert-transformers"/>
+    <w:p>
+      <w:pPr>
+        <w:pStyle w:val="Heading3"/>
+      </w:pPr>
+      <w:r>
+        <w:t xml:space="preserve">B.1 — DistilBERT (Transformers)</w:t>
+      </w:r>
+    </w:p>
+    <w:p>
+      <w:pPr>
+        <w:pStyle w:val="FirstParagraph"/>
+      </w:pPr>
+      <w:r>
+        <w:t xml:space="preserve">Un script d’entraînement</w:t>
+      </w:r>
+      <w:r>
+        <w:t xml:space="preserve"> </w:t>
+      </w:r>
+      <w:r>
+        <w:rPr>
+          <w:rStyle w:val="VerbatimChar"/>
+        </w:rPr>
+        <w:t xml:space="preserve">src/models/train_bert.py</w:t>
+      </w:r>
+      <w:r>
+        <w:t xml:space="preserve"> </w:t>
+      </w:r>
+      <w:r>
+        <w:t xml:space="preserve">fine-tune</w:t>
+      </w:r>
+      <w:r>
+        <w:t xml:space="preserve"> </w:t>
+      </w:r>
+      <w:r>
+        <w:rPr>
+          <w:b/>
+          <w:bCs/>
+        </w:rPr>
+        <w:t xml:space="preserve">DistilBERT</w:t>
+      </w:r>
+      <w:r>
+        <w:t xml:space="preserve"> </w:t>
+      </w:r>
+      <w:r>
+        <w:t xml:space="preserve">sur le dataset de tweets. Résultats après 1 époque (sur CPU, ~6 min) :</w:t>
+      </w:r>
+    </w:p>
+    <w:tbl>
+      <w:tblPr>
+        <w:tblStyle w:val="Table"/>
+        <w:tblW w:type="auto" w:w="0"/>
+        <w:tblLook w:firstRow="1" w:lastRow="0" w:firstColumn="0" w:lastColumn="0" w:noHBand="0" w:noVBand="0" w:val="0020"/>
+      </w:tblPr>
+      <w:tblGrid>
+        <w:gridCol w:w="3960"/>
+        <w:gridCol w:w="3960"/>
+      </w:tblGrid>
+      <w:tr>
+        <w:trPr>
+          <w:tblHeader w:val="on"/>
+        </w:trPr>
+        <w:tc>
+          <w:tcPr/>
+          <w:p>
+            <w:pPr>
+              <w:pStyle w:val="Compact"/>
+            </w:pPr>
+            <w:r>
+              <w:t xml:space="preserve">Métrique</w:t>
+            </w:r>
+          </w:p>
+        </w:tc>
+        <w:tc>
+          <w:tcPr/>
+          <w:p>
+            <w:pPr>
+              <w:pStyle w:val="Compact"/>
+            </w:pPr>
+            <w:r>
+              <w:t xml:space="preserve">Valeur</w:t>
+            </w:r>
+          </w:p>
+        </w:tc>
+      </w:tr>
+      <w:tr>
+        <w:tc>
+          <w:tcPr/>
+          <w:p>
+            <w:pPr>
+              <w:pStyle w:val="Compact"/>
+            </w:pPr>
+            <w:r>
+              <w:t xml:space="preserve">Accuracy</w:t>
+            </w:r>
+          </w:p>
+        </w:tc>
+        <w:tc>
+          <w:tcPr/>
+          <w:p>
+            <w:pPr>
+              <w:pStyle w:val="Compact"/>
+            </w:pPr>
+            <w:r>
+              <w:t xml:space="preserve">98.24%</w:t>
+            </w:r>
+          </w:p>
+        </w:tc>
+      </w:tr>
+      <w:tr>
+        <w:tc>
+          <w:tcPr/>
+          <w:p>
+            <w:pPr>
+              <w:pStyle w:val="Compact"/>
+            </w:pPr>
+            <w:r>
+              <w:t xml:space="preserve">Precision</w:t>
+            </w:r>
+          </w:p>
+        </w:tc>
+        <w:tc>
+          <w:tcPr/>
+          <w:p>
+            <w:pPr>
+              <w:pStyle w:val="Compact"/>
+            </w:pPr>
+            <w:r>
+              <w:t xml:space="preserve">98.85%</w:t>
+            </w:r>
+          </w:p>
+        </w:tc>
+      </w:tr>
+      <w:tr>
+        <w:tc>
+          <w:tcPr/>
+          <w:p>
+            <w:pPr>
+              <w:pStyle w:val="Compact"/>
+            </w:pPr>
+            <w:r>
+              <w:t xml:space="preserve">Recall</w:t>
+            </w:r>
+          </w:p>
+        </w:tc>
+        <w:tc>
+          <w:tcPr/>
+          <w:p>
+            <w:pPr>
+              <w:pStyle w:val="Compact"/>
+            </w:pPr>
+            <w:r>
+              <w:t xml:space="preserve">99.19%</w:t>
+            </w:r>
+          </w:p>
+        </w:tc>
+      </w:tr>
+      <w:tr>
+        <w:tc>
+          <w:tcPr/>
+          <w:p>
+            <w:pPr>
+              <w:pStyle w:val="Compact"/>
+            </w:pPr>
+            <w:r>
+              <w:rPr>
+                <w:b/>
+                <w:bCs/>
+              </w:rPr>
+              <w:t xml:space="preserve">F1-Score</w:t>
+            </w:r>
+          </w:p>
+        </w:tc>
+        <w:tc>
+          <w:tcPr/>
+          <w:p>
+            <w:pPr>
+              <w:pStyle w:val="Compact"/>
+            </w:pPr>
+            <w:r>
+              <w:rPr>
+                <w:b/>
+                <w:bCs/>
+              </w:rPr>
+              <w:t xml:space="preserve">99.02%</w:t>
+            </w:r>
+          </w:p>
+        </w:tc>
+      </w:tr>
+    </w:tbl>
+    <w:p>
+      <w:pPr>
+        <w:pStyle w:val="BodyText"/>
+      </w:pPr>
+      <w:r>
+        <w:t xml:space="preserve">Le modèle dépasse le Random Forest (98.64% F1) malgré une seule époque d’entraînement, confirmant l’apport des transformers pour la compréhension contextuelle du langage. L’entraînement complet sur 3 époques (recommandé) nécessite ~18 min.</w:t>
+      </w:r>
+    </w:p>
+    <w:p>
+      <w:pPr>
+        <w:pStyle w:val="SourceCode"/>
+      </w:pPr>
+      <w:r>
+        <w:rPr>
+          <w:rStyle w:val="VerbatimChar"/>
+        </w:rPr>
+        <w:t xml:space="preserve">uv add torch</w:t>
+      </w:r>
+      <w:r>
+        <w:br/>
+      </w:r>
+      <w:r>
+        <w:rPr>
+          <w:rStyle w:val="VerbatimChar"/>
+        </w:rPr>
+        <w:t xml:space="preserve">uv run python src/models/train_bert.py</w:t>
+      </w:r>
+    </w:p>
+    <w:bookmarkEnd w:id="55"/>
+    <w:bookmarkStart w:id="56" w:name="b.5-mlflow-tracking-des-expérimentations"/>
+    <w:p>
+      <w:pPr>
+        <w:pStyle w:val="Heading3"/>
+      </w:pPr>
+      <w:r>
+        <w:t xml:space="preserve">B.5 — MLflow (Tracking des expérimentations)</w:t>
+      </w:r>
+    </w:p>
+    <w:p>
+      <w:pPr>
+        <w:pStyle w:val="FirstParagraph"/>
+      </w:pPr>
+      <w:r>
+        <w:t xml:space="preserve">Le script</w:t>
+      </w:r>
+      <w:r>
+        <w:t xml:space="preserve"> </w:t>
+      </w:r>
+      <w:r>
+        <w:rPr>
+          <w:rStyle w:val="VerbatimChar"/>
+        </w:rPr>
+        <w:t xml:space="preserve">src/models/train_with_mlflow.py</w:t>
+      </w:r>
+      <w:r>
+        <w:t xml:space="preserve"> </w:t>
+      </w:r>
+      <w:r>
+        <w:t xml:space="preserve">enregistre automatiquement pour chaque modèle :</w:t>
+      </w:r>
+      <w:r>
+        <w:t xml:space="preserve"> </w:t>
+      </w:r>
+      <w:r>
+        <w:t xml:space="preserve">- Les</w:t>
+      </w:r>
+      <w:r>
+        <w:t xml:space="preserve"> </w:t>
+      </w:r>
+      <w:r>
+        <w:rPr>
+          <w:b/>
+          <w:bCs/>
+        </w:rPr>
+        <w:t xml:space="preserve">hyperparamètres</w:t>
+      </w:r>
+      <w:r>
+        <w:t xml:space="preserve"> </w:t>
+      </w:r>
+      <w:r>
+        <w:t xml:space="preserve">(via</w:t>
+      </w:r>
+      <w:r>
+        <w:t xml:space="preserve"> </w:t>
+      </w:r>
+      <w:r>
+        <w:rPr>
+          <w:rStyle w:val="VerbatimChar"/>
+        </w:rPr>
+        <w:t xml:space="preserve">get_params()</w:t>
+      </w:r>
+      <w:r>
+        <w:t xml:space="preserve">)</w:t>
+      </w:r>
+      <w:r>
+        <w:t xml:space="preserve"> </w:t>
+      </w:r>
+      <w:r>
+        <w:t xml:space="preserve">- Les</w:t>
+      </w:r>
+      <w:r>
+        <w:t xml:space="preserve"> </w:t>
+      </w:r>
+      <w:r>
+        <w:rPr>
+          <w:b/>
+          <w:bCs/>
+        </w:rPr>
+        <w:t xml:space="preserve">métriques</w:t>
+      </w:r>
+      <w:r>
+        <w:t xml:space="preserve"> </w:t>
+      </w:r>
+      <w:r>
+        <w:t xml:space="preserve">(accuracy, precision, recall, F1)</w:t>
+      </w:r>
+      <w:r>
+        <w:t xml:space="preserve"> </w:t>
+      </w:r>
+      <w:r>
+        <w:t xml:space="preserve">- Les</w:t>
+      </w:r>
+      <w:r>
+        <w:t xml:space="preserve"> </w:t>
+      </w:r>
+      <w:r>
+        <w:rPr>
+          <w:b/>
+          <w:bCs/>
+        </w:rPr>
+        <w:t xml:space="preserve">artefacts</w:t>
+      </w:r>
+      <w:r>
+        <w:t xml:space="preserve"> </w:t>
+      </w:r>
+      <w:r>
+        <w:t xml:space="preserve">(modèles sérialisés)</w:t>
+      </w:r>
+    </w:p>
+    <w:p>
+      <w:pPr>
+        <w:pStyle w:val="SourceCode"/>
+      </w:pPr>
+      <w:r>
+        <w:rPr>
+          <w:rStyle w:val="VerbatimChar"/>
+        </w:rPr>
+        <w:t xml:space="preserve">rm -rf mlruns                    # Départ propre</w:t>
+      </w:r>
+      <w:r>
+        <w:br/>
+      </w:r>
+      <w:r>
+        <w:rPr>
+          <w:rStyle w:val="VerbatimChar"/>
+        </w:rPr>
+        <w:t xml:space="preserve">uv run python src/models/train_with_mlflow.py</w:t>
+      </w:r>
+      <w:r>
+        <w:br/>
+      </w:r>
+      <w:r>
+        <w:rPr>
+          <w:rStyle w:val="VerbatimChar"/>
+        </w:rPr>
+        <w:t xml:space="preserve">uv run mlflow ui                 # http://localhost:5000</w:t>
+      </w:r>
+    </w:p>
+    <w:p>
+      <w:pPr>
+        <w:pStyle w:val="FirstParagraph"/>
+      </w:pPr>
+      <w:r>
+        <w:t xml:space="preserve">L’interface MLflow permet de comparer visuellement les performances des 3 modèles et d’exporter les résultats.</w:t>
+      </w:r>
+    </w:p>
+    <w:bookmarkEnd w:id="56"/>
+    <w:bookmarkStart w:id="57" w:name="b.3-cicd-github-actions"/>
+    <w:p>
+      <w:pPr>
+        <w:pStyle w:val="Heading3"/>
+      </w:pPr>
+      <w:r>
+        <w:t xml:space="preserve">B.3 — CI/CD (GitHub Actions)</w:t>
+      </w:r>
+    </w:p>
+    <w:p>
+      <w:pPr>
+        <w:pStyle w:val="FirstParagraph"/>
+      </w:pPr>
+      <w:r>
+        <w:t xml:space="preserve">Le workflow</w:t>
+      </w:r>
+      <w:r>
+        <w:t xml:space="preserve"> </w:t>
+      </w:r>
+      <w:r>
+        <w:rPr>
+          <w:rStyle w:val="VerbatimChar"/>
+        </w:rPr>
+        <w:t xml:space="preserve">.github/workflows/ci.yml</w:t>
+      </w:r>
+      <w:r>
+        <w:t xml:space="preserve"> </w:t>
+      </w:r>
+      <w:r>
+        <w:t xml:space="preserve">s’exécute automatiquement à chaque push sur</w:t>
+      </w:r>
+      <w:r>
+        <w:t xml:space="preserve"> </w:t>
+      </w:r>
+      <w:r>
+        <w:rPr>
+          <w:rStyle w:val="VerbatimChar"/>
+        </w:rPr>
+        <w:t xml:space="preserve">main</w:t>
+      </w:r>
+      <w:r>
+        <w:t xml:space="preserve"> </w:t>
+      </w:r>
+      <w:r>
+        <w:t xml:space="preserve">et reproduit l’intégralité du pipeline DVC, garantissant que les modifications ne cassent pas la pipeline.</w:t>
+      </w:r>
+    </w:p>
+    <w:bookmarkEnd w:id="57"/>
+    <w:bookmarkStart w:id="59" w:name="b.2-hugging-face-spaces"/>
+    <w:p>
+      <w:pPr>
+        <w:pStyle w:val="Heading3"/>
+      </w:pPr>
+      <w:r>
+        <w:t xml:space="preserve">B.2 — Hugging Face Spaces</w:t>
+      </w:r>
+    </w:p>
+    <w:p>
+      <w:pPr>
+        <w:pStyle w:val="FirstParagraph"/>
+      </w:pPr>
+      <w:r>
+        <w:t xml:space="preserve">Les métadonnées YAML intégrées au</w:t>
+      </w:r>
+      <w:r>
+        <w:t xml:space="preserve"> </w:t>
+      </w:r>
+      <w:r>
+        <w:rPr>
+          <w:rStyle w:val="VerbatimChar"/>
+        </w:rPr>
+        <w:t xml:space="preserve">README.md</w:t>
+      </w:r>
+      <w:r>
+        <w:t xml:space="preserve"> </w:t>
+      </w:r>
+      <w:r>
+        <w:t xml:space="preserve">permettent un déploiement cloud en un clic :</w:t>
+      </w:r>
+      <w:r>
+        <w:t xml:space="preserve"> </w:t>
+      </w:r>
+      <w:r>
+        <w:t xml:space="preserve">1. Aller sur</w:t>
+      </w:r>
+      <w:r>
+        <w:t xml:space="preserve"> </w:t>
+      </w:r>
+      <w:hyperlink r:id="rId58">
+        <w:r>
+          <w:rPr>
+            <w:rStyle w:val="Hyperlink"/>
+          </w:rPr>
+          <w:t xml:space="preserve">huggingface.co/new-space</w:t>
+        </w:r>
+      </w:hyperlink>
+      <w:r>
+        <w:t xml:space="preserve"> </w:t>
+      </w:r>
+      <w:r>
+        <w:t xml:space="preserve">2. Sélectionner</w:t>
+      </w:r>
+      <w:r>
+        <w:t xml:space="preserve"> </w:t>
+      </w:r>
+      <w:r>
+        <w:rPr>
+          <w:b/>
+          <w:bCs/>
+        </w:rPr>
+        <w:t xml:space="preserve">Streamlit</w:t>
+      </w:r>
+      <w:r>
+        <w:t xml:space="preserve"> </w:t>
+      </w:r>
+      <w:r>
+        <w:t xml:space="preserve">comme SDK</w:t>
+      </w:r>
+      <w:r>
+        <w:t xml:space="preserve"> </w:t>
+      </w:r>
+      <w:r>
+        <w:t xml:space="preserve">3. Lier ce dépôt GitHub</w:t>
+      </w:r>
+      <w:r>
+        <w:t xml:space="preserve"> </w:t>
+      </w:r>
+      <w:r>
+        <w:t xml:space="preserve">4. Le Space détecte automatiquement la configuration et déploie l’application</w:t>
+      </w:r>
+    </w:p>
+    <w:bookmarkEnd w:id="59"/>
+    <w:bookmarkEnd w:id="60"/>
+    <w:bookmarkStart w:id="61" w:name="perspectives-damélioration"/>
+    <w:p>
+      <w:pPr>
+        <w:pStyle w:val="Heading2"/>
+      </w:pPr>
+      <w:r>
+        <w:t xml:space="preserve">Perspectives d’amélioration</w:t>
       </w:r>
     </w:p>
     <w:p>
@@ -2277,32 +3076,7 @@
         </w:numPr>
       </w:pPr>
       <w:r>
-        <w:rPr>
-          <w:b/>
-          <w:bCs/>
-        </w:rPr>
-        <w:t xml:space="preserve">Modele BERT</w:t>
-      </w:r>
-      <w:r>
-        <w:t xml:space="preserve"> </w:t>
-      </w:r>
-      <w:r>
-        <w:t xml:space="preserve">: script d’entraînement</w:t>
-      </w:r>
-      <w:r>
-        <w:t xml:space="preserve"> </w:t>
-      </w:r>
-      <w:r>
-        <w:rPr>
-          <w:rStyle w:val="VerbatimChar"/>
-        </w:rPr>
-        <w:t xml:space="preserve">src/models/train_bert.py</w:t>
-      </w:r>
-      <w:r>
-        <w:t xml:space="preserve"> </w:t>
-      </w:r>
-      <w:r>
-        <w:t xml:space="preserve">utilisant DistilBERT</w:t>
+        <w:t xml:space="preserve">Ajout d’un dataset spécialisé hate speech pour améliorer la détection des contenus sensibles</w:t>
       </w:r>
     </w:p>
     <w:p>
@@ -2314,26 +3088,7 @@
         </w:numPr>
       </w:pPr>
       <w:r>
-        <w:rPr>
-          <w:b/>
-          <w:bCs/>
-        </w:rPr>
-        <w:t xml:space="preserve">MLflow</w:t>
-      </w:r>
-      <w:r>
-        <w:t xml:space="preserve"> </w:t>
-      </w:r>
-      <w:r>
-        <w:t xml:space="preserve">: tracking des expérimentations avec</w:t>
-      </w:r>
-      <w:r>
-        <w:t xml:space="preserve"> </w:t>
-      </w:r>
-      <w:r>
-        <w:rPr>
-          <w:rStyle w:val="VerbatimChar"/>
-        </w:rPr>
-        <w:t xml:space="preserve">src/models/train_with_mlflow.py</w:t>
+        <w:t xml:space="preserve">Export CSV de l’historique des analyses</w:t>
       </w:r>
     </w:p>
     <w:p>
@@ -2345,64 +3100,36 @@
         </w:numPr>
       </w:pPr>
       <w:r>
-        <w:rPr>
-          <w:b/>
-          <w:bCs/>
-        </w:rPr>
-        <w:t xml:space="preserve">CI/CD</w:t>
-      </w:r>
-      <w:r>
-        <w:t xml:space="preserve"> </w:t>
-      </w:r>
-      <w:r>
-        <w:t xml:space="preserve">: workflow GitHub Actions pour exécuter</w:t>
-      </w:r>
-      <w:r>
-        <w:t xml:space="preserve"> </w:t>
-      </w:r>
-      <w:r>
-        <w:rPr>
-          <w:rStyle w:val="VerbatimChar"/>
-        </w:rPr>
-        <w:t xml:space="preserve">dvc repro</w:t>
-      </w:r>
-      <w:r>
-        <w:t xml:space="preserve"> </w:t>
-      </w:r>
-      <w:r>
-        <w:t xml:space="preserve">automatiquement</w:t>
-      </w:r>
-    </w:p>
-    <w:p>
-      <w:pPr>
-        <w:pStyle w:val="Compact"/>
-        <w:numPr>
-          <w:ilvl w:val="0"/>
-          <w:numId w:val="1008"/>
-        </w:numPr>
-      </w:pPr>
-      <w:r>
-        <w:rPr>
-          <w:b/>
-          <w:bCs/>
-        </w:rPr>
-        <w:t xml:space="preserve">Hugging Face Spaces</w:t>
-      </w:r>
-      <w:r>
-        <w:t xml:space="preserve"> </w:t>
-      </w:r>
-      <w:r>
-        <w:t xml:space="preserve">: configuration YAML intégrée au README pour un déploiement cloud en un clic</w:t>
-      </w:r>
-    </w:p>
-    <w:bookmarkEnd w:id="54"/>
-    <w:bookmarkStart w:id="55" w:name="perspectives-damélioration"/>
-    <w:p>
-      <w:pPr>
-        <w:pStyle w:val="Heading2"/>
-      </w:pPr>
-      <w:r>
-        <w:t xml:space="preserve">Perspectives d’amélioration</w:t>
+        <w:t xml:space="preserve">Mode batch pour analyser un fichier CSV de tweets</w:t>
+      </w:r>
+    </w:p>
+    <w:bookmarkEnd w:id="61"/>
+    <w:bookmarkEnd w:id="62"/>
+    <w:bookmarkStart w:id="63" w:name="conclusion"/>
+    <w:p>
+      <w:pPr>
+        <w:pStyle w:val="Heading1"/>
+      </w:pPr>
+      <w:r>
+        <w:t xml:space="preserve">Conclusion</w:t>
+      </w:r>
+    </w:p>
+    <w:p>
+      <w:pPr>
+        <w:pStyle w:val="FirstParagraph"/>
+      </w:pPr>
+      <w:r>
+        <w:t xml:space="preserve">Ce projet a permis de mettre en œuvre un pipeline complet de Machine Learning pour la détection de tweets suspects. Les meilleurs résultats (F1 &gt; 98%) montrent la faisabilité de la tâche avec des approches classiques. L’utilisation de DVC assure la reproductibilité du pipeline, et le déploiement via Streamlit/FastAPI permet une utilisation en conditions réelles.</w:t>
+      </w:r>
+    </w:p>
+    <w:bookmarkEnd w:id="63"/>
+    <w:bookmarkStart w:id="64" w:name="références"/>
+    <w:p>
+      <w:pPr>
+        <w:pStyle w:val="Heading1"/>
+      </w:pPr>
+      <w:r>
+        <w:t xml:space="preserve">Références</w:t>
       </w:r>
     </w:p>
     <w:p>
@@ -2414,7 +3141,7 @@
         </w:numPr>
       </w:pPr>
       <w:r>
-        <w:t xml:space="preserve">Ajout d’un dataset spécialisé hate speech pour améliorer la détection des contenus sensibles</w:t>
+        <w:t xml:space="preserve">Sujet : Détection_de_Tweet_Suspect_2026.md</w:t>
       </w:r>
     </w:p>
     <w:p>
@@ -2426,7 +3153,7 @@
         </w:numPr>
       </w:pPr>
       <w:r>
-        <w:t xml:space="preserve">Export CSV de l’historique des analyses</w:t>
+        <w:t xml:space="preserve">Code source : https://github.com/Heathclifffs/tweet-suspect-detection</w:t>
       </w:r>
     </w:p>
     <w:p>
@@ -2438,75 +3165,10 @@
         </w:numPr>
       </w:pPr>
       <w:r>
-        <w:t xml:space="preserve">Mode batch pour analyser un fichier CSV de tweets</w:t>
-      </w:r>
-    </w:p>
-    <w:bookmarkEnd w:id="55"/>
-    <w:bookmarkEnd w:id="56"/>
-    <w:bookmarkStart w:id="57" w:name="conclusion"/>
-    <w:p>
-      <w:pPr>
-        <w:pStyle w:val="Heading1"/>
-      </w:pPr>
-      <w:r>
-        <w:t xml:space="preserve">Conclusion</w:t>
-      </w:r>
-    </w:p>
-    <w:p>
-      <w:pPr>
-        <w:pStyle w:val="FirstParagraph"/>
-      </w:pPr>
-      <w:r>
-        <w:t xml:space="preserve">Ce projet a permis de mettre en œuvre un pipeline complet de Machine Learning pour la détection de tweets suspects. Les meilleurs résultats (F1 &gt; 98%) montrent la faisabilité de la tâche avec des approches classiques. L’utilisation de DVC assure la reproductibilité du pipeline, et le déploiement via Streamlit/FastAPI permet une utilisation en conditions réelles.</w:t>
-      </w:r>
-    </w:p>
-    <w:bookmarkEnd w:id="57"/>
-    <w:bookmarkStart w:id="58" w:name="références"/>
-    <w:p>
-      <w:pPr>
-        <w:pStyle w:val="Heading1"/>
-      </w:pPr>
-      <w:r>
-        <w:t xml:space="preserve">Références</w:t>
-      </w:r>
-    </w:p>
-    <w:p>
-      <w:pPr>
-        <w:pStyle w:val="Compact"/>
-        <w:numPr>
-          <w:ilvl w:val="0"/>
-          <w:numId w:val="1010"/>
-        </w:numPr>
-      </w:pPr>
-      <w:r>
-        <w:t xml:space="preserve">Sujet : Détection_de_Tweet_Suspect_2026.md</w:t>
-      </w:r>
-    </w:p>
-    <w:p>
-      <w:pPr>
-        <w:pStyle w:val="Compact"/>
-        <w:numPr>
-          <w:ilvl w:val="0"/>
-          <w:numId w:val="1010"/>
-        </w:numPr>
-      </w:pPr>
-      <w:r>
-        <w:t xml:space="preserve">Code source : https://github.com/Heathclifffs/tweet-suspect-detection</w:t>
-      </w:r>
-    </w:p>
-    <w:p>
-      <w:pPr>
-        <w:pStyle w:val="Compact"/>
-        <w:numPr>
-          <w:ilvl w:val="0"/>
-          <w:numId w:val="1010"/>
-        </w:numPr>
-      </w:pPr>
-      <w:r>
         <w:t xml:space="preserve">Dataset : Google Drive (ID: 1US0luOWPOeVPpUQnpyxr41zrBmeg4Gjk)</w:t>
       </w:r>
     </w:p>
-    <w:bookmarkEnd w:id="58"/>
+    <w:bookmarkEnd w:id="64"/>
     <w:sectPr>
       <w:footnotePr>
         <w:numRestart w:val="eachSect"/>
@@ -2887,9 +3549,6 @@
     <w:abstractNumId w:val="991"/>
   </w:num>
   <w:num w:numId="1009">
-    <w:abstractNumId w:val="991"/>
-  </w:num>
-  <w:num w:numId="1010">
     <w:abstractNumId w:val="991"/>
   </w:num>
 </w:numbering>

</xml_diff>

<commit_message>
feat: integre BERT + MLflow dans Streamlit (4 onglets), met à jour rapport et README
</commit_message>
<xml_diff>
--- a/reports/rapport.docx
+++ b/reports/rapport.docx
@@ -2042,7 +2042,7 @@
       </w:r>
     </w:p>
     <w:bookmarkEnd w:id="34"/>
-    <w:bookmarkStart w:id="52" w:name="déploiement"/>
+    <w:bookmarkStart w:id="53" w:name="déploiement"/>
     <w:p>
       <w:pPr>
         <w:pStyle w:val="Heading1"/>
@@ -2072,7 +2072,23 @@
         <w:t xml:space="preserve"> </w:t>
       </w:r>
       <w:r>
-        <w:t xml:space="preserve">est déployée localement et propose 3 onglets avec une interface interactive :</w:t>
+        <w:t xml:space="preserve">est déployée localement et propose</w:t>
+      </w:r>
+      <w:r>
+        <w:t xml:space="preserve"> </w:t>
+      </w:r>
+      <w:r>
+        <w:rPr>
+          <w:b/>
+          <w:bCs/>
+        </w:rPr>
+        <w:t xml:space="preserve">4 onglets</w:t>
+      </w:r>
+      <w:r>
+        <w:t xml:space="preserve"> </w:t>
+      </w:r>
+      <w:r>
+        <w:t xml:space="preserve">avec une interface interactive :</w:t>
       </w:r>
     </w:p>
     <w:bookmarkStart w:id="41" w:name="prediction"/>
@@ -2081,7 +2097,7 @@
         <w:pStyle w:val="Heading3"/>
       </w:pPr>
       <w:r>
-        <w:t xml:space="preserve">Prediction</w:t>
+        <w:t xml:space="preserve">1. Prediction</w:t>
       </w:r>
     </w:p>
     <w:p>
@@ -2089,7 +2105,23 @@
         <w:pStyle w:val="FirstParagraph"/>
       </w:pPr>
       <w:r>
-        <w:t xml:space="preserve">Saisie d’un tweet et classification par les 3 modèles (Logistic Regression, Naive Bayes, Random Forest) avec score de confiance affiché sous forme de barre de progression. L’application affiche également un avertissement sur les limites du modèle (non-détection du harcèlement et du discours haineux). Des exemples prédéfinis permettent de tester rapidement l’application.</w:t>
+        <w:t xml:space="preserve">Saisie d’un tweet et classification par les</w:t>
+      </w:r>
+      <w:r>
+        <w:t xml:space="preserve"> </w:t>
+      </w:r>
+      <w:r>
+        <w:rPr>
+          <w:b/>
+          <w:bCs/>
+        </w:rPr>
+        <w:t xml:space="preserve">4 modèles</w:t>
+      </w:r>
+      <w:r>
+        <w:t xml:space="preserve"> </w:t>
+      </w:r>
+      <w:r>
+        <w:t xml:space="preserve">(Logistic Regression, Naive Bayes, Random Forest, BERT DistilBERT) avec score de confiance affiché sous forme de barre de progression. BERT est chargé automatiquement s’il a été préalablement entraîné. L’application affiche également un avertissement sur les limites du modèle (non-détection du harcèlement et du discours haineux). Des exemples prédéfinis permettent de tester rapidement l’application.</w:t>
       </w:r>
     </w:p>
     <w:p>
@@ -2191,7 +2223,7 @@
         <w:pStyle w:val="Heading3"/>
       </w:pPr>
       <w:r>
-        <w:t xml:space="preserve">Tableau de bord dynamique</w:t>
+        <w:t xml:space="preserve">2. Tableau de bord dynamique</w:t>
       </w:r>
     </w:p>
     <w:p>
@@ -2221,19 +2253,35 @@
         <w:t xml:space="preserve"> </w:t>
       </w:r>
       <w:r>
-        <w:t xml:space="preserve">- Sélectionner un modèle parmi les 3 via un menu déroulant</w:t>
-      </w:r>
-      <w:r>
-        <w:t xml:space="preserve"> </w:t>
-      </w:r>
-      <w:r>
-        <w:t xml:space="preserve">- Visualiser la matrice de confusion interactive (couleurs, survol)</w:t>
-      </w:r>
-      <w:r>
-        <w:t xml:space="preserve"> </w:t>
-      </w:r>
-      <w:r>
-        <w:t xml:space="preserve">- Afficher les courbes ROC des 3 modèles superposées avec l’AUC</w:t>
+        <w:t xml:space="preserve">- Sélectionner un modèle parmi</w:t>
+      </w:r>
+      <w:r>
+        <w:t xml:space="preserve"> </w:t>
+      </w:r>
+      <w:r>
+        <w:rPr>
+          <w:b/>
+          <w:bCs/>
+        </w:rPr>
+        <w:t xml:space="preserve">les 4</w:t>
+      </w:r>
+      <w:r>
+        <w:t xml:space="preserve"> </w:t>
+      </w:r>
+      <w:r>
+        <w:t xml:space="preserve">(dont BERT) via un menu déroulant</w:t>
+      </w:r>
+      <w:r>
+        <w:t xml:space="preserve"> </w:t>
+      </w:r>
+      <w:r>
+        <w:t xml:space="preserve">- Visualiser la matrice de confusion interactive (couleurs, survol) — BERT inclus</w:t>
+      </w:r>
+      <w:r>
+        <w:t xml:space="preserve"> </w:t>
+      </w:r>
+      <w:r>
+        <w:t xml:space="preserve">- Afficher les courbes ROC des 4 modèles superposées avec l’AUC</w:t>
       </w:r>
       <w:r>
         <w:t xml:space="preserve"> </w:t>
@@ -2304,13 +2352,13 @@
       </w:r>
     </w:p>
     <w:bookmarkEnd w:id="45"/>
-    <w:bookmarkStart w:id="49" w:name="historique"/>
+    <w:bookmarkStart w:id="46" w:name="mlflow"/>
     <w:p>
       <w:pPr>
         <w:pStyle w:val="Heading3"/>
       </w:pPr>
       <w:r>
-        <w:t xml:space="preserve">Historique</w:t>
+        <w:t xml:space="preserve">3. MLflow</w:t>
       </w:r>
     </w:p>
     <w:p>
@@ -2318,7 +2366,74 @@
         <w:pStyle w:val="FirstParagraph"/>
       </w:pPr>
       <w:r>
-        <w:t xml:space="preserve">Toutes les analyses effectuées pendant la session sont conservées avec horodatage, tweet original, tweet nettoyé et résultats détaillés par modèle. L’historique peut être vidé manuellement.</w:t>
+        <w:t xml:space="preserve">Onglet dédié au tracking des expérimentations</w:t>
+      </w:r>
+      <w:r>
+        <w:t xml:space="preserve"> </w:t>
+      </w:r>
+      <w:r>
+        <w:rPr>
+          <w:b/>
+          <w:bCs/>
+        </w:rPr>
+        <w:t xml:space="preserve">MLflow</w:t>
+      </w:r>
+      <w:r>
+        <w:t xml:space="preserve"> </w:t>
+      </w:r>
+      <w:r>
+        <w:t xml:space="preserve">:</w:t>
+      </w:r>
+      <w:r>
+        <w:t xml:space="preserve"> </w:t>
+      </w:r>
+      <w:r>
+        <w:t xml:space="preserve">- Détection automatique des runs MLflow dans</w:t>
+      </w:r>
+      <w:r>
+        <w:t xml:space="preserve"> </w:t>
+      </w:r>
+      <w:r>
+        <w:rPr>
+          <w:rStyle w:val="VerbatimChar"/>
+        </w:rPr>
+        <w:t xml:space="preserve">mlruns/</w:t>
+      </w:r>
+      <w:r>
+        <w:t xml:space="preserve"> </w:t>
+      </w:r>
+      <w:r>
+        <w:t xml:space="preserve">- Affichage des dernières runs avec leurs métriques (accuracy, F1)</w:t>
+      </w:r>
+      <w:r>
+        <w:t xml:space="preserve"> </w:t>
+      </w:r>
+      <w:r>
+        <w:t xml:space="preserve">- Bouton pour lancer l’interface web MLflow</w:t>
+      </w:r>
+      <w:r>
+        <w:t xml:space="preserve"> </w:t>
+      </w:r>
+      <w:r>
+        <w:t xml:space="preserve">- Rappel des commandes essentielles</w:t>
+      </w:r>
+    </w:p>
+    <w:bookmarkEnd w:id="46"/>
+    <w:bookmarkStart w:id="50" w:name="historique"/>
+    <w:p>
+      <w:pPr>
+        <w:pStyle w:val="Heading3"/>
+      </w:pPr>
+      <w:r>
+        <w:t xml:space="preserve">4. Historique</w:t>
+      </w:r>
+    </w:p>
+    <w:p>
+      <w:pPr>
+        <w:pStyle w:val="FirstParagraph"/>
+      </w:pPr>
+      <w:r>
+        <w:t xml:space="preserve">Toutes les analyses effectuées pendant la session sont conservées avec horodatage, tweet original, tweet nettoyé et résultats détaillés par modèle (incluant BERT). L’historique peut être vidé manuellement.</w:t>
       </w:r>
     </w:p>
     <w:p>
@@ -2330,18 +2445,18 @@
           <wp:inline>
             <wp:extent cx="5334000" cy="3750468"/>
             <wp:effectExtent b="0" l="0" r="0" t="0"/>
-            <wp:docPr descr="Historique des analyses" title="" id="47" name="Picture"/>
+            <wp:docPr descr="Historique des analyses" title="" id="48" name="Picture"/>
             <a:graphic>
               <a:graphicData uri="http://schemas.openxmlformats.org/drawingml/2006/picture">
                 <pic:pic>
                   <pic:nvPicPr>
-                    <pic:cNvPr descr="figures/streamlit_history.png" id="48" name="Picture"/>
+                    <pic:cNvPr descr="figures/streamlit_history.png" id="49" name="Picture"/>
                     <pic:cNvPicPr>
                       <a:picLocks noChangeArrowheads="1" noChangeAspect="1"/>
                     </pic:cNvPicPr>
                   </pic:nvPicPr>
                   <pic:blipFill>
-                    <a:blip r:embed="rId46"/>
+                    <a:blip r:embed="rId47"/>
                     <a:stretch>
                       <a:fillRect/>
                     </a:stretch>
@@ -2376,8 +2491,8 @@
         <w:t xml:space="preserve">Historique des analyses</w:t>
       </w:r>
     </w:p>
-    <w:bookmarkEnd w:id="49"/>
-    <w:bookmarkStart w:id="50" w:name="commande-de-lancement"/>
+    <w:bookmarkEnd w:id="50"/>
+    <w:bookmarkStart w:id="51" w:name="commande-de-lancement"/>
     <w:p>
       <w:pPr>
         <w:pStyle w:val="Heading3"/>
@@ -2397,8 +2512,8 @@
         <w:t xml:space="preserve">uv run streamlit run src/deploy/streamlit_app.py</w:t>
       </w:r>
     </w:p>
-    <w:bookmarkEnd w:id="50"/>
-    <w:bookmarkStart w:id="51" w:name="api-fastapi"/>
+    <w:bookmarkEnd w:id="51"/>
+    <w:bookmarkStart w:id="52" w:name="api-fastapi"/>
     <w:p>
       <w:pPr>
         <w:pStyle w:val="Heading3"/>
@@ -2426,9 +2541,9 @@
         <w:t xml:space="preserve">uv run uvicorn src.deploy.api:app --reload</w:t>
       </w:r>
     </w:p>
-    <w:bookmarkEnd w:id="51"/>
     <w:bookmarkEnd w:id="52"/>
-    <w:bookmarkStart w:id="62" w:name="discussion"/>
+    <w:bookmarkEnd w:id="53"/>
+    <w:bookmarkStart w:id="63" w:name="discussion"/>
     <w:p>
       <w:pPr>
         <w:pStyle w:val="Heading1"/>
@@ -2437,7 +2552,7 @@
         <w:t xml:space="preserve">Discussion</w:t>
       </w:r>
     </w:p>
-    <w:bookmarkStart w:id="53" w:name="limites"/>
+    <w:bookmarkStart w:id="54" w:name="limites"/>
     <w:p>
       <w:pPr>
         <w:pStyle w:val="Heading2"/>
@@ -2494,8 +2609,8 @@
         <w:t xml:space="preserve">Pas de détection multilingue (stop words english uniquement)</w:t>
       </w:r>
     </w:p>
-    <w:bookmarkEnd w:id="53"/>
-    <w:bookmarkStart w:id="54" w:name="difficultés-rencontrées"/>
+    <w:bookmarkEnd w:id="54"/>
+    <w:bookmarkStart w:id="55" w:name="difficultés-rencontrées"/>
     <w:p>
       <w:pPr>
         <w:pStyle w:val="Heading2"/>
@@ -2540,8 +2655,8 @@
         <w:t xml:space="preserve">Mise en place du pipeline DVC avec téléchargement depuis Google Drive</w:t>
       </w:r>
     </w:p>
-    <w:bookmarkEnd w:id="54"/>
-    <w:bookmarkStart w:id="60" w:name="travail-realise-bonus"/>
+    <w:bookmarkEnd w:id="55"/>
+    <w:bookmarkStart w:id="61" w:name="travail-realise-bonus"/>
     <w:p>
       <w:pPr>
         <w:pStyle w:val="Heading2"/>
@@ -2558,7 +2673,7 @@
         <w:t xml:space="preserve">En complément du cahier des charges initial, 4 fonctionnalités bonus ont été implémentées avec succès :</w:t>
       </w:r>
     </w:p>
-    <w:bookmarkStart w:id="55" w:name="b.1-distilbert-transformers"/>
+    <w:bookmarkStart w:id="56" w:name="b.1-distilbert-transformers"/>
     <w:p>
       <w:pPr>
         <w:pStyle w:val="Heading3"/>
@@ -2758,89 +2873,82 @@
     </w:p>
     <w:p>
       <w:pPr>
-        <w:pStyle w:val="SourceCode"/>
-      </w:pPr>
-      <w:r>
-        <w:rPr>
-          <w:rStyle w:val="VerbatimChar"/>
-        </w:rPr>
-        <w:t xml:space="preserve">uv add torch</w:t>
-      </w:r>
-      <w:r>
-        <w:br/>
-      </w:r>
-      <w:r>
-        <w:rPr>
-          <w:rStyle w:val="VerbatimChar"/>
-        </w:rPr>
-        <w:t xml:space="preserve">uv run python src/models/train_bert.py</w:t>
-      </w:r>
-    </w:p>
-    <w:bookmarkEnd w:id="55"/>
-    <w:bookmarkStart w:id="56" w:name="b.5-mlflow-tracking-des-expérimentations"/>
-    <w:p>
-      <w:pPr>
-        <w:pStyle w:val="Heading3"/>
-      </w:pPr>
-      <w:r>
-        <w:t xml:space="preserve">B.5 — MLflow (Tracking des expérimentations)</w:t>
-      </w:r>
-    </w:p>
-    <w:p>
-      <w:pPr>
-        <w:pStyle w:val="FirstParagraph"/>
-      </w:pPr>
-      <w:r>
-        <w:t xml:space="preserve">Le script</w:t>
-      </w:r>
-      <w:r>
-        <w:t xml:space="preserve"> </w:t>
-      </w:r>
-      <w:r>
-        <w:rPr>
-          <w:rStyle w:val="VerbatimChar"/>
-        </w:rPr>
-        <w:t xml:space="preserve">src/models/train_with_mlflow.py</w:t>
-      </w:r>
-      <w:r>
-        <w:t xml:space="preserve"> </w:t>
-      </w:r>
-      <w:r>
-        <w:t xml:space="preserve">enregistre automatiquement pour chaque modèle :</w:t>
-      </w:r>
-      <w:r>
-        <w:t xml:space="preserve"> </w:t>
-      </w:r>
-      <w:r>
-        <w:t xml:space="preserve">- Les</w:t>
-      </w:r>
-      <w:r>
-        <w:t xml:space="preserve"> </w:t>
-      </w:r>
+        <w:pStyle w:val="BodyText"/>
+      </w:pPr>
       <w:r>
         <w:rPr>
           <w:b/>
           <w:bCs/>
         </w:rPr>
-        <w:t xml:space="preserve">hyperparamètres</w:t>
-      </w:r>
-      <w:r>
-        <w:t xml:space="preserve"> </w:t>
-      </w:r>
-      <w:r>
-        <w:t xml:space="preserve">(via</w:t>
-      </w:r>
-      <w:r>
-        <w:t xml:space="preserve"> </w:t>
-      </w:r>
-      <w:r>
-        <w:rPr>
-          <w:rStyle w:val="VerbatimChar"/>
-        </w:rPr>
-        <w:t xml:space="preserve">get_params()</w:t>
-      </w:r>
-      <w:r>
-        <w:t xml:space="preserve">)</w:t>
+        <w:t xml:space="preserve">Intégration Streamlit</w:t>
+      </w:r>
+      <w:r>
+        <w:t xml:space="preserve"> </w:t>
+      </w:r>
+      <w:r>
+        <w:t xml:space="preserve">: BERT est automatiquement chargé par l’application et apparaît comme 4ᵉ modèle dans l’onglet Prediction, avec sa matrice de confusion et sa courbe ROC dans le Tableau de bord.</w:t>
+      </w:r>
+    </w:p>
+    <w:p>
+      <w:pPr>
+        <w:pStyle w:val="SourceCode"/>
+      </w:pPr>
+      <w:r>
+        <w:rPr>
+          <w:rStyle w:val="VerbatimChar"/>
+        </w:rPr>
+        <w:t xml:space="preserve">uv add torch</w:t>
+      </w:r>
+      <w:r>
+        <w:br/>
+      </w:r>
+      <w:r>
+        <w:rPr>
+          <w:rStyle w:val="VerbatimChar"/>
+        </w:rPr>
+        <w:t xml:space="preserve">uv run python src/models/train_bert.py</w:t>
+      </w:r>
+      <w:r>
+        <w:br/>
+      </w:r>
+      <w:r>
+        <w:rPr>
+          <w:rStyle w:val="VerbatimChar"/>
+        </w:rPr>
+        <w:t xml:space="preserve">uv run streamlit run src/deploy/streamlit_app.py   # BERT charge automatiquement</w:t>
+      </w:r>
+    </w:p>
+    <w:bookmarkEnd w:id="56"/>
+    <w:bookmarkStart w:id="57" w:name="b.5-mlflow-tracking-des-expérimentations"/>
+    <w:p>
+      <w:pPr>
+        <w:pStyle w:val="Heading3"/>
+      </w:pPr>
+      <w:r>
+        <w:t xml:space="preserve">B.5 — MLflow (Tracking des expérimentations)</w:t>
+      </w:r>
+    </w:p>
+    <w:p>
+      <w:pPr>
+        <w:pStyle w:val="FirstParagraph"/>
+      </w:pPr>
+      <w:r>
+        <w:t xml:space="preserve">Le script</w:t>
+      </w:r>
+      <w:r>
+        <w:t xml:space="preserve"> </w:t>
+      </w:r>
+      <w:r>
+        <w:rPr>
+          <w:rStyle w:val="VerbatimChar"/>
+        </w:rPr>
+        <w:t xml:space="preserve">src/models/train_with_mlflow.py</w:t>
+      </w:r>
+      <w:r>
+        <w:t xml:space="preserve"> </w:t>
+      </w:r>
+      <w:r>
+        <w:t xml:space="preserve">enregistre automatiquement pour chaque modèle :</w:t>
       </w:r>
       <w:r>
         <w:t xml:space="preserve"> </w:t>
@@ -2856,13 +2964,25 @@
           <w:b/>
           <w:bCs/>
         </w:rPr>
-        <w:t xml:space="preserve">métriques</w:t>
-      </w:r>
-      <w:r>
-        <w:t xml:space="preserve"> </w:t>
-      </w:r>
-      <w:r>
-        <w:t xml:space="preserve">(accuracy, precision, recall, F1)</w:t>
+        <w:t xml:space="preserve">hyperparamètres</w:t>
+      </w:r>
+      <w:r>
+        <w:t xml:space="preserve"> </w:t>
+      </w:r>
+      <w:r>
+        <w:t xml:space="preserve">(via</w:t>
+      </w:r>
+      <w:r>
+        <w:t xml:space="preserve"> </w:t>
+      </w:r>
+      <w:r>
+        <w:rPr>
+          <w:rStyle w:val="VerbatimChar"/>
+        </w:rPr>
+        <w:t xml:space="preserve">get_params()</w:t>
+      </w:r>
+      <w:r>
+        <w:t xml:space="preserve">)</w:t>
       </w:r>
       <w:r>
         <w:t xml:space="preserve"> </w:t>
@@ -2878,6 +2998,28 @@
           <w:b/>
           <w:bCs/>
         </w:rPr>
+        <w:t xml:space="preserve">métriques</w:t>
+      </w:r>
+      <w:r>
+        <w:t xml:space="preserve"> </w:t>
+      </w:r>
+      <w:r>
+        <w:t xml:space="preserve">(accuracy, precision, recall, F1)</w:t>
+      </w:r>
+      <w:r>
+        <w:t xml:space="preserve"> </w:t>
+      </w:r>
+      <w:r>
+        <w:t xml:space="preserve">- Les</w:t>
+      </w:r>
+      <w:r>
+        <w:t xml:space="preserve"> </w:t>
+      </w:r>
+      <w:r>
+        <w:rPr>
+          <w:b/>
+          <w:bCs/>
+        </w:rPr>
         <w:t xml:space="preserve">artefacts</w:t>
       </w:r>
       <w:r>
@@ -2889,6 +3031,24 @@
     </w:p>
     <w:p>
       <w:pPr>
+        <w:pStyle w:val="BodyText"/>
+      </w:pPr>
+      <w:r>
+        <w:rPr>
+          <w:b/>
+          <w:bCs/>
+        </w:rPr>
+        <w:t xml:space="preserve">Intégration Streamlit</w:t>
+      </w:r>
+      <w:r>
+        <w:t xml:space="preserve"> </w:t>
+      </w:r>
+      <w:r>
+        <w:t xml:space="preserve">: l’onglet MLflow dans l’application affiche les dernières runs, leurs métriques, et propose de lancer l’interface web MLflow.</w:t>
+      </w:r>
+    </w:p>
+    <w:p>
+      <w:pPr>
         <w:pStyle w:val="SourceCode"/>
       </w:pPr>
       <w:r>
@@ -2924,8 +3084,8 @@
         <w:t xml:space="preserve">L’interface MLflow permet de comparer visuellement les performances des 3 modèles et d’exporter les résultats.</w:t>
       </w:r>
     </w:p>
-    <w:bookmarkEnd w:id="56"/>
-    <w:bookmarkStart w:id="57" w:name="b.3-cicd-github-actions"/>
+    <w:bookmarkEnd w:id="57"/>
+    <w:bookmarkStart w:id="58" w:name="b.3-cicd-github-actions"/>
     <w:p>
       <w:pPr>
         <w:pStyle w:val="Heading3"/>
@@ -2972,8 +3132,8 @@
         <w:t xml:space="preserve">et reproduit l’intégralité du pipeline DVC, garantissant que les modifications ne cassent pas la pipeline.</w:t>
       </w:r>
     </w:p>
-    <w:bookmarkEnd w:id="57"/>
-    <w:bookmarkStart w:id="59" w:name="b.2-hugging-face-spaces"/>
+    <w:bookmarkEnd w:id="58"/>
+    <w:bookmarkStart w:id="60" w:name="b.2-hugging-face-spaces"/>
     <w:p>
       <w:pPr>
         <w:pStyle w:val="Heading3"/>
@@ -3013,7 +3173,7 @@
       <w:r>
         <w:t xml:space="preserve"> </w:t>
       </w:r>
-      <w:hyperlink r:id="rId58">
+      <w:hyperlink r:id="rId59">
         <w:r>
           <w:rPr>
             <w:rStyle w:val="Hyperlink"/>
@@ -3056,9 +3216,9 @@
         <w:t xml:space="preserve">4. Le Space détecte automatiquement la configuration et déploie l’application</w:t>
       </w:r>
     </w:p>
-    <w:bookmarkEnd w:id="59"/>
     <w:bookmarkEnd w:id="60"/>
-    <w:bookmarkStart w:id="61" w:name="perspectives-damélioration"/>
+    <w:bookmarkEnd w:id="61"/>
+    <w:bookmarkStart w:id="62" w:name="perspectives-damélioration"/>
     <w:p>
       <w:pPr>
         <w:pStyle w:val="Heading2"/>
@@ -3103,9 +3263,9 @@
         <w:t xml:space="preserve">Mode batch pour analyser un fichier CSV de tweets</w:t>
       </w:r>
     </w:p>
-    <w:bookmarkEnd w:id="61"/>
     <w:bookmarkEnd w:id="62"/>
-    <w:bookmarkStart w:id="63" w:name="conclusion"/>
+    <w:bookmarkEnd w:id="63"/>
+    <w:bookmarkStart w:id="64" w:name="conclusion"/>
     <w:p>
       <w:pPr>
         <w:pStyle w:val="Heading1"/>
@@ -3122,8 +3282,8 @@
         <w:t xml:space="preserve">Ce projet a permis de mettre en œuvre un pipeline complet de Machine Learning pour la détection de tweets suspects. Les meilleurs résultats (F1 &gt; 98%) montrent la faisabilité de la tâche avec des approches classiques. L’utilisation de DVC assure la reproductibilité du pipeline, et le déploiement via Streamlit/FastAPI permet une utilisation en conditions réelles.</w:t>
       </w:r>
     </w:p>
-    <w:bookmarkEnd w:id="63"/>
-    <w:bookmarkStart w:id="64" w:name="références"/>
+    <w:bookmarkEnd w:id="64"/>
+    <w:bookmarkStart w:id="65" w:name="références"/>
     <w:p>
       <w:pPr>
         <w:pStyle w:val="Heading1"/>
@@ -3168,7 +3328,7 @@
         <w:t xml:space="preserve">Dataset : Google Drive (ID: 1US0luOWPOeVPpUQnpyxr41zrBmeg4Gjk)</w:t>
       </w:r>
     </w:p>
-    <w:bookmarkEnd w:id="64"/>
+    <w:bookmarkEnd w:id="65"/>
     <w:sectPr>
       <w:footnotePr>
         <w:numRestart w:val="eachSect"/>

</xml_diff>

<commit_message>
rapport: MAJ complète — chaque modele avec parametres CV GridSearch, lecons apprises, perspectives, 4 nouvelles figures
</commit_message>
<xml_diff>
--- a/reports/rapport.docx
+++ b/reports/rapport.docx
@@ -31,7 +31,7 @@
         <w:pStyle w:val="Date"/>
       </w:pPr>
       <w:r>
-        <w:t xml:space="preserve">Juillet 2026</w:t>
+        <w:t xml:space="preserve">Juin 2026</w:t>
       </w:r>
     </w:p>
     <w:sdt>
@@ -202,7 +202,7 @@
       </w:r>
     </w:p>
     <w:bookmarkEnd w:id="10"/>
-    <w:bookmarkStart w:id="18" w:name="méthodologie"/>
+    <w:bookmarkStart w:id="19" w:name="méthodologie"/>
     <w:p>
       <w:pPr>
         <w:pStyle w:val="Heading1"/>
@@ -750,7 +750,7 @@
       </w:r>
     </w:p>
     <w:bookmarkEnd w:id="12"/>
-    <w:bookmarkStart w:id="17" w:name="modèles-utilisés"/>
+    <w:bookmarkStart w:id="18" w:name="modèles-utilisés"/>
     <w:p>
       <w:pPr>
         <w:pStyle w:val="Heading2"/>
@@ -764,7 +764,7 @@
         <w:pStyle w:val="FirstParagraph"/>
       </w:pPr>
       <w:r>
-        <w:t xml:space="preserve">Trois algorithmes ont été implémentés et comparés :</w:t>
+        <w:t xml:space="preserve">Trois algorithmes classiques ont été implémentés et comparés, auxquels s’ajoute DistilBERT (bonus).</w:t>
       </w:r>
     </w:p>
     <w:bookmarkStart w:id="13" w:name="régression-logistique"/>
@@ -781,7 +781,19 @@
         <w:pStyle w:val="FirstParagraph"/>
       </w:pPr>
       <w:r>
-        <w:t xml:space="preserve">Modèle linéaire avec</w:t>
+        <w:t xml:space="preserve">Modèle linéaire avec régularisation L2. Paramètres de base :</w:t>
+      </w:r>
+      <w:r>
+        <w:t xml:space="preserve"> </w:t>
+      </w:r>
+      <w:r>
+        <w:rPr>
+          <w:rStyle w:val="VerbatimChar"/>
+        </w:rPr>
+        <w:t xml:space="preserve">max_iter=1000</w:t>
+      </w:r>
+      <w:r>
+        <w:t xml:space="preserve">,</w:t>
       </w:r>
       <w:r>
         <w:t xml:space="preserve"> </w:t>
@@ -793,10 +805,62 @@
         <w:t xml:space="preserve">class_weight="balanced"</w:t>
       </w:r>
       <w:r>
-        <w:t xml:space="preserve"> </w:t>
-      </w:r>
-      <w:r>
-        <w:t xml:space="preserve">pour gérer le déséquilibre des classes. Limité à 1000 itérations pour assurer la convergence.</w:t>
+        <w:t xml:space="preserve">,</w:t>
+      </w:r>
+      <w:r>
+        <w:t xml:space="preserve"> </w:t>
+      </w:r>
+      <w:r>
+        <w:rPr>
+          <w:rStyle w:val="VerbatimChar"/>
+        </w:rPr>
+        <w:t xml:space="preserve">random_state=42</w:t>
+      </w:r>
+      <w:r>
+        <w:t xml:space="preserve">. Optimisé par Grid Search sur</w:t>
+      </w:r>
+      <w:r>
+        <w:t xml:space="preserve"> </w:t>
+      </w:r>
+      <w:r>
+        <w:rPr>
+          <w:rStyle w:val="VerbatimChar"/>
+        </w:rPr>
+        <w:t xml:space="preserve">C ∈ {0.01, 0.1, 1, 10, 100}</w:t>
+      </w:r>
+      <w:r>
+        <w:t xml:space="preserve"> </w:t>
+      </w:r>
+      <w:r>
+        <w:t xml:space="preserve">avec validation croisée 5-fold. Meilleur</w:t>
+      </w:r>
+      <w:r>
+        <w:t xml:space="preserve"> </w:t>
+      </w:r>
+      <w:r>
+        <w:rPr>
+          <w:rStyle w:val="VerbatimChar"/>
+        </w:rPr>
+        <w:t xml:space="preserve">C</w:t>
+      </w:r>
+      <w:r>
+        <w:t xml:space="preserve"> </w:t>
+      </w:r>
+      <w:r>
+        <w:t xml:space="preserve">trouvé :</w:t>
+      </w:r>
+      <w:r>
+        <w:t xml:space="preserve"> </w:t>
+      </w:r>
+      <w:r>
+        <w:rPr>
+          <w:b/>
+          <w:bCs/>
+        </w:rPr>
+        <w:t xml:space="preserve">0.1</w:t>
+      </w:r>
+      <w:r>
+        <w:t xml:space="preserve">.</w:t>
       </w:r>
     </w:p>
     <w:bookmarkEnd w:id="13"/>
@@ -814,7 +878,7 @@
         <w:pStyle w:val="FirstParagraph"/>
       </w:pPr>
       <w:r>
-        <w:t xml:space="preserve">Classifieur probabiliste adapté aux données de comptage (TF-IDF). Performant sur les textes mais sensible à la corrélation entre features.</w:t>
+        <w:t xml:space="preserve">Classifieur probabiliste basé sur le théorème de Bayes avec distribution multinomiale. Aucun hyperparamètre à optimiser. Performant sur les données de comptage (TF-IDF) mais sensible à la corrélation entre features.</w:t>
       </w:r>
     </w:p>
     <w:bookmarkEnd w:id="14"/>
@@ -844,16 +908,127 @@
         <w:t xml:space="preserve">class_weight="balanced"</w:t>
       </w:r>
       <w:r>
-        <w:t xml:space="preserve">. Capture les interactions non linéaires entre les mots.</w:t>
+        <w:t xml:space="preserve">,</w:t>
+      </w:r>
+      <w:r>
+        <w:t xml:space="preserve"> </w:t>
+      </w:r>
+      <w:r>
+        <w:rPr>
+          <w:rStyle w:val="VerbatimChar"/>
+        </w:rPr>
+        <w:t xml:space="preserve">random_state=42</w:t>
+      </w:r>
+      <w:r>
+        <w:t xml:space="preserve">,</w:t>
+      </w:r>
+      <w:r>
+        <w:t xml:space="preserve"> </w:t>
+      </w:r>
+      <w:r>
+        <w:rPr>
+          <w:rStyle w:val="VerbatimChar"/>
+        </w:rPr>
+        <w:t xml:space="preserve">n_jobs=-1</w:t>
+      </w:r>
+      <w:r>
+        <w:t xml:space="preserve">. Capture les interactions non linéaires. Optimisé par Grid Search sur</w:t>
+      </w:r>
+      <w:r>
+        <w:t xml:space="preserve"> </w:t>
+      </w:r>
+      <w:r>
+        <w:rPr>
+          <w:rStyle w:val="VerbatimChar"/>
+        </w:rPr>
+        <w:t xml:space="preserve">n_estimators ∈ {50, 100, 200}</w:t>
+      </w:r>
+      <w:r>
+        <w:t xml:space="preserve"> </w:t>
+      </w:r>
+      <w:r>
+        <w:t xml:space="preserve">et</w:t>
+      </w:r>
+      <w:r>
+        <w:t xml:space="preserve"> </w:t>
+      </w:r>
+      <w:r>
+        <w:rPr>
+          <w:rStyle w:val="VerbatimChar"/>
+        </w:rPr>
+        <w:t xml:space="preserve">max_depth ∈ {5, 10, 20, None}</w:t>
+      </w:r>
+      <w:r>
+        <w:t xml:space="preserve"> </w:t>
+      </w:r>
+      <w:r>
+        <w:t xml:space="preserve">avec validation croisée 3-fold. Meilleurs paramètres :</w:t>
+      </w:r>
+      <w:r>
+        <w:t xml:space="preserve"> </w:t>
+      </w:r>
+      <w:r>
+        <w:rPr>
+          <w:rStyle w:val="VerbatimChar"/>
+        </w:rPr>
+        <w:t xml:space="preserve">n_estimators=200</w:t>
+      </w:r>
+      <w:r>
+        <w:t xml:space="preserve">,</w:t>
+      </w:r>
+      <w:r>
+        <w:t xml:space="preserve"> </w:t>
+      </w:r>
+      <w:r>
+        <w:rPr>
+          <w:rStyle w:val="VerbatimChar"/>
+        </w:rPr>
+        <w:t xml:space="preserve">max_depth=None</w:t>
+      </w:r>
+      <w:r>
+        <w:t xml:space="preserve">.</w:t>
       </w:r>
     </w:p>
     <w:bookmarkEnd w:id="15"/>
-    <w:bookmarkStart w:id="16" w:name="gestion-du-déséquilibre"/>
+    <w:bookmarkStart w:id="16" w:name="distilbert-bonus"/>
     <w:p>
       <w:pPr>
         <w:pStyle w:val="Heading3"/>
       </w:pPr>
       <w:r>
+        <w:t xml:space="preserve">4. DistilBERT (Bonus)</w:t>
+      </w:r>
+    </w:p>
+    <w:p>
+      <w:pPr>
+        <w:pStyle w:val="FirstParagraph"/>
+      </w:pPr>
+      <w:r>
+        <w:t xml:space="preserve">Modèle transformer pré-entraîné</w:t>
+      </w:r>
+      <w:r>
+        <w:t xml:space="preserve"> </w:t>
+      </w:r>
+      <w:r>
+        <w:rPr>
+          <w:rStyle w:val="VerbatimChar"/>
+        </w:rPr>
+        <w:t xml:space="preserve">distilbert-base-uncased</w:t>
+      </w:r>
+      <w:r>
+        <w:t xml:space="preserve"> </w:t>
+      </w:r>
+      <w:r>
+        <w:t xml:space="preserve">fine-tuné sur le dataset. Tokenisation avec padding et truncation à 128 tokens. Entraîné sur 1 époque (batch size 16, learning rate 2e-5, warmup 500 steps). L’entraînement complet sur 3 époques est recommandé pour atteindre le meilleur score possible.</w:t>
+      </w:r>
+    </w:p>
+    <w:bookmarkEnd w:id="16"/>
+    <w:bookmarkStart w:id="17" w:name="gestion-du-déséquilibre"/>
+    <w:p>
+      <w:pPr>
+        <w:pStyle w:val="Heading3"/>
+      </w:pPr>
+      <w:r>
         <w:t xml:space="preserve">Gestion du déséquilibre</w:t>
       </w:r>
     </w:p>
@@ -862,7 +1037,7 @@
         <w:pStyle w:val="FirstParagraph"/>
       </w:pPr>
       <w:r>
-        <w:t xml:space="preserve">La classe suspect est sous-représentée. La stratégie</w:t>
+        <w:t xml:space="preserve">La classe suspect (0) représente ~10% des données. Les modèles sklearn utilisent</w:t>
       </w:r>
       <w:r>
         <w:t xml:space="preserve"> </w:t>
@@ -877,13 +1052,13 @@
         <w:t xml:space="preserve"> </w:t>
       </w:r>
       <w:r>
-        <w:t xml:space="preserve">ajuste les poids automatiquement. Une alternative (SMOTE) pourra être testée en optimisation.</w:t>
-      </w:r>
-    </w:p>
-    <w:bookmarkEnd w:id="16"/>
+        <w:t xml:space="preserve">pour ajuster les poids automatiquement. Le DistilBERT utilise la répartition naturelle des classes dans son entraînement.</w:t>
+      </w:r>
+    </w:p>
     <w:bookmarkEnd w:id="17"/>
     <w:bookmarkEnd w:id="18"/>
-    <w:bookmarkStart w:id="29" w:name="résultats"/>
+    <w:bookmarkEnd w:id="19"/>
+    <w:bookmarkStart w:id="40" w:name="résultats"/>
     <w:p>
       <w:pPr>
         <w:pStyle w:val="Heading1"/>
@@ -892,13 +1067,53 @@
         <w:t xml:space="preserve">Résultats</w:t>
       </w:r>
     </w:p>
-    <w:bookmarkStart w:id="19" w:name="performances-des-modèles"/>
+    <w:bookmarkStart w:id="20" w:name="X6107493e076b9080e9b7ee77e0f5b5606598052"/>
     <w:p>
       <w:pPr>
         <w:pStyle w:val="Heading2"/>
       </w:pPr>
       <w:r>
-        <w:t xml:space="preserve">Performances des modèles</w:t>
+        <w:t xml:space="preserve">Performances des modèles (validation croisée)</w:t>
+      </w:r>
+    </w:p>
+    <w:p>
+      <w:pPr>
+        <w:pStyle w:val="FirstParagraph"/>
+      </w:pPr>
+      <w:r>
+        <w:t xml:space="preserve">La séparation train/test a été faite en</w:t>
+      </w:r>
+      <w:r>
+        <w:t xml:space="preserve"> </w:t>
+      </w:r>
+      <w:r>
+        <w:rPr>
+          <w:b/>
+          <w:bCs/>
+        </w:rPr>
+        <w:t xml:space="preserve">80/20 avec stratification</w:t>
+      </w:r>
+      <w:r>
+        <w:t xml:space="preserve"> </w:t>
+      </w:r>
+      <w:r>
+        <w:t xml:space="preserve">pour préserver la distribution des classes. Une validation croisée</w:t>
+      </w:r>
+      <w:r>
+        <w:t xml:space="preserve"> </w:t>
+      </w:r>
+      <w:r>
+        <w:rPr>
+          <w:b/>
+          <w:bCs/>
+        </w:rPr>
+        <w:t xml:space="preserve">5-fold</w:t>
+      </w:r>
+      <w:r>
+        <w:t xml:space="preserve"> </w:t>
+      </w:r>
+      <w:r>
+        <w:t xml:space="preserve">(stratifée) a été appliquée pour évaluer la stabilité :</w:t>
       </w:r>
     </w:p>
     <w:tbl>
@@ -909,11 +1124,12 @@
         <w:tblLook w:firstRow="1" w:lastRow="0" w:firstColumn="0" w:lastColumn="0" w:noHBand="0" w:noVBand="0" w:val="0020"/>
       </w:tblPr>
       <w:tblGrid>
-        <w:gridCol w:w="1348"/>
-        <w:gridCol w:w="1685"/>
-        <w:gridCol w:w="1853"/>
-        <w:gridCol w:w="1348"/>
-        <w:gridCol w:w="1685"/>
+        <w:gridCol w:w="856"/>
+        <w:gridCol w:w="1391"/>
+        <w:gridCol w:w="963"/>
+        <w:gridCol w:w="1605"/>
+        <w:gridCol w:w="1712"/>
+        <w:gridCol w:w="1391"/>
       </w:tblGrid>
       <w:tr>
         <w:trPr>
@@ -937,40 +1153,51 @@
               <w:pStyle w:val="Compact"/>
             </w:pPr>
             <w:r>
-              <w:t xml:space="preserve">Accuracy</w:t>
-            </w:r>
-          </w:p>
-        </w:tc>
-        <w:tc>
-          <w:tcPr/>
-          <w:p>
-            <w:pPr>
-              <w:pStyle w:val="Compact"/>
-            </w:pPr>
-            <w:r>
-              <w:t xml:space="preserve">Precision</w:t>
-            </w:r>
-          </w:p>
-        </w:tc>
-        <w:tc>
-          <w:tcPr/>
-          <w:p>
-            <w:pPr>
-              <w:pStyle w:val="Compact"/>
-            </w:pPr>
-            <w:r>
-              <w:t xml:space="preserve">Recall</w:t>
-            </w:r>
-          </w:p>
-        </w:tc>
-        <w:tc>
-          <w:tcPr/>
-          <w:p>
-            <w:pPr>
-              <w:pStyle w:val="Compact"/>
-            </w:pPr>
-            <w:r>
-              <w:t xml:space="preserve">F1-Score</w:t>
+              <w:t xml:space="preserve">CV 5-fold F1</w:t>
+            </w:r>
+          </w:p>
+        </w:tc>
+        <w:tc>
+          <w:tcPr/>
+          <w:p>
+            <w:pPr>
+              <w:pStyle w:val="Compact"/>
+            </w:pPr>
+            <w:r>
+              <w:t xml:space="preserve">Test F1</w:t>
+            </w:r>
+          </w:p>
+        </w:tc>
+        <w:tc>
+          <w:tcPr/>
+          <w:p>
+            <w:pPr>
+              <w:pStyle w:val="Compact"/>
+            </w:pPr>
+            <w:r>
+              <w:t xml:space="preserve">Test Accuracy</w:t>
+            </w:r>
+          </w:p>
+        </w:tc>
+        <w:tc>
+          <w:tcPr/>
+          <w:p>
+            <w:pPr>
+              <w:pStyle w:val="Compact"/>
+            </w:pPr>
+            <w:r>
+              <w:t xml:space="preserve">Test Precision</w:t>
+            </w:r>
+          </w:p>
+        </w:tc>
+        <w:tc>
+          <w:tcPr/>
+          <w:p>
+            <w:pPr>
+              <w:pStyle w:val="Compact"/>
+            </w:pPr>
+            <w:r>
+              <w:t xml:space="preserve">Test Recall</w:t>
             </w:r>
           </w:p>
         </w:tc>
@@ -983,7 +1210,29 @@
               <w:pStyle w:val="Compact"/>
             </w:pPr>
             <w:r>
-              <w:t xml:space="preserve">Logistic Regression</w:t>
+              <w:t xml:space="preserve">Logistic Regression (C=0.1)</w:t>
+            </w:r>
+          </w:p>
+        </w:tc>
+        <w:tc>
+          <w:tcPr/>
+          <w:p>
+            <w:pPr>
+              <w:pStyle w:val="Compact"/>
+            </w:pPr>
+            <w:r>
+              <w:t xml:space="preserve">98.31% ± 0.18%</w:t>
+            </w:r>
+          </w:p>
+        </w:tc>
+        <w:tc>
+          <w:tcPr/>
+          <w:p>
+            <w:pPr>
+              <w:pStyle w:val="Compact"/>
+            </w:pPr>
+            <w:r>
+              <w:t xml:space="preserve">98.36%</w:t>
             </w:r>
           </w:p>
         </w:tc>
@@ -1017,17 +1266,6 @@
             </w:pPr>
             <w:r>
               <w:t xml:space="preserve">98.61%</w:t>
-            </w:r>
-          </w:p>
-        </w:tc>
-        <w:tc>
-          <w:tcPr/>
-          <w:p>
-            <w:pPr>
-              <w:pStyle w:val="Compact"/>
-            </w:pPr>
-            <w:r>
-              <w:t xml:space="preserve">98.36%</w:t>
             </w:r>
           </w:p>
         </w:tc>
@@ -1051,6 +1289,28 @@
               <w:pStyle w:val="Compact"/>
             </w:pPr>
             <w:r>
+              <w:t xml:space="preserve">96.10% ± 0.10%</w:t>
+            </w:r>
+          </w:p>
+        </w:tc>
+        <w:tc>
+          <w:tcPr/>
+          <w:p>
+            <w:pPr>
+              <w:pStyle w:val="Compact"/>
+            </w:pPr>
+            <w:r>
+              <w:t xml:space="preserve">96.12%</w:t>
+            </w:r>
+          </w:p>
+        </w:tc>
+        <w:tc>
+          <w:tcPr/>
+          <w:p>
+            <w:pPr>
+              <w:pStyle w:val="Compact"/>
+            </w:pPr>
+            <w:r>
               <w:t xml:space="preserve">92.76%</w:t>
             </w:r>
           </w:p>
@@ -1074,17 +1334,6 @@
             </w:pPr>
             <w:r>
               <w:t xml:space="preserve">99.95%</w:t>
-            </w:r>
-          </w:p>
-        </w:tc>
-        <w:tc>
-          <w:tcPr/>
-          <w:p>
-            <w:pPr>
-              <w:pStyle w:val="Compact"/>
-            </w:pPr>
-            <w:r>
-              <w:t xml:space="preserve">96.12%</w:t>
             </w:r>
           </w:p>
         </w:tc>
@@ -1097,7 +1346,29 @@
               <w:pStyle w:val="Compact"/>
             </w:pPr>
             <w:r>
-              <w:t xml:space="preserve">Random Forest</w:t>
+              <w:t xml:space="preserve">Random Forest (200 arbres)</w:t>
+            </w:r>
+          </w:p>
+        </w:tc>
+        <w:tc>
+          <w:tcPr/>
+          <w:p>
+            <w:pPr>
+              <w:pStyle w:val="Compact"/>
+            </w:pPr>
+            <w:r>
+              <w:t xml:space="preserve">98.52% ± 0.15%</w:t>
+            </w:r>
+          </w:p>
+        </w:tc>
+        <w:tc>
+          <w:tcPr/>
+          <w:p>
+            <w:pPr>
+              <w:pStyle w:val="Compact"/>
+            </w:pPr>
+            <w:r>
+              <w:t xml:space="preserve">98.64%</w:t>
             </w:r>
           </w:p>
         </w:tc>
@@ -1131,17 +1402,6 @@
             </w:pPr>
             <w:r>
               <w:t xml:space="preserve">99.12%</w:t>
-            </w:r>
-          </w:p>
-        </w:tc>
-        <w:tc>
-          <w:tcPr/>
-          <w:p>
-            <w:pPr>
-              <w:pStyle w:val="Compact"/>
-            </w:pPr>
-            <w:r>
-              <w:t xml:space="preserve">98.64%</w:t>
             </w:r>
           </w:p>
         </w:tc>
@@ -1175,6 +1435,32 @@
               <w:pStyle w:val="Compact"/>
             </w:pPr>
             <w:r>
+              <w:t xml:space="preserve">—</w:t>
+            </w:r>
+          </w:p>
+        </w:tc>
+        <w:tc>
+          <w:tcPr/>
+          <w:p>
+            <w:pPr>
+              <w:pStyle w:val="Compact"/>
+            </w:pPr>
+            <w:r>
+              <w:rPr>
+                <w:b/>
+                <w:bCs/>
+              </w:rPr>
+              <w:t xml:space="preserve">99.02%</w:t>
+            </w:r>
+          </w:p>
+        </w:tc>
+        <w:tc>
+          <w:tcPr/>
+          <w:p>
+            <w:pPr>
+              <w:pStyle w:val="Compact"/>
+            </w:pPr>
+            <w:r>
               <w:rPr>
                 <w:b/>
                 <w:bCs/>
@@ -1213,21 +1499,6 @@
             </w:r>
           </w:p>
         </w:tc>
-        <w:tc>
-          <w:tcPr/>
-          <w:p>
-            <w:pPr>
-              <w:pStyle w:val="Compact"/>
-            </w:pPr>
-            <w:r>
-              <w:rPr>
-                <w:b/>
-                <w:bCs/>
-              </w:rPr>
-              <w:t xml:space="preserve">99.02%</w:t>
-            </w:r>
-          </w:p>
-        </w:tc>
       </w:tr>
     </w:tbl>
     <w:p>
@@ -1251,7 +1522,7 @@
         <w:t xml:space="preserve"> </w:t>
       </w:r>
       <w:r>
-        <w:t xml:space="preserve">obtient les meilleures performances globales parmi les approches classiques avec un F1-Score de</w:t>
+        <w:t xml:space="preserve">surpasse très légèrement la régression logistique (98.64% vs 98.36%). Le</w:t>
       </w:r>
       <w:r>
         <w:t xml:space="preserve"> </w:t>
@@ -1261,10 +1532,13 @@
           <w:b/>
           <w:bCs/>
         </w:rPr>
-        <w:t xml:space="preserve">98.64%</w:t>
-      </w:r>
-      <w:r>
-        <w:t xml:space="preserve">. Le</w:t>
+        <w:t xml:space="preserve">DistilBERT</w:t>
+      </w:r>
+      <w:r>
+        <w:t xml:space="preserve"> </w:t>
+      </w:r>
+      <w:r>
+        <w:t xml:space="preserve">atteint</w:t>
       </w:r>
       <w:r>
         <w:t xml:space="preserve"> </w:t>
@@ -1274,30 +1548,17 @@
           <w:b/>
           <w:bCs/>
         </w:rPr>
-        <w:t xml:space="preserve">DistilBERT</w:t>
-      </w:r>
-      <w:r>
-        <w:t xml:space="preserve">, entraîné sur une seule époque, atteint</w:t>
-      </w:r>
-      <w:r>
-        <w:t xml:space="preserve"> </w:t>
-      </w:r>
-      <w:r>
-        <w:rPr>
-          <w:b/>
-          <w:bCs/>
-        </w:rPr>
         <w:t xml:space="preserve">99.02%</w:t>
       </w:r>
       <w:r>
         <w:t xml:space="preserve"> </w:t>
       </w:r>
       <w:r>
-        <w:t xml:space="preserve">de F1-Score, démontrant la puissance des transformers pour cette tâche.</w:t>
-      </w:r>
-    </w:p>
-    <w:bookmarkEnd w:id="19"/>
-    <w:bookmarkStart w:id="23" w:name="matrices-de-confusion"/>
+        <w:t xml:space="preserve">de F1-Score, démontrant la puissance des transformers. NB triche sur Recall (99.95%) car il prédit quasi-systématiquement la classe majoritaire.</w:t>
+      </w:r>
+    </w:p>
+    <w:bookmarkEnd w:id="20"/>
+    <w:bookmarkStart w:id="24" w:name="matrices-de-confusion"/>
     <w:p>
       <w:pPr>
         <w:pStyle w:val="Heading2"/>
@@ -1315,18 +1576,18 @@
           <wp:inline>
             <wp:extent cx="5334000" cy="1405711"/>
             <wp:effectExtent b="0" l="0" r="0" t="0"/>
-            <wp:docPr descr="Matrices de confusion des 3 modèles" title="" id="21" name="Picture"/>
+            <wp:docPr descr="Matrices de confusion des 3 modèles classiques" title="" id="22" name="Picture"/>
             <a:graphic>
               <a:graphicData uri="http://schemas.openxmlformats.org/drawingml/2006/picture">
                 <pic:pic>
                   <pic:nvPicPr>
-                    <pic:cNvPr descr="figures/confusion_matrices_notebook.png" id="22" name="Picture"/>
+                    <pic:cNvPr descr="figures/confusion_matrices_notebook.png" id="23" name="Picture"/>
                     <pic:cNvPicPr>
                       <a:picLocks noChangeArrowheads="1" noChangeAspect="1"/>
                     </pic:cNvPicPr>
                   </pic:nvPicPr>
                   <pic:blipFill>
-                    <a:blip r:embed="rId20"/>
+                    <a:blip r:embed="rId21"/>
                     <a:stretch>
                       <a:fillRect/>
                     </a:stretch>
@@ -1358,7 +1619,7 @@
         <w:pStyle w:val="ImageCaption"/>
       </w:pPr>
       <w:r>
-        <w:t xml:space="preserve">Matrices de confusion des 3 modèles</w:t>
+        <w:t xml:space="preserve">Matrices de confusion des 3 modèles classiques</w:t>
       </w:r>
     </w:p>
     <w:p>
@@ -1366,11 +1627,19 @@
         <w:pStyle w:val="BodyText"/>
       </w:pPr>
       <w:r>
-        <w:t xml:space="preserve">Lecture : VN (haut-gauche), FP (haut-droite), FN (bas-gauche), VP (bas-droite).</w:t>
-      </w:r>
-    </w:p>
-    <w:bookmarkEnd w:id="23"/>
-    <w:bookmarkStart w:id="27" w:name="courbes-roc-et-auc"/>
+        <w:t xml:space="preserve">Lecture (haut-gauche → bas-droite) : Vrais Négatifs, Faux Positifs, Faux Négatifs, Vrais Positifs.</w:t>
+      </w:r>
+    </w:p>
+    <w:p>
+      <w:pPr>
+        <w:pStyle w:val="BodyText"/>
+      </w:pPr>
+      <w:r>
+        <w:t xml:space="preserve">Les trois modèles classiques produisent très peu de faux positifs. Le Naive Bayes est le plus permissif (3 FN seulement), mais génère 5x plus de FP que les autres. Le Random Forest offre le meilleur équilibre (125 FN, 66 FP).</w:t>
+      </w:r>
+    </w:p>
+    <w:bookmarkEnd w:id="24"/>
+    <w:bookmarkStart w:id="28" w:name="courbes-roc-et-auc"/>
     <w:p>
       <w:pPr>
         <w:pStyle w:val="Heading2"/>
@@ -1388,18 +1657,18 @@
           <wp:inline>
             <wp:extent cx="5334000" cy="3760629"/>
             <wp:effectExtent b="0" l="0" r="0" t="0"/>
-            <wp:docPr descr="Courbes ROC des 3 modèles" title="" id="25" name="Picture"/>
+            <wp:docPr descr="Courbes ROC des 3 modèles" title="" id="26" name="Picture"/>
             <a:graphic>
               <a:graphicData uri="http://schemas.openxmlformats.org/drawingml/2006/picture">
                 <pic:pic>
                   <pic:nvPicPr>
-                    <pic:cNvPr descr="figures/roc_curves_notebook.png" id="26" name="Picture"/>
+                    <pic:cNvPr descr="figures/roc_curves_notebook.png" id="27" name="Picture"/>
                     <pic:cNvPicPr>
                       <a:picLocks noChangeArrowheads="1" noChangeAspect="1"/>
                     </pic:cNvPicPr>
                   </pic:nvPicPr>
                   <pic:blipFill>
-                    <a:blip r:embed="rId24"/>
+                    <a:blip r:embed="rId25"/>
                     <a:stretch>
                       <a:fillRect/>
                     </a:stretch>
@@ -1439,17 +1708,253 @@
         <w:pStyle w:val="BodyText"/>
       </w:pPr>
       <w:r>
-        <w:t xml:space="preserve">Les trois modèles présentent une AUC supérieure à 0.97, confirmant leur capacité de discrimination.</w:t>
-      </w:r>
-    </w:p>
-    <w:bookmarkEnd w:id="27"/>
-    <w:bookmarkStart w:id="28" w:name="validation-croisée"/>
+        <w:t xml:space="preserve">Les AUC sont toutes supérieures à 0.97, confirmant une excellente capacité de discrimination. La courbe du Random Forest domine les deux autres sur la quasi-totalité du seuil de décision.</w:t>
+      </w:r>
+    </w:p>
+    <w:bookmarkEnd w:id="28"/>
+    <w:bookmarkStart w:id="32" w:name="courbe-dapprentissage"/>
     <w:p>
       <w:pPr>
         <w:pStyle w:val="Heading2"/>
       </w:pPr>
       <w:r>
-        <w:t xml:space="preserve">Validation croisée</w:t>
+        <w:t xml:space="preserve">Courbe d’apprentissage</w:t>
+      </w:r>
+    </w:p>
+    <w:p>
+      <w:pPr>
+        <w:pStyle w:val="CaptionedFigure"/>
+      </w:pPr>
+      <w:r>
+        <w:drawing>
+          <wp:inline>
+            <wp:extent cx="5334000" cy="3306719"/>
+            <wp:effectExtent b="0" l="0" r="0" t="0"/>
+            <wp:docPr descr="Courbes d’apprentissage" title="" id="30" name="Picture"/>
+            <a:graphic>
+              <a:graphicData uri="http://schemas.openxmlformats.org/drawingml/2006/picture">
+                <pic:pic>
+                  <pic:nvPicPr>
+                    <pic:cNvPr descr="figures/learning_curve.png" id="31" name="Picture"/>
+                    <pic:cNvPicPr>
+                      <a:picLocks noChangeArrowheads="1" noChangeAspect="1"/>
+                    </pic:cNvPicPr>
+                  </pic:nvPicPr>
+                  <pic:blipFill>
+                    <a:blip r:embed="rId29"/>
+                    <a:stretch>
+                      <a:fillRect/>
+                    </a:stretch>
+                  </pic:blipFill>
+                  <pic:spPr bwMode="auto">
+                    <a:xfrm>
+                      <a:off x="0" y="0"/>
+                      <a:ext cx="5334000" cy="3306719"/>
+                    </a:xfrm>
+                    <a:prstGeom prst="rect">
+                      <a:avLst/>
+                    </a:prstGeom>
+                    <a:noFill/>
+                    <a:ln w="9525">
+                      <a:noFill/>
+                      <a:headEnd/>
+                      <a:tailEnd/>
+                    </a:ln>
+                  </pic:spPr>
+                </pic:pic>
+              </a:graphicData>
+            </a:graphic>
+          </wp:inline>
+        </w:drawing>
+      </w:r>
+    </w:p>
+    <w:p>
+      <w:pPr>
+        <w:pStyle w:val="ImageCaption"/>
+      </w:pPr>
+      <w:r>
+        <w:t xml:space="preserve">Courbes d’apprentissage</w:t>
+      </w:r>
+    </w:p>
+    <w:p>
+      <w:pPr>
+        <w:pStyle w:val="BodyText"/>
+      </w:pPr>
+      <w:r>
+        <w:t xml:space="preserve">La courbe d’apprentissage du Random Forest montre que les performances continuent de s’améliorer avec plus de données (légère divergence train/test), indiquant qu’un dataset plus volumineux pourrait encore améliorer le modèle.</w:t>
+      </w:r>
+    </w:p>
+    <w:bookmarkEnd w:id="32"/>
+    <w:bookmarkStart w:id="36" w:name="importance-des-features-random-forest"/>
+    <w:p>
+      <w:pPr>
+        <w:pStyle w:val="Heading2"/>
+      </w:pPr>
+      <w:r>
+        <w:t xml:space="preserve">Importance des features (Random Forest)</w:t>
+      </w:r>
+    </w:p>
+    <w:p>
+      <w:pPr>
+        <w:pStyle w:val="CaptionedFigure"/>
+      </w:pPr>
+      <w:r>
+        <w:drawing>
+          <wp:inline>
+            <wp:extent cx="5334000" cy="3993730"/>
+            <wp:effectExtent b="0" l="0" r="0" t="0"/>
+            <wp:docPr descr="Importance des features" title="" id="34" name="Picture"/>
+            <a:graphic>
+              <a:graphicData uri="http://schemas.openxmlformats.org/drawingml/2006/picture">
+                <pic:pic>
+                  <pic:nvPicPr>
+                    <pic:cNvPr descr="figures/feature_importance.png" id="35" name="Picture"/>
+                    <pic:cNvPicPr>
+                      <a:picLocks noChangeArrowheads="1" noChangeAspect="1"/>
+                    </pic:cNvPicPr>
+                  </pic:nvPicPr>
+                  <pic:blipFill>
+                    <a:blip r:embed="rId33"/>
+                    <a:stretch>
+                      <a:fillRect/>
+                    </a:stretch>
+                  </pic:blipFill>
+                  <pic:spPr bwMode="auto">
+                    <a:xfrm>
+                      <a:off x="0" y="0"/>
+                      <a:ext cx="5334000" cy="3993730"/>
+                    </a:xfrm>
+                    <a:prstGeom prst="rect">
+                      <a:avLst/>
+                    </a:prstGeom>
+                    <a:noFill/>
+                    <a:ln w="9525">
+                      <a:noFill/>
+                      <a:headEnd/>
+                      <a:tailEnd/>
+                    </a:ln>
+                  </pic:spPr>
+                </pic:pic>
+              </a:graphicData>
+            </a:graphic>
+          </wp:inline>
+        </w:drawing>
+      </w:r>
+    </w:p>
+    <w:p>
+      <w:pPr>
+        <w:pStyle w:val="ImageCaption"/>
+      </w:pPr>
+      <w:r>
+        <w:t xml:space="preserve">Importance des features</w:t>
+      </w:r>
+    </w:p>
+    <w:p>
+      <w:pPr>
+        <w:pStyle w:val="BodyText"/>
+      </w:pPr>
+      <w:r>
+        <w:t xml:space="preserve">Les mots les plus discriminants pour la classification sont majoritairement liés à la négativité (</w:t>
+      </w:r>
+      <w:r>
+        <w:rPr>
+          <w:rStyle w:val="VerbatimChar"/>
+        </w:rPr>
+        <w:t xml:space="preserve">hate</w:t>
+      </w:r>
+      <w:r>
+        <w:t xml:space="preserve">,</w:t>
+      </w:r>
+      <w:r>
+        <w:t xml:space="preserve"> </w:t>
+      </w:r>
+      <w:r>
+        <w:rPr>
+          <w:rStyle w:val="VerbatimChar"/>
+        </w:rPr>
+        <w:t xml:space="preserve">die</w:t>
+      </w:r>
+      <w:r>
+        <w:t xml:space="preserve">,</w:t>
+      </w:r>
+      <w:r>
+        <w:t xml:space="preserve"> </w:t>
+      </w:r>
+      <w:r>
+        <w:rPr>
+          <w:rStyle w:val="VerbatimChar"/>
+        </w:rPr>
+        <w:t xml:space="preserve">kill</w:t>
+      </w:r>
+      <w:r>
+        <w:t xml:space="preserve">,</w:t>
+      </w:r>
+      <w:r>
+        <w:t xml:space="preserve"> </w:t>
+      </w:r>
+      <w:r>
+        <w:rPr>
+          <w:rStyle w:val="VerbatimChar"/>
+        </w:rPr>
+        <w:t xml:space="preserve">death</w:t>
+      </w:r>
+      <w:r>
+        <w:t xml:space="preserve">,</w:t>
+      </w:r>
+      <w:r>
+        <w:t xml:space="preserve"> </w:t>
+      </w:r>
+      <w:r>
+        <w:rPr>
+          <w:rStyle w:val="VerbatimChar"/>
+        </w:rPr>
+        <w:t xml:space="preserve">suicide</w:t>
+      </w:r>
+      <w:r>
+        <w:t xml:space="preserve">), mais aussi à des thématiques récurrentes (</w:t>
+      </w:r>
+      <w:r>
+        <w:rPr>
+          <w:rStyle w:val="VerbatimChar"/>
+        </w:rPr>
+        <w:t xml:space="preserve">covid</w:t>
+      </w:r>
+      <w:r>
+        <w:t xml:space="preserve">,</w:t>
+      </w:r>
+      <w:r>
+        <w:t xml:space="preserve"> </w:t>
+      </w:r>
+      <w:r>
+        <w:rPr>
+          <w:rStyle w:val="VerbatimChar"/>
+        </w:rPr>
+        <w:t xml:space="preserve">trump</w:t>
+      </w:r>
+      <w:r>
+        <w:t xml:space="preserve">,</w:t>
+      </w:r>
+      <w:r>
+        <w:t xml:space="preserve"> </w:t>
+      </w:r>
+      <w:r>
+        <w:rPr>
+          <w:rStyle w:val="VerbatimChar"/>
+        </w:rPr>
+        <w:t xml:space="preserve">god</w:t>
+      </w:r>
+      <w:r>
+        <w:t xml:space="preserve">). Les arbres de décision s’appuient sur un ensemble diversifié de ~200 mots avec un poids significatif.</w:t>
+      </w:r>
+    </w:p>
+    <w:bookmarkEnd w:id="36"/>
+    <w:bookmarkStart w:id="39" w:name="Xfbbae51d2d6eed94ef05285149ab81c8c6e2556"/>
+    <w:p>
+      <w:pPr>
+        <w:pStyle w:val="Heading2"/>
+      </w:pPr>
+      <w:r>
+        <w:t xml:space="preserve">Grid Search — Optimisation des hyperparamètres</w:t>
       </w:r>
     </w:p>
     <w:p>
@@ -1457,7 +1962,7 @@
         <w:pStyle w:val="FirstParagraph"/>
       </w:pPr>
       <w:r>
-        <w:t xml:space="preserve">La séparation train/test a été faite en</w:t>
+        <w:t xml:space="preserve">Une recherche systématique par</w:t>
       </w:r>
       <w:r>
         <w:t xml:space="preserve"> </w:t>
@@ -1467,46 +1972,508 @@
           <w:b/>
           <w:bCs/>
         </w:rPr>
-        <w:t xml:space="preserve">80/20 avec stratification</w:t>
-      </w:r>
-      <w:r>
-        <w:t xml:space="preserve"> </w:t>
-      </w:r>
-      <w:r>
-        <w:t xml:space="preserve">pour préserver la distribution des classes. Une validation croisée</w:t>
-      </w:r>
-      <w:r>
-        <w:t xml:space="preserve"> </w:t>
-      </w:r>
-      <w:r>
-        <w:rPr>
-          <w:b/>
-          <w:bCs/>
-        </w:rPr>
-        <w:t xml:space="preserve">5-fold</w:t>
-      </w:r>
-      <w:r>
-        <w:t xml:space="preserve"> </w:t>
-      </w:r>
-      <w:r>
-        <w:t xml:space="preserve">a été appliquée pour évaluer la stabilité des modèles (résultats dans</w:t>
-      </w:r>
-      <w:r>
-        <w:t xml:space="preserve"> </w:t>
-      </w:r>
-      <w:r>
-        <w:rPr>
-          <w:rStyle w:val="VerbatimChar"/>
-        </w:rPr>
-        <w:t xml:space="preserve">notebooks/02_modeling.ipynb</w:t>
-      </w:r>
-      <w:r>
-        <w:t xml:space="preserve">).</w:t>
-      </w:r>
-    </w:p>
-    <w:bookmarkEnd w:id="28"/>
-    <w:bookmarkEnd w:id="29"/>
-    <w:bookmarkStart w:id="33" w:name="pipeline-dvc"/>
+        <w:t xml:space="preserve">Grid Search</w:t>
+      </w:r>
+      <w:r>
+        <w:t xml:space="preserve"> </w:t>
+      </w:r>
+      <w:r>
+        <w:t xml:space="preserve">avec validation croisée a été menée :</w:t>
+      </w:r>
+    </w:p>
+    <w:bookmarkStart w:id="37" w:name="régression-logistique-1"/>
+    <w:p>
+      <w:pPr>
+        <w:pStyle w:val="Heading3"/>
+      </w:pPr>
+      <w:r>
+        <w:t xml:space="preserve">Régression Logistique</w:t>
+      </w:r>
+    </w:p>
+    <w:tbl>
+      <w:tblPr>
+        <w:tblStyle w:val="Table"/>
+        <w:tblW w:type="auto" w:w="0"/>
+        <w:tblLook w:firstRow="1" w:lastRow="0" w:firstColumn="0" w:lastColumn="0" w:noHBand="0" w:noVBand="0" w:val="0020"/>
+      </w:tblPr>
+      <w:tblGrid>
+        <w:gridCol w:w="3960"/>
+        <w:gridCol w:w="3960"/>
+      </w:tblGrid>
+      <w:tr>
+        <w:trPr>
+          <w:tblHeader w:val="on"/>
+        </w:trPr>
+        <w:tc>
+          <w:tcPr/>
+          <w:p>
+            <w:pPr>
+              <w:pStyle w:val="Compact"/>
+            </w:pPr>
+            <w:r>
+              <w:t xml:space="preserve">C</w:t>
+            </w:r>
+          </w:p>
+        </w:tc>
+        <w:tc>
+          <w:tcPr/>
+          <w:p>
+            <w:pPr>
+              <w:pStyle w:val="Compact"/>
+            </w:pPr>
+            <w:r>
+              <w:t xml:space="preserve">CV F1 moyen</w:t>
+            </w:r>
+          </w:p>
+        </w:tc>
+      </w:tr>
+      <w:tr>
+        <w:tc>
+          <w:tcPr/>
+          <w:p>
+            <w:pPr>
+              <w:pStyle w:val="Compact"/>
+            </w:pPr>
+            <w:r>
+              <w:t xml:space="preserve">0.01</w:t>
+            </w:r>
+          </w:p>
+        </w:tc>
+        <w:tc>
+          <w:tcPr/>
+          <w:p>
+            <w:pPr>
+              <w:pStyle w:val="Compact"/>
+            </w:pPr>
+            <w:r>
+              <w:t xml:space="preserve">97.85%</w:t>
+            </w:r>
+          </w:p>
+        </w:tc>
+      </w:tr>
+      <w:tr>
+        <w:tc>
+          <w:tcPr/>
+          <w:p>
+            <w:pPr>
+              <w:pStyle w:val="Compact"/>
+            </w:pPr>
+            <w:r>
+              <w:rPr>
+                <w:b/>
+                <w:bCs/>
+              </w:rPr>
+              <w:t xml:space="preserve">0.1</w:t>
+            </w:r>
+          </w:p>
+        </w:tc>
+        <w:tc>
+          <w:tcPr/>
+          <w:p>
+            <w:pPr>
+              <w:pStyle w:val="Compact"/>
+            </w:pPr>
+            <w:r>
+              <w:rPr>
+                <w:b/>
+                <w:bCs/>
+              </w:rPr>
+              <w:t xml:space="preserve">98.31%</w:t>
+            </w:r>
+          </w:p>
+        </w:tc>
+      </w:tr>
+      <w:tr>
+        <w:tc>
+          <w:tcPr/>
+          <w:p>
+            <w:pPr>
+              <w:pStyle w:val="Compact"/>
+            </w:pPr>
+            <w:r>
+              <w:t xml:space="preserve">1</w:t>
+            </w:r>
+          </w:p>
+        </w:tc>
+        <w:tc>
+          <w:tcPr/>
+          <w:p>
+            <w:pPr>
+              <w:pStyle w:val="Compact"/>
+            </w:pPr>
+            <w:r>
+              <w:t xml:space="preserve">98.30%</w:t>
+            </w:r>
+          </w:p>
+        </w:tc>
+      </w:tr>
+      <w:tr>
+        <w:tc>
+          <w:tcPr/>
+          <w:p>
+            <w:pPr>
+              <w:pStyle w:val="Compact"/>
+            </w:pPr>
+            <w:r>
+              <w:t xml:space="preserve">10</w:t>
+            </w:r>
+          </w:p>
+        </w:tc>
+        <w:tc>
+          <w:tcPr/>
+          <w:p>
+            <w:pPr>
+              <w:pStyle w:val="Compact"/>
+            </w:pPr>
+            <w:r>
+              <w:t xml:space="preserve">98.30%</w:t>
+            </w:r>
+          </w:p>
+        </w:tc>
+      </w:tr>
+      <w:tr>
+        <w:tc>
+          <w:tcPr/>
+          <w:p>
+            <w:pPr>
+              <w:pStyle w:val="Compact"/>
+            </w:pPr>
+            <w:r>
+              <w:t xml:space="preserve">100</w:t>
+            </w:r>
+          </w:p>
+        </w:tc>
+        <w:tc>
+          <w:tcPr/>
+          <w:p>
+            <w:pPr>
+              <w:pStyle w:val="Compact"/>
+            </w:pPr>
+            <w:r>
+              <w:t xml:space="preserve">98.30%</w:t>
+            </w:r>
+          </w:p>
+        </w:tc>
+      </w:tr>
+    </w:tbl>
+    <w:p>
+      <w:pPr>
+        <w:pStyle w:val="BodyText"/>
+      </w:pPr>
+      <w:r>
+        <w:t xml:space="preserve">Meilleur paramètre :</w:t>
+      </w:r>
+      <w:r>
+        <w:t xml:space="preserve"> </w:t>
+      </w:r>
+      <w:r>
+        <w:rPr>
+          <w:rStyle w:val="VerbatimChar"/>
+        </w:rPr>
+        <w:t xml:space="preserve">C=0.1</w:t>
+      </w:r>
+      <w:r>
+        <w:t xml:space="preserve"> </w:t>
+      </w:r>
+      <w:r>
+        <w:t xml:space="preserve">(régularisation L2 modérée). Les valeurs supérieures à 0.1 ne changent quasiment pas le score, indiquant que le modèle a convergé.</w:t>
+      </w:r>
+    </w:p>
+    <w:bookmarkEnd w:id="37"/>
+    <w:bookmarkStart w:id="38" w:name="random-forest-1"/>
+    <w:p>
+      <w:pPr>
+        <w:pStyle w:val="Heading3"/>
+      </w:pPr>
+      <w:r>
+        <w:t xml:space="preserve">Random Forest</w:t>
+      </w:r>
+    </w:p>
+    <w:tbl>
+      <w:tblPr>
+        <w:tblStyle w:val="Table"/>
+        <w:tblW w:type="auto" w:w="0"/>
+        <w:tblLook w:firstRow="1" w:lastRow="0" w:firstColumn="0" w:lastColumn="0" w:noHBand="0" w:noVBand="0" w:val="0020"/>
+      </w:tblPr>
+      <w:tblGrid>
+        <w:gridCol w:w="2640"/>
+        <w:gridCol w:w="2640"/>
+        <w:gridCol w:w="2640"/>
+      </w:tblGrid>
+      <w:tr>
+        <w:trPr>
+          <w:tblHeader w:val="on"/>
+        </w:trPr>
+        <w:tc>
+          <w:tcPr/>
+          <w:p>
+            <w:pPr>
+              <w:pStyle w:val="Compact"/>
+            </w:pPr>
+            <w:r>
+              <w:t xml:space="preserve">n_estimators</w:t>
+            </w:r>
+          </w:p>
+        </w:tc>
+        <w:tc>
+          <w:tcPr/>
+          <w:p>
+            <w:pPr>
+              <w:pStyle w:val="Compact"/>
+            </w:pPr>
+            <w:r>
+              <w:t xml:space="preserve">max_depth</w:t>
+            </w:r>
+          </w:p>
+        </w:tc>
+        <w:tc>
+          <w:tcPr/>
+          <w:p>
+            <w:pPr>
+              <w:pStyle w:val="Compact"/>
+            </w:pPr>
+            <w:r>
+              <w:t xml:space="preserve">CV F1 moyen</w:t>
+            </w:r>
+          </w:p>
+        </w:tc>
+      </w:tr>
+      <w:tr>
+        <w:tc>
+          <w:tcPr/>
+          <w:p>
+            <w:pPr>
+              <w:pStyle w:val="Compact"/>
+            </w:pPr>
+            <w:r>
+              <w:t xml:space="preserve">50</w:t>
+            </w:r>
+          </w:p>
+        </w:tc>
+        <w:tc>
+          <w:tcPr/>
+          <w:p>
+            <w:pPr>
+              <w:pStyle w:val="Compact"/>
+            </w:pPr>
+            <w:r>
+              <w:t xml:space="preserve">None</w:t>
+            </w:r>
+          </w:p>
+        </w:tc>
+        <w:tc>
+          <w:tcPr/>
+          <w:p>
+            <w:pPr>
+              <w:pStyle w:val="Compact"/>
+            </w:pPr>
+            <w:r>
+              <w:t xml:space="preserve">98.44%</w:t>
+            </w:r>
+          </w:p>
+        </w:tc>
+      </w:tr>
+      <w:tr>
+        <w:tc>
+          <w:tcPr/>
+          <w:p>
+            <w:pPr>
+              <w:pStyle w:val="Compact"/>
+            </w:pPr>
+            <w:r>
+              <w:t xml:space="preserve">100</w:t>
+            </w:r>
+          </w:p>
+        </w:tc>
+        <w:tc>
+          <w:tcPr/>
+          <w:p>
+            <w:pPr>
+              <w:pStyle w:val="Compact"/>
+            </w:pPr>
+            <w:r>
+              <w:t xml:space="preserve">None</w:t>
+            </w:r>
+          </w:p>
+        </w:tc>
+        <w:tc>
+          <w:tcPr/>
+          <w:p>
+            <w:pPr>
+              <w:pStyle w:val="Compact"/>
+            </w:pPr>
+            <w:r>
+              <w:t xml:space="preserve">98.48%</w:t>
+            </w:r>
+          </w:p>
+        </w:tc>
+      </w:tr>
+      <w:tr>
+        <w:tc>
+          <w:tcPr/>
+          <w:p>
+            <w:pPr>
+              <w:pStyle w:val="Compact"/>
+            </w:pPr>
+            <w:r>
+              <w:rPr>
+                <w:b/>
+                <w:bCs/>
+              </w:rPr>
+              <w:t xml:space="preserve">200</w:t>
+            </w:r>
+          </w:p>
+        </w:tc>
+        <w:tc>
+          <w:tcPr/>
+          <w:p>
+            <w:pPr>
+              <w:pStyle w:val="Compact"/>
+            </w:pPr>
+            <w:r>
+              <w:rPr>
+                <w:b/>
+                <w:bCs/>
+              </w:rPr>
+              <w:t xml:space="preserve">None</w:t>
+            </w:r>
+          </w:p>
+        </w:tc>
+        <w:tc>
+          <w:tcPr/>
+          <w:p>
+            <w:pPr>
+              <w:pStyle w:val="Compact"/>
+            </w:pPr>
+            <w:r>
+              <w:rPr>
+                <w:b/>
+                <w:bCs/>
+              </w:rPr>
+              <w:t xml:space="preserve">98.52%</w:t>
+            </w:r>
+          </w:p>
+        </w:tc>
+      </w:tr>
+      <w:tr>
+        <w:tc>
+          <w:tcPr/>
+          <w:p>
+            <w:pPr>
+              <w:pStyle w:val="Compact"/>
+            </w:pPr>
+            <w:r>
+              <w:t xml:space="preserve">200</w:t>
+            </w:r>
+          </w:p>
+        </w:tc>
+        <w:tc>
+          <w:tcPr/>
+          <w:p>
+            <w:pPr>
+              <w:pStyle w:val="Compact"/>
+            </w:pPr>
+            <w:r>
+              <w:t xml:space="preserve">20</w:t>
+            </w:r>
+          </w:p>
+        </w:tc>
+        <w:tc>
+          <w:tcPr/>
+          <w:p>
+            <w:pPr>
+              <w:pStyle w:val="Compact"/>
+            </w:pPr>
+            <w:r>
+              <w:t xml:space="preserve">98.47%</w:t>
+            </w:r>
+          </w:p>
+        </w:tc>
+      </w:tr>
+      <w:tr>
+        <w:tc>
+          <w:tcPr/>
+          <w:p>
+            <w:pPr>
+              <w:pStyle w:val="Compact"/>
+            </w:pPr>
+            <w:r>
+              <w:t xml:space="preserve">200</w:t>
+            </w:r>
+          </w:p>
+        </w:tc>
+        <w:tc>
+          <w:tcPr/>
+          <w:p>
+            <w:pPr>
+              <w:pStyle w:val="Compact"/>
+            </w:pPr>
+            <w:r>
+              <w:t xml:space="preserve">10</w:t>
+            </w:r>
+          </w:p>
+        </w:tc>
+        <w:tc>
+          <w:tcPr/>
+          <w:p>
+            <w:pPr>
+              <w:pStyle w:val="Compact"/>
+            </w:pPr>
+            <w:r>
+              <w:t xml:space="preserve">98.30%</w:t>
+            </w:r>
+          </w:p>
+        </w:tc>
+      </w:tr>
+    </w:tbl>
+    <w:p>
+      <w:pPr>
+        <w:pStyle w:val="BodyText"/>
+      </w:pPr>
+      <w:r>
+        <w:t xml:space="preserve">Meilleurs paramètres :</w:t>
+      </w:r>
+      <w:r>
+        <w:t xml:space="preserve"> </w:t>
+      </w:r>
+      <w:r>
+        <w:rPr>
+          <w:rStyle w:val="VerbatimChar"/>
+        </w:rPr>
+        <w:t xml:space="preserve">n_estimators=200</w:t>
+      </w:r>
+      <w:r>
+        <w:t xml:space="preserve">,</w:t>
+      </w:r>
+      <w:r>
+        <w:t xml:space="preserve"> </w:t>
+      </w:r>
+      <w:r>
+        <w:rPr>
+          <w:rStyle w:val="VerbatimChar"/>
+        </w:rPr>
+        <w:t xml:space="preserve">max_depth=None</w:t>
+      </w:r>
+      <w:r>
+        <w:t xml:space="preserve"> </w:t>
+      </w:r>
+      <w:r>
+        <w:t xml:space="preserve">(arbres non limités en profondeur). L’augmentation du nombre d’arbres améliore marginalement le score. La limitation de profondeur (</w:t>
+      </w:r>
+      <w:r>
+        <w:rPr>
+          <w:rStyle w:val="VerbatimChar"/>
+        </w:rPr>
+        <w:t xml:space="preserve">max_depth=10</w:t>
+      </w:r>
+      <w:r>
+        <w:t xml:space="preserve">) coûte ~0.22% de F1.</w:t>
+      </w:r>
+    </w:p>
+    <w:bookmarkEnd w:id="38"/>
+    <w:bookmarkEnd w:id="39"/>
+    <w:bookmarkEnd w:id="40"/>
+    <w:bookmarkStart w:id="44" w:name="pipeline-dvc"/>
     <w:p>
       <w:pPr>
         <w:pStyle w:val="Heading1"/>
@@ -1650,7 +2617,7 @@
         <w:t xml:space="preserve">(téléchargement interactif depuis Google Drive).</w:t>
       </w:r>
     </w:p>
-    <w:bookmarkStart w:id="30" w:name="commandes-essentielles-dvc"/>
+    <w:bookmarkStart w:id="41" w:name="commandes-essentielles-dvc"/>
     <w:p>
       <w:pPr>
         <w:pStyle w:val="Heading3"/>
@@ -1706,8 +2673,8 @@
         <w:t xml:space="preserve">uv run dvc push           # Pousser vers le cache distant</w:t>
       </w:r>
     </w:p>
-    <w:bookmarkEnd w:id="30"/>
-    <w:bookmarkStart w:id="31" w:name="reproduction-intégrale-core-bonus"/>
+    <w:bookmarkEnd w:id="41"/>
+    <w:bookmarkStart w:id="42" w:name="reproduction-intégrale-core-bonus"/>
     <w:p>
       <w:pPr>
         <w:pStyle w:val="Heading3"/>
@@ -1838,8 +2805,8 @@
         <w:t xml:space="preserve"># Créer un Space sur huggingface.co/new-space, lier ce dépôt</w:t>
       </w:r>
     </w:p>
-    <w:bookmarkEnd w:id="31"/>
-    <w:bookmarkStart w:id="32" w:name="X5fa5a55a40d1cda33634e6ef1b54b5dd444a5a1"/>
+    <w:bookmarkEnd w:id="42"/>
+    <w:bookmarkStart w:id="43" w:name="X5fa5a55a40d1cda33634e6ef1b54b5dd444a5a1"/>
     <w:p>
       <w:pPr>
         <w:pStyle w:val="Heading3"/>
@@ -1913,9 +2880,9 @@
         <w:t xml:space="preserve">uv run streamlit run src/deploy/streamlit_app.py   # Interface</w:t>
       </w:r>
     </w:p>
-    <w:bookmarkEnd w:id="32"/>
-    <w:bookmarkEnd w:id="33"/>
-    <w:bookmarkStart w:id="34" w:name="optimisation"/>
+    <w:bookmarkEnd w:id="43"/>
+    <w:bookmarkEnd w:id="44"/>
+    <w:bookmarkStart w:id="45" w:name="optimisation"/>
     <w:p>
       <w:pPr>
         <w:pStyle w:val="Heading1"/>
@@ -2041,8 +3008,8 @@
         <w:t xml:space="preserve">.</w:t>
       </w:r>
     </w:p>
-    <w:bookmarkEnd w:id="34"/>
-    <w:bookmarkStart w:id="53" w:name="déploiement"/>
+    <w:bookmarkEnd w:id="45"/>
+    <w:bookmarkStart w:id="64" w:name="déploiement"/>
     <w:p>
       <w:pPr>
         <w:pStyle w:val="Heading1"/>
@@ -2091,7 +3058,7 @@
         <w:t xml:space="preserve">avec une interface interactive :</w:t>
       </w:r>
     </w:p>
-    <w:bookmarkStart w:id="41" w:name="prediction"/>
+    <w:bookmarkStart w:id="52" w:name="prediction"/>
     <w:p>
       <w:pPr>
         <w:pStyle w:val="Heading3"/>
@@ -2133,18 +3100,18 @@
           <wp:inline>
             <wp:extent cx="5334000" cy="3750468"/>
             <wp:effectExtent b="0" l="0" r="0" t="0"/>
-            <wp:docPr descr="Interface Streamlit" title="" id="36" name="Picture"/>
+            <wp:docPr descr="Interface Streamlit" title="" id="47" name="Picture"/>
             <a:graphic>
               <a:graphicData uri="http://schemas.openxmlformats.org/drawingml/2006/picture">
                 <pic:pic>
                   <pic:nvPicPr>
-                    <pic:cNvPr descr="figures/streamlit_app.png" id="37" name="Picture"/>
+                    <pic:cNvPr descr="figures/streamlit_app.png" id="48" name="Picture"/>
                     <pic:cNvPicPr>
                       <a:picLocks noChangeArrowheads="1" noChangeAspect="1"/>
                     </pic:cNvPicPr>
                   </pic:nvPicPr>
                   <pic:blipFill>
-                    <a:blip r:embed="rId35"/>
+                    <a:blip r:embed="rId46"/>
                     <a:stretch>
                       <a:fillRect/>
                     </a:stretch>
@@ -2178,18 +3145,18 @@
           <wp:inline>
             <wp:extent cx="5334000" cy="3750468"/>
             <wp:effectExtent b="0" l="0" r="0" t="0"/>
-            <wp:docPr descr="Prédiction Streamlit" title="" id="39" name="Picture"/>
+            <wp:docPr descr="Prédiction Streamlit" title="" id="50" name="Picture"/>
             <a:graphic>
               <a:graphicData uri="http://schemas.openxmlformats.org/drawingml/2006/picture">
                 <pic:pic>
                   <pic:nvPicPr>
-                    <pic:cNvPr descr="figures/streamlit_prediction.png" id="40" name="Picture"/>
+                    <pic:cNvPr descr="figures/streamlit_prediction.png" id="51" name="Picture"/>
                     <pic:cNvPicPr>
                       <a:picLocks noChangeArrowheads="1" noChangeAspect="1"/>
                     </pic:cNvPicPr>
                   </pic:nvPicPr>
                   <pic:blipFill>
-                    <a:blip r:embed="rId38"/>
+                    <a:blip r:embed="rId49"/>
                     <a:stretch>
                       <a:fillRect/>
                     </a:stretch>
@@ -2216,8 +3183,8 @@
         </w:drawing>
       </w:r>
     </w:p>
-    <w:bookmarkEnd w:id="41"/>
-    <w:bookmarkStart w:id="45" w:name="tableau-de-bord-dynamique"/>
+    <w:bookmarkEnd w:id="52"/>
+    <w:bookmarkStart w:id="56" w:name="tableau-de-bord-dynamique"/>
     <w:p>
       <w:pPr>
         <w:pStyle w:val="Heading3"/>
@@ -2305,18 +3272,18 @@
           <wp:inline>
             <wp:extent cx="5334000" cy="3750468"/>
             <wp:effectExtent b="0" l="0" r="0" t="0"/>
-            <wp:docPr descr="Tableau de bord dynamique" title="" id="43" name="Picture"/>
+            <wp:docPr descr="Tableau de bord dynamique" title="" id="54" name="Picture"/>
             <a:graphic>
               <a:graphicData uri="http://schemas.openxmlformats.org/drawingml/2006/picture">
                 <pic:pic>
                   <pic:nvPicPr>
-                    <pic:cNvPr descr="figures/streamlit_dashboard.png" id="44" name="Picture"/>
+                    <pic:cNvPr descr="figures/streamlit_dashboard.png" id="55" name="Picture"/>
                     <pic:cNvPicPr>
                       <a:picLocks noChangeArrowheads="1" noChangeAspect="1"/>
                     </pic:cNvPicPr>
                   </pic:nvPicPr>
                   <pic:blipFill>
-                    <a:blip r:embed="rId42"/>
+                    <a:blip r:embed="rId53"/>
                     <a:stretch>
                       <a:fillRect/>
                     </a:stretch>
@@ -2351,8 +3318,8 @@
         <w:t xml:space="preserve">Tableau de bord dynamique</w:t>
       </w:r>
     </w:p>
-    <w:bookmarkEnd w:id="45"/>
-    <w:bookmarkStart w:id="46" w:name="mlflow"/>
+    <w:bookmarkEnd w:id="56"/>
+    <w:bookmarkStart w:id="57" w:name="mlflow"/>
     <w:p>
       <w:pPr>
         <w:pStyle w:val="Heading3"/>
@@ -2418,8 +3385,8 @@
         <w:t xml:space="preserve">- Rappel des commandes essentielles</w:t>
       </w:r>
     </w:p>
-    <w:bookmarkEnd w:id="46"/>
-    <w:bookmarkStart w:id="50" w:name="historique"/>
+    <w:bookmarkEnd w:id="57"/>
+    <w:bookmarkStart w:id="61" w:name="historique"/>
     <w:p>
       <w:pPr>
         <w:pStyle w:val="Heading3"/>
@@ -2445,18 +3412,18 @@
           <wp:inline>
             <wp:extent cx="5334000" cy="3750468"/>
             <wp:effectExtent b="0" l="0" r="0" t="0"/>
-            <wp:docPr descr="Historique des analyses" title="" id="48" name="Picture"/>
+            <wp:docPr descr="Historique des analyses" title="" id="59" name="Picture"/>
             <a:graphic>
               <a:graphicData uri="http://schemas.openxmlformats.org/drawingml/2006/picture">
                 <pic:pic>
                   <pic:nvPicPr>
-                    <pic:cNvPr descr="figures/streamlit_history.png" id="49" name="Picture"/>
+                    <pic:cNvPr descr="figures/streamlit_history.png" id="60" name="Picture"/>
                     <pic:cNvPicPr>
                       <a:picLocks noChangeArrowheads="1" noChangeAspect="1"/>
                     </pic:cNvPicPr>
                   </pic:nvPicPr>
                   <pic:blipFill>
-                    <a:blip r:embed="rId47"/>
+                    <a:blip r:embed="rId58"/>
                     <a:stretch>
                       <a:fillRect/>
                     </a:stretch>
@@ -2491,8 +3458,8 @@
         <w:t xml:space="preserve">Historique des analyses</w:t>
       </w:r>
     </w:p>
-    <w:bookmarkEnd w:id="50"/>
-    <w:bookmarkStart w:id="51" w:name="commande-de-lancement"/>
+    <w:bookmarkEnd w:id="61"/>
+    <w:bookmarkStart w:id="62" w:name="commande-de-lancement"/>
     <w:p>
       <w:pPr>
         <w:pStyle w:val="Heading3"/>
@@ -2512,8 +3479,8 @@
         <w:t xml:space="preserve">uv run streamlit run src/deploy/streamlit_app.py</w:t>
       </w:r>
     </w:p>
-    <w:bookmarkEnd w:id="51"/>
-    <w:bookmarkStart w:id="52" w:name="api-fastapi"/>
+    <w:bookmarkEnd w:id="62"/>
+    <w:bookmarkStart w:id="63" w:name="api-fastapi"/>
     <w:p>
       <w:pPr>
         <w:pStyle w:val="Heading3"/>
@@ -2541,128 +3508,149 @@
         <w:t xml:space="preserve">uv run uvicorn src.deploy.api:app --reload</w:t>
       </w:r>
     </w:p>
-    <w:bookmarkEnd w:id="52"/>
-    <w:bookmarkEnd w:id="53"/>
-    <w:bookmarkStart w:id="63" w:name="discussion"/>
+    <w:bookmarkEnd w:id="63"/>
+    <w:bookmarkEnd w:id="64"/>
+    <w:bookmarkStart w:id="80" w:name="analyse-approfondie-et-leçons-apprises"/>
     <w:p>
       <w:pPr>
         <w:pStyle w:val="Heading1"/>
       </w:pPr>
       <w:r>
-        <w:t xml:space="preserve">Discussion</w:t>
-      </w:r>
-    </w:p>
-    <w:bookmarkStart w:id="54" w:name="limites"/>
+        <w:t xml:space="preserve">Analyse approfondie et leçons apprises</w:t>
+      </w:r>
+    </w:p>
+    <w:bookmarkStart w:id="67" w:name="comparaison-des-modèles-classiques"/>
     <w:p>
       <w:pPr>
         <w:pStyle w:val="Heading2"/>
       </w:pPr>
       <w:r>
-        <w:t xml:space="preserve">Limites</w:t>
-      </w:r>
-    </w:p>
-    <w:p>
-      <w:pPr>
-        <w:pStyle w:val="Compact"/>
-        <w:numPr>
-          <w:ilvl w:val="0"/>
-          <w:numId w:val="1006"/>
-        </w:numPr>
-      </w:pPr>
-      <w:r>
-        <w:t xml:space="preserve">La représentation TF-IDF ne capture pas le contexte sémantique</w:t>
-      </w:r>
-    </w:p>
-    <w:p>
-      <w:pPr>
-        <w:pStyle w:val="Compact"/>
-        <w:numPr>
-          <w:ilvl w:val="0"/>
-          <w:numId w:val="1006"/>
-        </w:numPr>
-      </w:pPr>
-      <w:r>
-        <w:t xml:space="preserve">Le dataset d’entraînement ne contient pas de tweets de harcèlement ou de discours haineux ; le modèle détecte principalement la négativité générale (plaintes, souffrance personnelle) et peut ne pas identifier correctement le racisme, les insultes ciblées ou les menaces. Un avertissement est affiché dans l’interface Streamlit pour informer l’utilisateur de cette limitation</w:t>
-      </w:r>
-    </w:p>
-    <w:p>
-      <w:pPr>
-        <w:pStyle w:val="Compact"/>
-        <w:numPr>
-          <w:ilvl w:val="0"/>
-          <w:numId w:val="1006"/>
-        </w:numPr>
-      </w:pPr>
-      <w:r>
-        <w:t xml:space="preserve">Les modèles n’ont pas été testés sur des données réelles en streaming</w:t>
-      </w:r>
-    </w:p>
-    <w:p>
-      <w:pPr>
-        <w:pStyle w:val="Compact"/>
-        <w:numPr>
-          <w:ilvl w:val="0"/>
-          <w:numId w:val="1006"/>
-        </w:numPr>
-      </w:pPr>
-      <w:r>
-        <w:t xml:space="preserve">Pas de détection multilingue (stop words english uniquement)</w:t>
-      </w:r>
-    </w:p>
-    <w:bookmarkEnd w:id="54"/>
-    <w:bookmarkStart w:id="55" w:name="difficultés-rencontrées"/>
+        <w:t xml:space="preserve">Comparaison des modèles classiques</w:t>
+      </w:r>
+    </w:p>
+    <w:bookmarkStart w:id="65" w:name="régression-logistique-vs-random-forest"/>
+    <w:p>
+      <w:pPr>
+        <w:pStyle w:val="Heading3"/>
+      </w:pPr>
+      <w:r>
+        <w:t xml:space="preserve">Régression Logistique vs Random Forest</w:t>
+      </w:r>
+    </w:p>
+    <w:p>
+      <w:pPr>
+        <w:pStyle w:val="FirstParagraph"/>
+      </w:pPr>
+      <w:r>
+        <w:t xml:space="preserve">Les deux modèles offrent des performances proches (98.36% vs 98.64%), mais le Random Forest l’emporte sur tous les métriques. La régression logistique offre l’avantage de la simplicité et de l’interprétabilité : ses coefficients s’analysent directement comme le poids de chaque mot dans la décision. Le Random Forest capture des interactions non linéaires et reste plus robuste au bruit, mais son importance des features est plus difficile à interpréter.</w:t>
+      </w:r>
+    </w:p>
+    <w:bookmarkEnd w:id="65"/>
+    <w:bookmarkStart w:id="66" w:name="limite-du-naive-bayes"/>
+    <w:p>
+      <w:pPr>
+        <w:pStyle w:val="Heading3"/>
+      </w:pPr>
+      <w:r>
+        <w:t xml:space="preserve">Limite du Naive Bayes</w:t>
+      </w:r>
+    </w:p>
+    <w:p>
+      <w:pPr>
+        <w:pStyle w:val="FirstParagraph"/>
+      </w:pPr>
+      <w:r>
+        <w:t xml:space="preserve">Le Naive Bayes affiche le Recall le plus élevé (99.95%) mais au prix d’une précision faible (92.57%). En pratique, il prédit très rarement la classe minoritaire (suspect), ce qui se traduit par un taux élevé de faux positifs. Ce comportement est typique de Naive Bayes sur des données déséquilibrées : l’hypothèse d’indépendance conditionnelle des features est violée par le langage naturel, ce qui biaise les probabilités prédites.</w:t>
+      </w:r>
+    </w:p>
+    <w:bookmarkEnd w:id="66"/>
+    <w:bookmarkEnd w:id="67"/>
+    <w:bookmarkStart w:id="70" w:name="apport-du-distilbert"/>
     <w:p>
       <w:pPr>
         <w:pStyle w:val="Heading2"/>
       </w:pPr>
       <w:r>
-        <w:t xml:space="preserve">Difficultés rencontrées</w:t>
-      </w:r>
-    </w:p>
-    <w:p>
-      <w:pPr>
-        <w:pStyle w:val="Compact"/>
-        <w:numPr>
-          <w:ilvl w:val="0"/>
-          <w:numId w:val="1007"/>
-        </w:numPr>
-      </w:pPr>
-      <w:r>
-        <w:t xml:space="preserve">Gestion des valeurs manquantes dans les tweets</w:t>
-      </w:r>
-    </w:p>
-    <w:p>
-      <w:pPr>
-        <w:pStyle w:val="Compact"/>
-        <w:numPr>
-          <w:ilvl w:val="0"/>
-          <w:numId w:val="1007"/>
-        </w:numPr>
-      </w:pPr>
-      <w:r>
-        <w:t xml:space="preserve">Déséquilibre des classes nécessitant des stratégies d’adaptation</w:t>
-      </w:r>
-    </w:p>
-    <w:p>
-      <w:pPr>
-        <w:pStyle w:val="Compact"/>
-        <w:numPr>
-          <w:ilvl w:val="0"/>
-          <w:numId w:val="1007"/>
-        </w:numPr>
-      </w:pPr>
-      <w:r>
-        <w:t xml:space="preserve">Mise en place du pipeline DVC avec téléchargement depuis Google Drive</w:t>
-      </w:r>
-    </w:p>
-    <w:bookmarkEnd w:id="55"/>
-    <w:bookmarkStart w:id="61" w:name="travail-realise-bonus"/>
+        <w:t xml:space="preserve">Apport du DistilBERT</w:t>
+      </w:r>
+    </w:p>
+    <w:bookmarkStart w:id="68" w:name="Xfc7a074e08c37a3977842e4b6eeda6b4b1d9c5d"/>
+    <w:p>
+      <w:pPr>
+        <w:pStyle w:val="Heading3"/>
+      </w:pPr>
+      <w:r>
+        <w:t xml:space="preserve">Pourquoi BERT surpasse les approches classiques</w:t>
+      </w:r>
+    </w:p>
+    <w:p>
+      <w:pPr>
+        <w:pStyle w:val="FirstParagraph"/>
+      </w:pPr>
+      <w:r>
+        <w:t xml:space="preserve">Les modèles TF-IDF traitent chaque mot indépendamment et ignorent l’ordre et le contexte. DistilBERT utilise l’attention pour capturer les relations entre les mots d’une phrase. Par exemple,</w:t>
+      </w:r>
+      <w:r>
+        <w:t xml:space="preserve"> </w:t>
+      </w:r>
+      <w:r>
+        <w:t xml:space="preserve">“je ne suis pas heureux”</w:t>
+      </w:r>
+      <w:r>
+        <w:t xml:space="preserve"> </w:t>
+      </w:r>
+      <w:r>
+        <w:t xml:space="preserve">serait mal représenté par TF-IDF (mots positifs</w:t>
+      </w:r>
+      <w:r>
+        <w:t xml:space="preserve"> </w:t>
+      </w:r>
+      <w:r>
+        <w:t xml:space="preserve">“heureux”</w:t>
+      </w:r>
+      <w:r>
+        <w:t xml:space="preserve"> </w:t>
+      </w:r>
+      <w:r>
+        <w:t xml:space="preserve">pondérés), alors que BERT comprend la négation.</w:t>
+      </w:r>
+    </w:p>
+    <w:bookmarkEnd w:id="68"/>
+    <w:bookmarkStart w:id="69" w:name="compromis-performance-vs-coût"/>
+    <w:p>
+      <w:pPr>
+        <w:pStyle w:val="Heading3"/>
+      </w:pPr>
+      <w:r>
+        <w:t xml:space="preserve">Compromis : performance vs coût</w:t>
+      </w:r>
+    </w:p>
+    <w:p>
+      <w:pPr>
+        <w:pStyle w:val="FirstParagraph"/>
+      </w:pPr>
+      <w:r>
+        <w:t xml:space="preserve">BERT (F1=99.02%) ne gagne que +0.38% par rapport au Random Forest (98.64%) sur ce dataset. Ce gain marginal peut ne pas justifier le coût d’entraînement (~6 min CPU par époque) et d’inférence (~10× plus lent) dans un environnement de production. BERT devient crucial si le dataset contient des nuances sémantiques fines (sarcasme, ironie).</w:t>
+      </w:r>
+    </w:p>
+    <w:bookmarkEnd w:id="69"/>
+    <w:bookmarkEnd w:id="70"/>
+    <w:bookmarkStart w:id="74" w:name="leçons-sur-le-pipeline-et-le-déploiement"/>
     <w:p>
       <w:pPr>
         <w:pStyle w:val="Heading2"/>
       </w:pPr>
       <w:r>
-        <w:t xml:space="preserve">Travail realise (Bonus)</w:t>
+        <w:t xml:space="preserve">Leçons sur le pipeline et le déploiement</w:t>
+      </w:r>
+    </w:p>
+    <w:bookmarkStart w:id="71" w:name="dvc-et-reproductibilité"/>
+    <w:p>
+      <w:pPr>
+        <w:pStyle w:val="Heading3"/>
+      </w:pPr>
+      <w:r>
+        <w:t xml:space="preserve">DVC et reproductibilité</w:t>
       </w:r>
     </w:p>
     <w:p>
@@ -2670,10 +3658,590 @@
         <w:pStyle w:val="FirstParagraph"/>
       </w:pPr>
       <w:r>
+        <w:t xml:space="preserve">DVC a démontré sa valeur : après chaque modification du preprocessing,</w:t>
+      </w:r>
+      <w:r>
+        <w:t xml:space="preserve"> </w:t>
+      </w:r>
+      <w:r>
+        <w:rPr>
+          <w:rStyle w:val="VerbatimChar"/>
+        </w:rPr>
+        <w:t xml:space="preserve">dvc repro</w:t>
+      </w:r>
+      <w:r>
+        <w:t xml:space="preserve"> </w:t>
+      </w:r>
+      <w:r>
+        <w:t xml:space="preserve">a recalculé automatiquement uniquement les étapes impactées. Le versionnement des données avec</w:t>
+      </w:r>
+      <w:r>
+        <w:t xml:space="preserve"> </w:t>
+      </w:r>
+      <w:r>
+        <w:rPr>
+          <w:rStyle w:val="VerbatimChar"/>
+        </w:rPr>
+        <w:t xml:space="preserve">dvc add</w:t>
+      </w:r>
+      <w:r>
+        <w:t xml:space="preserve"> </w:t>
+      </w:r>
+      <w:r>
+        <w:t xml:space="preserve">évite de stocker les fichiers volumineux dans Git tout en maintenant la traçabilité. L’intégration CI/CD sur GitHub Actions garantit que le pipeline reste fonctionnel après chaque modification.</w:t>
+      </w:r>
+    </w:p>
+    <w:bookmarkEnd w:id="71"/>
+    <w:bookmarkStart w:id="72" w:name="streamlit-pour-le-prototypage"/>
+    <w:p>
+      <w:pPr>
+        <w:pStyle w:val="Heading3"/>
+      </w:pPr>
+      <w:r>
+        <w:t xml:space="preserve">Streamlit pour le prototypage</w:t>
+      </w:r>
+    </w:p>
+    <w:p>
+      <w:pPr>
+        <w:pStyle w:val="FirstParagraph"/>
+      </w:pPr>
+      <w:r>
+        <w:t xml:space="preserve">Streamlit permet un déploiement rapide (~50 lignes pour un prototype fonctionnel, ~400 lignes pour l’application finale avec 4 onglets). La contrainte principale est l’ordre d’exécution :</w:t>
+      </w:r>
+      <w:r>
+        <w:t xml:space="preserve"> </w:t>
+      </w:r>
+      <w:r>
+        <w:rPr>
+          <w:rStyle w:val="VerbatimChar"/>
+        </w:rPr>
+        <w:t xml:space="preserve">st.set_page_config()</w:t>
+      </w:r>
+      <w:r>
+        <w:t xml:space="preserve"> </w:t>
+      </w:r>
+      <w:r>
+        <w:t xml:space="preserve">doit être le premier appel, ce qui a nécessité un chargement paresseux du modèle BERT.</w:t>
+      </w:r>
+    </w:p>
+    <w:bookmarkEnd w:id="72"/>
+    <w:bookmarkStart w:id="73" w:name="mlflow-pour-le-tracking"/>
+    <w:p>
+      <w:pPr>
+        <w:pStyle w:val="Heading3"/>
+      </w:pPr>
+      <w:r>
+        <w:t xml:space="preserve">MLflow pour le tracking</w:t>
+      </w:r>
+    </w:p>
+    <w:p>
+      <w:pPr>
+        <w:pStyle w:val="FirstParagraph"/>
+      </w:pPr>
+      <w:r>
+        <w:t xml:space="preserve">MLflow standardise le suivi des expérimentations et permet de comparer visuellement les runs. L’intégration dans Streamlit offre une interface unifiée sans quitter l’application.</w:t>
+      </w:r>
+    </w:p>
+    <w:bookmarkEnd w:id="73"/>
+    <w:bookmarkEnd w:id="74"/>
+    <w:bookmarkStart w:id="75" w:name="difficultés-rencontrées-et-solutions"/>
+    <w:p>
+      <w:pPr>
+        <w:pStyle w:val="Heading2"/>
+      </w:pPr>
+      <w:r>
+        <w:t xml:space="preserve">Difficultés rencontrées et solutions</w:t>
+      </w:r>
+    </w:p>
+    <w:tbl>
+      <w:tblPr>
+        <w:tblStyle w:val="Table"/>
+        <w:tblW w:type="pct" w:w="5000"/>
+        <w:tblLayout w:type="fixed"/>
+        <w:tblLook w:firstRow="1" w:lastRow="0" w:firstColumn="0" w:lastColumn="0" w:noHBand="0" w:noVBand="0" w:val="0020"/>
+      </w:tblPr>
+      <w:tblGrid>
+        <w:gridCol w:w="4148"/>
+        <w:gridCol w:w="3771"/>
+      </w:tblGrid>
+      <w:tr>
+        <w:trPr>
+          <w:tblHeader w:val="on"/>
+        </w:trPr>
+        <w:tc>
+          <w:tcPr/>
+          <w:p>
+            <w:pPr>
+              <w:pStyle w:val="Compact"/>
+            </w:pPr>
+            <w:r>
+              <w:t xml:space="preserve">Difficulté</w:t>
+            </w:r>
+          </w:p>
+        </w:tc>
+        <w:tc>
+          <w:tcPr/>
+          <w:p>
+            <w:pPr>
+              <w:pStyle w:val="Compact"/>
+            </w:pPr>
+            <w:r>
+              <w:t xml:space="preserve">Solution</w:t>
+            </w:r>
+          </w:p>
+        </w:tc>
+      </w:tr>
+      <w:tr>
+        <w:tc>
+          <w:tcPr/>
+          <w:p>
+            <w:pPr>
+              <w:pStyle w:val="Compact"/>
+            </w:pPr>
+            <w:r>
+              <w:t xml:space="preserve">Dataset vide après preprocessing (346 lignes)</w:t>
+            </w:r>
+          </w:p>
+        </w:tc>
+        <w:tc>
+          <w:tcPr/>
+          <w:p>
+            <w:pPr>
+              <w:pStyle w:val="Compact"/>
+            </w:pPr>
+            <w:r>
+              <w:t xml:space="preserve">Suppression silencieuse, pas d’impact sur la qualité</w:t>
+            </w:r>
+          </w:p>
+        </w:tc>
+      </w:tr>
+      <w:tr>
+        <w:tc>
+          <w:tcPr/>
+          <w:p>
+            <w:pPr>
+              <w:pStyle w:val="Compact"/>
+            </w:pPr>
+            <w:r>
+              <w:t xml:space="preserve">Déséquilibre des classes (10% suspect)</w:t>
+            </w:r>
+          </w:p>
+        </w:tc>
+        <w:tc>
+          <w:tcPr/>
+          <w:p>
+            <w:pPr>
+              <w:pStyle w:val="Compact"/>
+            </w:pPr>
+            <w:r>
+              <w:rPr>
+                <w:rStyle w:val="VerbatimChar"/>
+              </w:rPr>
+              <w:t xml:space="preserve">class_weight="balanced"</w:t>
+            </w:r>
+            <w:r>
+              <w:t xml:space="preserve"> </w:t>
+            </w:r>
+            <w:r>
+              <w:t xml:space="preserve">pour tous les modèles sklearn</w:t>
+            </w:r>
+          </w:p>
+        </w:tc>
+      </w:tr>
+      <w:tr>
+        <w:tc>
+          <w:tcPr/>
+          <w:p>
+            <w:pPr>
+              <w:pStyle w:val="Compact"/>
+            </w:pPr>
+            <w:r>
+              <w:rPr>
+                <w:rStyle w:val="VerbatimChar"/>
+              </w:rPr>
+              <w:t xml:space="preserve">protobuf</w:t>
+            </w:r>
+            <w:r>
+              <w:t xml:space="preserve"> </w:t>
+            </w:r>
+            <w:r>
+              <w:t xml:space="preserve">incompatible avec MLflow</w:t>
+            </w:r>
+          </w:p>
+        </w:tc>
+        <w:tc>
+          <w:tcPr/>
+          <w:p>
+            <w:pPr>
+              <w:pStyle w:val="Compact"/>
+            </w:pPr>
+            <w:r>
+              <w:t xml:space="preserve">Installation de</w:t>
+            </w:r>
+            <w:r>
+              <w:t xml:space="preserve"> </w:t>
+            </w:r>
+            <w:r>
+              <w:rPr>
+                <w:rStyle w:val="VerbatimChar"/>
+              </w:rPr>
+              <w:t xml:space="preserve">protobuf&lt;5</w:t>
+            </w:r>
+          </w:p>
+        </w:tc>
+      </w:tr>
+      <w:tr>
+        <w:tc>
+          <w:tcPr/>
+          <w:p>
+            <w:pPr>
+              <w:pStyle w:val="Compact"/>
+            </w:pPr>
+            <w:r>
+              <w:t xml:space="preserve">Import circulaire BERT/Streamlit</w:t>
+            </w:r>
+          </w:p>
+        </w:tc>
+        <w:tc>
+          <w:tcPr/>
+          <w:p>
+            <w:pPr>
+              <w:pStyle w:val="Compact"/>
+            </w:pPr>
+            <w:r>
+              <w:t xml:space="preserve">Chargement lazy après</w:t>
+            </w:r>
+            <w:r>
+              <w:t xml:space="preserve"> </w:t>
+            </w:r>
+            <w:r>
+              <w:rPr>
+                <w:rStyle w:val="VerbatimChar"/>
+              </w:rPr>
+              <w:t xml:space="preserve">set_page_config()</w:t>
+            </w:r>
+          </w:p>
+        </w:tc>
+      </w:tr>
+      <w:tr>
+        <w:tc>
+          <w:tcPr/>
+          <w:p>
+            <w:pPr>
+              <w:pStyle w:val="Compact"/>
+            </w:pPr>
+            <w:r>
+              <w:rPr>
+                <w:rStyle w:val="VerbatimChar"/>
+              </w:rPr>
+              <w:t xml:space="preserve">max_features</w:t>
+            </w:r>
+            <w:r>
+              <w:t xml:space="preserve"> </w:t>
+            </w:r>
+            <w:r>
+              <w:t xml:space="preserve">dupliqué dans MLflow</w:t>
+            </w:r>
+          </w:p>
+        </w:tc>
+        <w:tc>
+          <w:tcPr/>
+          <w:p>
+            <w:pPr>
+              <w:pStyle w:val="Compact"/>
+            </w:pPr>
+            <w:r>
+              <w:t xml:space="preserve">Suppression du</w:t>
+            </w:r>
+            <w:r>
+              <w:t xml:space="preserve"> </w:t>
+            </w:r>
+            <w:r>
+              <w:rPr>
+                <w:rStyle w:val="VerbatimChar"/>
+              </w:rPr>
+              <w:t xml:space="preserve">log_param</w:t>
+            </w:r>
+            <w:r>
+              <w:t xml:space="preserve"> </w:t>
+            </w:r>
+            <w:r>
+              <w:t xml:space="preserve">redondant</w:t>
+            </w:r>
+          </w:p>
+        </w:tc>
+      </w:tr>
+      <w:tr>
+        <w:tc>
+          <w:tcPr/>
+          <w:p>
+            <w:pPr>
+              <w:pStyle w:val="Compact"/>
+            </w:pPr>
+            <w:r>
+              <w:t xml:space="preserve">Warn dépréciation</w:t>
+            </w:r>
+            <w:r>
+              <w:t xml:space="preserve"> </w:t>
+            </w:r>
+            <w:r>
+              <w:rPr>
+                <w:rStyle w:val="VerbatimChar"/>
+              </w:rPr>
+              <w:t xml:space="preserve">use_container_width</w:t>
+            </w:r>
+          </w:p>
+        </w:tc>
+        <w:tc>
+          <w:tcPr/>
+          <w:p>
+            <w:pPr>
+              <w:pStyle w:val="Compact"/>
+            </w:pPr>
+            <w:r>
+              <w:t xml:space="preserve">Remplacement par</w:t>
+            </w:r>
+            <w:r>
+              <w:t xml:space="preserve"> </w:t>
+            </w:r>
+            <w:r>
+              <w:rPr>
+                <w:rStyle w:val="VerbatimChar"/>
+              </w:rPr>
+              <w:t xml:space="preserve">width="stretch"</w:t>
+            </w:r>
+          </w:p>
+        </w:tc>
+      </w:tr>
+      <w:tr>
+        <w:tc>
+          <w:tcPr/>
+          <w:p>
+            <w:pPr>
+              <w:pStyle w:val="Compact"/>
+            </w:pPr>
+            <w:r>
+              <w:rPr>
+                <w:rStyle w:val="VerbatimChar"/>
+              </w:rPr>
+              <w:t xml:space="preserve">dvc repro</w:t>
+            </w:r>
+            <w:r>
+              <w:t xml:space="preserve"> </w:t>
+            </w:r>
+            <w:r>
+              <w:t xml:space="preserve">échoue si</w:t>
+            </w:r>
+            <w:r>
+              <w:t xml:space="preserve"> </w:t>
+            </w:r>
+            <w:r>
+              <w:rPr>
+                <w:rStyle w:val="VerbatimChar"/>
+              </w:rPr>
+              <w:t xml:space="preserve">data/processed/</w:t>
+            </w:r>
+            <w:r>
+              <w:t xml:space="preserve"> </w:t>
+            </w:r>
+            <w:r>
+              <w:t xml:space="preserve">absent</w:t>
+            </w:r>
+          </w:p>
+        </w:tc>
+        <w:tc>
+          <w:tcPr/>
+          <w:p>
+            <w:pPr>
+              <w:pStyle w:val="Compact"/>
+            </w:pPr>
+            <w:r>
+              <w:t xml:space="preserve">Ajout de</w:t>
+            </w:r>
+            <w:r>
+              <w:t xml:space="preserve"> </w:t>
+            </w:r>
+            <w:r>
+              <w:rPr>
+                <w:rStyle w:val="VerbatimChar"/>
+              </w:rPr>
+              <w:t xml:space="preserve">os.makedirs</w:t>
+            </w:r>
+            <w:r>
+              <w:t xml:space="preserve"> </w:t>
+            </w:r>
+            <w:r>
+              <w:t xml:space="preserve">dans le preprocessing</w:t>
+            </w:r>
+          </w:p>
+        </w:tc>
+      </w:tr>
+    </w:tbl>
+    <w:bookmarkEnd w:id="75"/>
+    <w:bookmarkStart w:id="79" w:name="limites-et-biais"/>
+    <w:p>
+      <w:pPr>
+        <w:pStyle w:val="Heading2"/>
+      </w:pPr>
+      <w:r>
+        <w:t xml:space="preserve">Limites et biais</w:t>
+      </w:r>
+    </w:p>
+    <w:bookmarkStart w:id="76" w:name="biais-de-représentation"/>
+    <w:p>
+      <w:pPr>
+        <w:pStyle w:val="Heading3"/>
+      </w:pPr>
+      <w:r>
+        <w:t xml:space="preserve">Biais de représentation</w:t>
+      </w:r>
+    </w:p>
+    <w:p>
+      <w:pPr>
+        <w:pStyle w:val="FirstParagraph"/>
+      </w:pPr>
+      <w:r>
+        <w:t xml:space="preserve">Le dataset contient principalement des tweets en anglais sur des thématiques spécifiques (politique, COVID, religion). Les modèles apprennent à associer certains mots-clés (</w:t>
+      </w:r>
+      <w:r>
+        <w:rPr>
+          <w:rStyle w:val="VerbatimChar"/>
+        </w:rPr>
+        <w:t xml:space="preserve">hate</w:t>
+      </w:r>
+      <w:r>
+        <w:t xml:space="preserve">,</w:t>
+      </w:r>
+      <w:r>
+        <w:t xml:space="preserve"> </w:t>
+      </w:r>
+      <w:r>
+        <w:rPr>
+          <w:rStyle w:val="VerbatimChar"/>
+        </w:rPr>
+        <w:t xml:space="preserve">die</w:t>
+      </w:r>
+      <w:r>
+        <w:t xml:space="preserve">,</w:t>
+      </w:r>
+      <w:r>
+        <w:t xml:space="preserve"> </w:t>
+      </w:r>
+      <w:r>
+        <w:rPr>
+          <w:rStyle w:val="VerbatimChar"/>
+        </w:rPr>
+        <w:t xml:space="preserve">covid</w:t>
+      </w:r>
+      <w:r>
+        <w:t xml:space="preserve">) à la classe suspecte, mais peuvent ne pas généraliser à d’autres formes de discours problématique (racisme implicite, micro-agressions, cyberharcèlement).</w:t>
+      </w:r>
+    </w:p>
+    <w:bookmarkEnd w:id="76"/>
+    <w:bookmarkStart w:id="77" w:name="limite-de-la-tâche-de-classification"/>
+    <w:p>
+      <w:pPr>
+        <w:pStyle w:val="Heading3"/>
+      </w:pPr>
+      <w:r>
+        <w:t xml:space="preserve">Limite de la tâche de classification</w:t>
+      </w:r>
+    </w:p>
+    <w:p>
+      <w:pPr>
+        <w:pStyle w:val="FirstParagraph"/>
+      </w:pPr>
+      <w:r>
+        <w:t xml:space="preserve">Un tweet classé</w:t>
+      </w:r>
+      <w:r>
+        <w:t xml:space="preserve"> </w:t>
+      </w:r>
+      <w:r>
+        <w:t xml:space="preserve">“non suspect”</w:t>
+      </w:r>
+      <w:r>
+        <w:t xml:space="preserve"> </w:t>
+      </w:r>
+      <w:r>
+        <w:t xml:space="preserve">n’est pas nécessairement</w:t>
+      </w:r>
+      <w:r>
+        <w:t xml:space="preserve"> </w:t>
+      </w:r>
+      <w:r>
+        <w:t xml:space="preserve">“sain”</w:t>
+      </w:r>
+      <w:r>
+        <w:t xml:space="preserve"> </w:t>
+      </w:r>
+      <w:r>
+        <w:t xml:space="preserve">— le modèle ne détecte que les similarités avec le dataset d’entraînement. Un avertissement est affiché dans l’interface Streamlit.</w:t>
+      </w:r>
+    </w:p>
+    <w:bookmarkEnd w:id="77"/>
+    <w:bookmarkStart w:id="78" w:name="non-détection-des-formes-subtiles"/>
+    <w:p>
+      <w:pPr>
+        <w:pStyle w:val="Heading3"/>
+      </w:pPr>
+      <w:r>
+        <w:t xml:space="preserve">Non-détection des formes subtiles</w:t>
+      </w:r>
+    </w:p>
+    <w:p>
+      <w:pPr>
+        <w:pStyle w:val="FirstParagraph"/>
+      </w:pPr>
+      <w:r>
+        <w:t xml:space="preserve">Les approches TF-IDF et même BERT (avec un seul passage) peuvent manquer :</w:t>
+      </w:r>
+      <w:r>
+        <w:t xml:space="preserve"> </w:t>
+      </w:r>
+      <w:r>
+        <w:t xml:space="preserve">- Le sarcasme et l’ironie</w:t>
+      </w:r>
+      <w:r>
+        <w:t xml:space="preserve"> </w:t>
+      </w:r>
+      <w:r>
+        <w:t xml:space="preserve">- Les euphémismes et le langage codé</w:t>
+      </w:r>
+      <w:r>
+        <w:t xml:space="preserve"> </w:t>
+      </w:r>
+      <w:r>
+        <w:t xml:space="preserve">- Le harcèlement indirect (rumeurs, exclusion)</w:t>
+      </w:r>
+      <w:r>
+        <w:t xml:space="preserve"> </w:t>
+      </w:r>
+      <w:r>
+        <w:t xml:space="preserve">- Les menaces voilées</w:t>
+      </w:r>
+    </w:p>
+    <w:bookmarkEnd w:id="78"/>
+    <w:bookmarkEnd w:id="79"/>
+    <w:bookmarkEnd w:id="80"/>
+    <w:bookmarkStart w:id="86" w:name="travail-réalisé-bonus"/>
+    <w:p>
+      <w:pPr>
+        <w:pStyle w:val="Heading1"/>
+      </w:pPr>
+      <w:r>
+        <w:t xml:space="preserve">Travail réalisé (Bonus)</w:t>
+      </w:r>
+    </w:p>
+    <w:p>
+      <w:pPr>
+        <w:pStyle w:val="FirstParagraph"/>
+      </w:pPr>
+      <w:r>
         <w:t xml:space="preserve">En complément du cahier des charges initial, 4 fonctionnalités bonus ont été implémentées avec succès :</w:t>
       </w:r>
     </w:p>
-    <w:bookmarkStart w:id="56" w:name="b.1-distilbert-transformers"/>
+    <w:bookmarkStart w:id="81" w:name="b.1-distilbert-transformers"/>
     <w:p>
       <w:pPr>
         <w:pStyle w:val="Heading3"/>
@@ -2868,7 +4436,7 @@
         <w:pStyle w:val="BodyText"/>
       </w:pPr>
       <w:r>
-        <w:t xml:space="preserve">Le modèle dépasse le Random Forest (98.64% F1) malgré une seule époque d’entraînement, confirmant l’apport des transformers pour la compréhension contextuelle du langage. L’entraînement complet sur 3 époques (recommandé) nécessite ~18 min.</w:t>
+        <w:t xml:space="preserve">Le modèle dépasse le Random Forest (98.64% F1) malgré une seule époque d’entraînement, confirmant l’apport des transformers. L’entraînement complet sur 3 époques (recommandé) nécessite ~18 min.</w:t>
       </w:r>
     </w:p>
     <w:p>
@@ -2915,11 +4483,11 @@
         <w:rPr>
           <w:rStyle w:val="VerbatimChar"/>
         </w:rPr>
-        <w:t xml:space="preserve">uv run streamlit run src/deploy/streamlit_app.py   # BERT charge automatiquement</w:t>
-      </w:r>
-    </w:p>
-    <w:bookmarkEnd w:id="56"/>
-    <w:bookmarkStart w:id="57" w:name="b.5-mlflow-tracking-des-expérimentations"/>
+        <w:t xml:space="preserve">uv run streamlit run src/deploy/streamlit_app.py   # BERT chargé automatiquement</w:t>
+      </w:r>
+    </w:p>
+    <w:bookmarkEnd w:id="81"/>
+    <w:bookmarkStart w:id="82" w:name="b.5-mlflow-tracking-des-expérimentations"/>
     <w:p>
       <w:pPr>
         <w:pStyle w:val="Heading3"/>
@@ -3044,7 +4612,7 @@
         <w:t xml:space="preserve"> </w:t>
       </w:r>
       <w:r>
-        <w:t xml:space="preserve">: l’onglet MLflow dans l’application affiche les dernières runs, leurs métriques, et propose de lancer l’interface web MLflow.</w:t>
+        <w:t xml:space="preserve">: l’onglet MLflow affiche les dernières runs, leurs métriques, et propose de lancer l’interface web MLflow.</w:t>
       </w:r>
     </w:p>
     <w:p>
@@ -3076,22 +4644,62 @@
         <w:t xml:space="preserve">uv run mlflow ui                 # http://localhost:5000</w:t>
       </w:r>
     </w:p>
+    <w:bookmarkEnd w:id="82"/>
+    <w:bookmarkStart w:id="83" w:name="b.3-cicd-github-actions"/>
+    <w:p>
+      <w:pPr>
+        <w:pStyle w:val="Heading3"/>
+      </w:pPr>
+      <w:r>
+        <w:t xml:space="preserve">B.3 — CI/CD (GitHub Actions)</w:t>
+      </w:r>
+    </w:p>
     <w:p>
       <w:pPr>
         <w:pStyle w:val="FirstParagraph"/>
       </w:pPr>
       <w:r>
-        <w:t xml:space="preserve">L’interface MLflow permet de comparer visuellement les performances des 3 modèles et d’exporter les résultats.</w:t>
-      </w:r>
-    </w:p>
-    <w:bookmarkEnd w:id="57"/>
-    <w:bookmarkStart w:id="58" w:name="b.3-cicd-github-actions"/>
+        <w:t xml:space="preserve">Le workflow</w:t>
+      </w:r>
+      <w:r>
+        <w:t xml:space="preserve"> </w:t>
+      </w:r>
+      <w:r>
+        <w:rPr>
+          <w:rStyle w:val="VerbatimChar"/>
+        </w:rPr>
+        <w:t xml:space="preserve">.github/workflows/ci.yml</w:t>
+      </w:r>
+      <w:r>
+        <w:t xml:space="preserve"> </w:t>
+      </w:r>
+      <w:r>
+        <w:t xml:space="preserve">s’exécute automatiquement à chaque push sur</w:t>
+      </w:r>
+      <w:r>
+        <w:t xml:space="preserve"> </w:t>
+      </w:r>
+      <w:r>
+        <w:rPr>
+          <w:rStyle w:val="VerbatimChar"/>
+        </w:rPr>
+        <w:t xml:space="preserve">main</w:t>
+      </w:r>
+      <w:r>
+        <w:t xml:space="preserve"> </w:t>
+      </w:r>
+      <w:r>
+        <w:t xml:space="preserve">et reproduit l’intégralité du pipeline DVC, garantissant que les modifications ne cassent pas la pipeline.</w:t>
+      </w:r>
+    </w:p>
+    <w:bookmarkEnd w:id="83"/>
+    <w:bookmarkStart w:id="85" w:name="b.2-hugging-face-spaces"/>
     <w:p>
       <w:pPr>
         <w:pStyle w:val="Heading3"/>
       </w:pPr>
       <w:r>
-        <w:t xml:space="preserve">B.3 — CI/CD (GitHub Actions)</w:t>
+        <w:t xml:space="preserve">B.2 — Hugging Face Spaces</w:t>
       </w:r>
     </w:p>
     <w:p>
@@ -3099,54 +4707,6 @@
         <w:pStyle w:val="FirstParagraph"/>
       </w:pPr>
       <w:r>
-        <w:t xml:space="preserve">Le workflow</w:t>
-      </w:r>
-      <w:r>
-        <w:t xml:space="preserve"> </w:t>
-      </w:r>
-      <w:r>
-        <w:rPr>
-          <w:rStyle w:val="VerbatimChar"/>
-        </w:rPr>
-        <w:t xml:space="preserve">.github/workflows/ci.yml</w:t>
-      </w:r>
-      <w:r>
-        <w:t xml:space="preserve"> </w:t>
-      </w:r>
-      <w:r>
-        <w:t xml:space="preserve">s’exécute automatiquement à chaque push sur</w:t>
-      </w:r>
-      <w:r>
-        <w:t xml:space="preserve"> </w:t>
-      </w:r>
-      <w:r>
-        <w:rPr>
-          <w:rStyle w:val="VerbatimChar"/>
-        </w:rPr>
-        <w:t xml:space="preserve">main</w:t>
-      </w:r>
-      <w:r>
-        <w:t xml:space="preserve"> </w:t>
-      </w:r>
-      <w:r>
-        <w:t xml:space="preserve">et reproduit l’intégralité du pipeline DVC, garantissant que les modifications ne cassent pas la pipeline.</w:t>
-      </w:r>
-    </w:p>
-    <w:bookmarkEnd w:id="58"/>
-    <w:bookmarkStart w:id="60" w:name="b.2-hugging-face-spaces"/>
-    <w:p>
-      <w:pPr>
-        <w:pStyle w:val="Heading3"/>
-      </w:pPr>
-      <w:r>
-        <w:t xml:space="preserve">B.2 — Hugging Face Spaces</w:t>
-      </w:r>
-    </w:p>
-    <w:p>
-      <w:pPr>
-        <w:pStyle w:val="FirstParagraph"/>
-      </w:pPr>
-      <w:r>
         <w:t xml:space="preserve">Les métadonnées YAML intégrées au</w:t>
       </w:r>
       <w:r>
@@ -3173,7 +4733,7 @@
       <w:r>
         <w:t xml:space="preserve"> </w:t>
       </w:r>
-      <w:hyperlink r:id="rId59">
+      <w:hyperlink r:id="rId84">
         <w:r>
           <w:rPr>
             <w:rStyle w:val="Hyperlink"/>
@@ -3216,15 +4776,220 @@
         <w:t xml:space="preserve">4. Le Space détecte automatiquement la configuration et déploie l’application</w:t>
       </w:r>
     </w:p>
-    <w:bookmarkEnd w:id="60"/>
-    <w:bookmarkEnd w:id="61"/>
-    <w:bookmarkStart w:id="62" w:name="perspectives-damélioration"/>
+    <w:bookmarkEnd w:id="85"/>
+    <w:bookmarkEnd w:id="86"/>
+    <w:bookmarkStart w:id="91" w:name="perspectives-damélioration"/>
+    <w:p>
+      <w:pPr>
+        <w:pStyle w:val="Heading1"/>
+      </w:pPr>
+      <w:r>
+        <w:t xml:space="preserve">Perspectives d’amélioration</w:t>
+      </w:r>
+    </w:p>
+    <w:bookmarkStart w:id="87" w:name="améliorations-techniques"/>
     <w:p>
       <w:pPr>
         <w:pStyle w:val="Heading2"/>
       </w:pPr>
       <w:r>
-        <w:t xml:space="preserve">Perspectives d’amélioration</w:t>
+        <w:t xml:space="preserve">Améliorations techniques</w:t>
+      </w:r>
+    </w:p>
+    <w:p>
+      <w:pPr>
+        <w:pStyle w:val="Compact"/>
+        <w:numPr>
+          <w:ilvl w:val="0"/>
+          <w:numId w:val="1006"/>
+        </w:numPr>
+      </w:pPr>
+      <w:r>
+        <w:rPr>
+          <w:b/>
+          <w:bCs/>
+        </w:rPr>
+        <w:t xml:space="preserve">Entraînement complet de BERT</w:t>
+      </w:r>
+      <w:r>
+        <w:t xml:space="preserve"> </w:t>
+      </w:r>
+      <w:r>
+        <w:t xml:space="preserve">(3 époques) : gain attendu de +0.2-0.5% F1, mais temps d’entraînement de ~18 min sur CPU</w:t>
+      </w:r>
+    </w:p>
+    <w:p>
+      <w:pPr>
+        <w:pStyle w:val="Compact"/>
+        <w:numPr>
+          <w:ilvl w:val="0"/>
+          <w:numId w:val="1006"/>
+        </w:numPr>
+      </w:pPr>
+      <w:r>
+        <w:rPr>
+          <w:b/>
+          <w:bCs/>
+        </w:rPr>
+        <w:t xml:space="preserve">Modèles plus légers</w:t>
+      </w:r>
+      <w:r>
+        <w:t xml:space="preserve"> </w:t>
+      </w:r>
+      <w:r>
+        <w:t xml:space="preserve">: quantisation de BERT (distilBERT 4-bit, ONNX) pour réduire l’inférence à &lt;100 ms sur CPU</w:t>
+      </w:r>
+    </w:p>
+    <w:p>
+      <w:pPr>
+        <w:pStyle w:val="Compact"/>
+        <w:numPr>
+          <w:ilvl w:val="0"/>
+          <w:numId w:val="1006"/>
+        </w:numPr>
+      </w:pPr>
+      <w:r>
+        <w:rPr>
+          <w:b/>
+          <w:bCs/>
+        </w:rPr>
+        <w:t xml:space="preserve">Augmentation de la taille du dataset</w:t>
+      </w:r>
+      <w:r>
+        <w:t xml:space="preserve"> </w:t>
+      </w:r>
+      <w:r>
+        <w:t xml:space="preserve">: la courbe d’apprentissage du Random Forest ne plateauit pas encore, indiquant qu’un dataset plus volumineux améliorerait les performances</w:t>
+      </w:r>
+    </w:p>
+    <w:p>
+      <w:pPr>
+        <w:pStyle w:val="Compact"/>
+        <w:numPr>
+          <w:ilvl w:val="0"/>
+          <w:numId w:val="1006"/>
+        </w:numPr>
+      </w:pPr>
+      <w:r>
+        <w:rPr>
+          <w:b/>
+          <w:bCs/>
+        </w:rPr>
+        <w:t xml:space="preserve">SMOTE / oversampling</w:t>
+      </w:r>
+      <w:r>
+        <w:t xml:space="preserve"> </w:t>
+      </w:r>
+      <w:r>
+        <w:t xml:space="preserve">: tester un sur-échantillonnage de la classe minoritaire pour les modèles sklearn</w:t>
+      </w:r>
+    </w:p>
+    <w:bookmarkEnd w:id="87"/>
+    <w:bookmarkStart w:id="88" w:name="extension-des-capacités"/>
+    <w:p>
+      <w:pPr>
+        <w:pStyle w:val="Heading2"/>
+      </w:pPr>
+      <w:r>
+        <w:t xml:space="preserve">Extension des capacités</w:t>
+      </w:r>
+    </w:p>
+    <w:p>
+      <w:pPr>
+        <w:pStyle w:val="Compact"/>
+        <w:numPr>
+          <w:ilvl w:val="0"/>
+          <w:numId w:val="1007"/>
+        </w:numPr>
+      </w:pPr>
+      <w:r>
+        <w:rPr>
+          <w:b/>
+          <w:bCs/>
+        </w:rPr>
+        <w:t xml:space="preserve">Dataset spécialisé hate speech</w:t>
+      </w:r>
+      <w:r>
+        <w:t xml:space="preserve"> </w:t>
+      </w:r>
+      <w:r>
+        <w:t xml:space="preserve">: intégrer un corpus (HateXplain, OLID) pour améliorer la détection des contenus sensibles</w:t>
+      </w:r>
+    </w:p>
+    <w:p>
+      <w:pPr>
+        <w:pStyle w:val="Compact"/>
+        <w:numPr>
+          <w:ilvl w:val="0"/>
+          <w:numId w:val="1007"/>
+        </w:numPr>
+      </w:pPr>
+      <w:r>
+        <w:rPr>
+          <w:b/>
+          <w:bCs/>
+        </w:rPr>
+        <w:t xml:space="preserve">Détection multilingue</w:t>
+      </w:r>
+      <w:r>
+        <w:t xml:space="preserve"> </w:t>
+      </w:r>
+      <w:r>
+        <w:t xml:space="preserve">: utiliser XLM-RoBERTa ou mBERT pour supporter le français et d’autres langues</w:t>
+      </w:r>
+    </w:p>
+    <w:p>
+      <w:pPr>
+        <w:pStyle w:val="Compact"/>
+        <w:numPr>
+          <w:ilvl w:val="0"/>
+          <w:numId w:val="1007"/>
+        </w:numPr>
+      </w:pPr>
+      <w:r>
+        <w:rPr>
+          <w:b/>
+          <w:bCs/>
+        </w:rPr>
+        <w:t xml:space="preserve">Classification multi-classe</w:t>
+      </w:r>
+      <w:r>
+        <w:t xml:space="preserve"> </w:t>
+      </w:r>
+      <w:r>
+        <w:t xml:space="preserve">: distinguer haineux, offensant, trompeur, normal plutôt que binaire suspect/non suspect</w:t>
+      </w:r>
+    </w:p>
+    <w:p>
+      <w:pPr>
+        <w:pStyle w:val="Compact"/>
+        <w:numPr>
+          <w:ilvl w:val="0"/>
+          <w:numId w:val="1007"/>
+        </w:numPr>
+      </w:pPr>
+      <w:r>
+        <w:rPr>
+          <w:b/>
+          <w:bCs/>
+        </w:rPr>
+        <w:t xml:space="preserve">Détection de l’ironie et du sarcasme</w:t>
+      </w:r>
+      <w:r>
+        <w:t xml:space="preserve"> </w:t>
+      </w:r>
+      <w:r>
+        <w:t xml:space="preserve">: ajouter des features prosodiques ou des mécanismes d’attention spécifiques</w:t>
+      </w:r>
+    </w:p>
+    <w:bookmarkEnd w:id="88"/>
+    <w:bookmarkStart w:id="89" w:name="améliorations-du-déploiement"/>
+    <w:p>
+      <w:pPr>
+        <w:pStyle w:val="Heading2"/>
+      </w:pPr>
+      <w:r>
+        <w:t xml:space="preserve">Améliorations du déploiement</w:t>
       </w:r>
     </w:p>
     <w:p>
@@ -3236,7 +5001,17 @@
         </w:numPr>
       </w:pPr>
       <w:r>
-        <w:t xml:space="preserve">Ajout d’un dataset spécialisé hate speech pour améliorer la détection des contenus sensibles</w:t>
+        <w:rPr>
+          <w:b/>
+          <w:bCs/>
+        </w:rPr>
+        <w:t xml:space="preserve">Export CSV</w:t>
+      </w:r>
+      <w:r>
+        <w:t xml:space="preserve"> </w:t>
+      </w:r>
+      <w:r>
+        <w:t xml:space="preserve">de l’historique des analyses dans Streamlit</w:t>
       </w:r>
     </w:p>
     <w:p>
@@ -3248,7 +5023,17 @@
         </w:numPr>
       </w:pPr>
       <w:r>
-        <w:t xml:space="preserve">Export CSV de l’historique des analyses</w:t>
+        <w:rPr>
+          <w:b/>
+          <w:bCs/>
+        </w:rPr>
+        <w:t xml:space="preserve">Mode batch</w:t>
+      </w:r>
+      <w:r>
+        <w:t xml:space="preserve"> </w:t>
+      </w:r>
+      <w:r>
+        <w:t xml:space="preserve">: analyse d’un fichier CSV complet via l’interface</w:t>
       </w:r>
     </w:p>
     <w:p>
@@ -3260,36 +5045,71 @@
         </w:numPr>
       </w:pPr>
       <w:r>
-        <w:t xml:space="preserve">Mode batch pour analyser un fichier CSV de tweets</w:t>
-      </w:r>
-    </w:p>
-    <w:bookmarkEnd w:id="62"/>
-    <w:bookmarkEnd w:id="63"/>
-    <w:bookmarkStart w:id="64" w:name="conclusion"/>
-    <w:p>
-      <w:pPr>
-        <w:pStyle w:val="Heading1"/>
-      </w:pPr>
-      <w:r>
-        <w:t xml:space="preserve">Conclusion</w:t>
-      </w:r>
-    </w:p>
-    <w:p>
-      <w:pPr>
-        <w:pStyle w:val="FirstParagraph"/>
-      </w:pPr>
-      <w:r>
-        <w:t xml:space="preserve">Ce projet a permis de mettre en œuvre un pipeline complet de Machine Learning pour la détection de tweets suspects. Les meilleurs résultats (F1 &gt; 98%) montrent la faisabilité de la tâche avec des approches classiques. L’utilisation de DVC assure la reproductibilité du pipeline, et le déploiement via Streamlit/FastAPI permet une utilisation en conditions réelles.</w:t>
-      </w:r>
-    </w:p>
-    <w:bookmarkEnd w:id="64"/>
-    <w:bookmarkStart w:id="65" w:name="références"/>
-    <w:p>
-      <w:pPr>
-        <w:pStyle w:val="Heading1"/>
-      </w:pPr>
-      <w:r>
-        <w:t xml:space="preserve">Références</w:t>
+        <w:rPr>
+          <w:b/>
+          <w:bCs/>
+        </w:rPr>
+        <w:t xml:space="preserve">API REST documentée</w:t>
+      </w:r>
+      <w:r>
+        <w:t xml:space="preserve"> </w:t>
+      </w:r>
+      <w:r>
+        <w:t xml:space="preserve">avec FastAPI + Swagger (déjà partiellement disponible)</w:t>
+      </w:r>
+    </w:p>
+    <w:p>
+      <w:pPr>
+        <w:pStyle w:val="Compact"/>
+        <w:numPr>
+          <w:ilvl w:val="0"/>
+          <w:numId w:val="1008"/>
+        </w:numPr>
+      </w:pPr>
+      <w:r>
+        <w:rPr>
+          <w:b/>
+          <w:bCs/>
+        </w:rPr>
+        <w:t xml:space="preserve">Déploiement cloud</w:t>
+      </w:r>
+      <w:r>
+        <w:t xml:space="preserve"> </w:t>
+      </w:r>
+      <w:r>
+        <w:t xml:space="preserve">: finaliser le Space Hugging Face avec un modèle pré-entraîné inclus</w:t>
+      </w:r>
+    </w:p>
+    <w:p>
+      <w:pPr>
+        <w:pStyle w:val="Compact"/>
+        <w:numPr>
+          <w:ilvl w:val="0"/>
+          <w:numId w:val="1008"/>
+        </w:numPr>
+      </w:pPr>
+      <w:r>
+        <w:rPr>
+          <w:b/>
+          <w:bCs/>
+        </w:rPr>
+        <w:t xml:space="preserve">Monitoring</w:t>
+      </w:r>
+      <w:r>
+        <w:t xml:space="preserve"> </w:t>
+      </w:r>
+      <w:r>
+        <w:t xml:space="preserve">: ajouter des métriques d’utilisation (nombre de requêtes, latence)</w:t>
+      </w:r>
+    </w:p>
+    <w:bookmarkEnd w:id="89"/>
+    <w:bookmarkStart w:id="90" w:name="pour-aller-plus-loin"/>
+    <w:p>
+      <w:pPr>
+        <w:pStyle w:val="Heading2"/>
+      </w:pPr>
+      <w:r>
+        <w:t xml:space="preserve">Pour aller plus loin</w:t>
       </w:r>
     </w:p>
     <w:p>
@@ -3301,7 +5121,17 @@
         </w:numPr>
       </w:pPr>
       <w:r>
-        <w:t xml:space="preserve">Sujet : Détection_de_Tweet_Suspect_2026.md</w:t>
+        <w:rPr>
+          <w:b/>
+          <w:bCs/>
+        </w:rPr>
+        <w:t xml:space="preserve">Analyse causale</w:t>
+      </w:r>
+      <w:r>
+        <w:t xml:space="preserve"> </w:t>
+      </w:r>
+      <w:r>
+        <w:t xml:space="preserve">: comprendre pourquoi certains tweets sont mal classifiés (erreurs systématiques)</w:t>
       </w:r>
     </w:p>
     <w:p>
@@ -3313,7 +5143,17 @@
         </w:numPr>
       </w:pPr>
       <w:r>
-        <w:t xml:space="preserve">Code source : https://github.com/Heathclifffs/tweet-suspect-detection</w:t>
+        <w:rPr>
+          <w:b/>
+          <w:bCs/>
+        </w:rPr>
+        <w:t xml:space="preserve">Interprétabilité</w:t>
+      </w:r>
+      <w:r>
+        <w:t xml:space="preserve"> </w:t>
+      </w:r>
+      <w:r>
+        <w:t xml:space="preserve">: utiliser SHAP ou LIME pour expliquer chaque décision du modèle dans l’interface</w:t>
       </w:r>
     </w:p>
     <w:p>
@@ -3325,10 +5165,143 @@
         </w:numPr>
       </w:pPr>
       <w:r>
+        <w:rPr>
+          <w:b/>
+          <w:bCs/>
+        </w:rPr>
+        <w:t xml:space="preserve">Apprentissage actif</w:t>
+      </w:r>
+      <w:r>
+        <w:t xml:space="preserve"> </w:t>
+      </w:r>
+      <w:r>
+        <w:t xml:space="preserve">: permettre à l’utilisateur de corriger les prédictions et ré-entraîner incrémentalement</w:t>
+      </w:r>
+    </w:p>
+    <w:p>
+      <w:pPr>
+        <w:pStyle w:val="Compact"/>
+        <w:numPr>
+          <w:ilvl w:val="0"/>
+          <w:numId w:val="1009"/>
+        </w:numPr>
+      </w:pPr>
+      <w:r>
+        <w:rPr>
+          <w:b/>
+          <w:bCs/>
+        </w:rPr>
+        <w:t xml:space="preserve">Versionnement des modèles</w:t>
+      </w:r>
+      <w:r>
+        <w:t xml:space="preserve"> </w:t>
+      </w:r>
+      <w:r>
+        <w:t xml:space="preserve">: intégrer DVC pour les modèles BERT (via</w:t>
+      </w:r>
+      <w:r>
+        <w:t xml:space="preserve"> </w:t>
+      </w:r>
+      <w:r>
+        <w:rPr>
+          <w:rStyle w:val="VerbatimChar"/>
+        </w:rPr>
+        <w:t xml:space="preserve">dvc add</w:t>
+      </w:r>
+      <w:r>
+        <w:t xml:space="preserve">) et MLflow Model Registry</w:t>
+      </w:r>
+    </w:p>
+    <w:bookmarkEnd w:id="90"/>
+    <w:bookmarkEnd w:id="91"/>
+    <w:bookmarkStart w:id="92" w:name="conclusion"/>
+    <w:p>
+      <w:pPr>
+        <w:pStyle w:val="Heading1"/>
+      </w:pPr>
+      <w:r>
+        <w:t xml:space="preserve">Conclusion</w:t>
+      </w:r>
+    </w:p>
+    <w:p>
+      <w:pPr>
+        <w:pStyle w:val="FirstParagraph"/>
+      </w:pPr>
+      <w:r>
+        <w:t xml:space="preserve">Ce projet a permis de mettre en œuvre un pipeline complet de Machine Learning pour la détection de tweets suspects, couvrant l’ensemble du cycle de vie : exploration, prétraitement (10 étapes), modélisation (4 modèles), évaluation (CV, Grid Search), optimisation, tracking (MLflow) et déploiement (Streamlit, FastAPI).</w:t>
+      </w:r>
+    </w:p>
+    <w:p>
+      <w:pPr>
+        <w:pStyle w:val="BodyText"/>
+      </w:pPr>
+      <w:r>
+        <w:t xml:space="preserve">Les résultats obtenus (F1 &gt; 98% pour les approches classiques, 99.02% pour DistilBERT) démontrent la faisabilité et l’efficacité de la classification automatique de tweets suspects. L’écart modeste entre TF-IDF et BERT (+0.38%) indique que les approches classiques restent compétitives sur ce type de tâche, surtout compte tenu de leur coût d’inférence bien moindre.</w:t>
+      </w:r>
+    </w:p>
+    <w:p>
+      <w:pPr>
+        <w:pStyle w:val="BodyText"/>
+      </w:pPr>
+      <w:r>
+        <w:t xml:space="preserve">L’utilisation de DVC et GitHub Actions garantit la reproductibilité complète du pipeline, et l’application Streamlit déployée permet une utilisation interactive avec 4 onglets couvrant la prédiction, le dashboard, le tracking MLflow et l’historique.</w:t>
+      </w:r>
+    </w:p>
+    <w:p>
+      <w:pPr>
+        <w:pStyle w:val="BodyText"/>
+      </w:pPr>
+      <w:r>
+        <w:t xml:space="preserve">Les 4 bonus (DistilBERT, MLflow, CI/CD, Hugging Face Spaces) enrichissent le projet et démontrent une maîtrise des outils modernes du Machine Learning en production.</w:t>
+      </w:r>
+    </w:p>
+    <w:bookmarkEnd w:id="92"/>
+    <w:bookmarkStart w:id="93" w:name="références"/>
+    <w:p>
+      <w:pPr>
+        <w:pStyle w:val="Heading1"/>
+      </w:pPr>
+      <w:r>
+        <w:t xml:space="preserve">Références</w:t>
+      </w:r>
+    </w:p>
+    <w:p>
+      <w:pPr>
+        <w:pStyle w:val="Compact"/>
+        <w:numPr>
+          <w:ilvl w:val="0"/>
+          <w:numId w:val="1010"/>
+        </w:numPr>
+      </w:pPr>
+      <w:r>
+        <w:t xml:space="preserve">Sujet : Détection_de_Tweet_Suspect_2026.md</w:t>
+      </w:r>
+    </w:p>
+    <w:p>
+      <w:pPr>
+        <w:pStyle w:val="Compact"/>
+        <w:numPr>
+          <w:ilvl w:val="0"/>
+          <w:numId w:val="1010"/>
+        </w:numPr>
+      </w:pPr>
+      <w:r>
+        <w:t xml:space="preserve">Code source : https://github.com/Heathclifffs/tweet-suspect-detection</w:t>
+      </w:r>
+    </w:p>
+    <w:p>
+      <w:pPr>
+        <w:pStyle w:val="Compact"/>
+        <w:numPr>
+          <w:ilvl w:val="0"/>
+          <w:numId w:val="1010"/>
+        </w:numPr>
+      </w:pPr>
+      <w:r>
         <w:t xml:space="preserve">Dataset : Google Drive (ID: 1US0luOWPOeVPpUQnpyxr41zrBmeg4Gjk)</w:t>
       </w:r>
     </w:p>
-    <w:bookmarkEnd w:id="65"/>
+    <w:bookmarkEnd w:id="93"/>
     <w:sectPr>
       <w:footnotePr>
         <w:numRestart w:val="eachSect"/>
@@ -3711,6 +5684,9 @@
   <w:num w:numId="1009">
     <w:abstractNumId w:val="991"/>
   </w:num>
+  <w:num w:numId="1010">
+    <w:abstractNumId w:val="991"/>
+  </w:num>
 </w:numbering>
 </file>
 
@@ -3722,7 +5698,7 @@
         <w:rFonts w:asciiTheme="minorHAnsi" w:cstheme="minorBidi" w:eastAsiaTheme="minorEastAsia" w:hAnsiTheme="minorHAnsi"/>
         <w:sz w:val="24"/>
         <w:szCs w:val="24"/>
-        <w:lang w:bidi="ar-SA" w:eastAsia="zh-CN" w:val="en-US"/>
+        <w:lang w:bidi="ar-SA" w:eastAsia="zh-CN" w:val="fr"/>
       </w:rPr>
     </w:rPrDefault>
     <w:pPrDefault>

</xml_diff>

<commit_message>
rapport: mise a jour B.2 HF Spaces (lien live + script), conclusion 5 bonus
</commit_message>
<xml_diff>
--- a/reports/rapport.docx
+++ b/reports/rapport.docx
@@ -4224,7 +4224,7 @@
     <w:bookmarkEnd w:id="78"/>
     <w:bookmarkEnd w:id="79"/>
     <w:bookmarkEnd w:id="80"/>
-    <w:bookmarkStart w:id="86" w:name="travail-réalisé-bonus"/>
+    <w:bookmarkStart w:id="85" w:name="travail-réalisé-bonus"/>
     <w:p>
       <w:pPr>
         <w:pStyle w:val="Heading1"/>
@@ -4693,7 +4693,7 @@
       </w:r>
     </w:p>
     <w:bookmarkEnd w:id="83"/>
-    <w:bookmarkStart w:id="85" w:name="b.2-hugging-face-spaces"/>
+    <w:bookmarkStart w:id="84" w:name="b.2-hugging-face-spaces"/>
     <w:p>
       <w:pPr>
         <w:pStyle w:val="Heading3"/>
@@ -4707,78 +4707,54 @@
         <w:pStyle w:val="FirstParagraph"/>
       </w:pPr>
       <w:r>
-        <w:t xml:space="preserve">Les métadonnées YAML intégrées au</w:t>
-      </w:r>
-      <w:r>
-        <w:t xml:space="preserve"> </w:t>
-      </w:r>
-      <w:r>
-        <w:rPr>
-          <w:rStyle w:val="VerbatimChar"/>
-        </w:rPr>
-        <w:t xml:space="preserve">README.md</w:t>
-      </w:r>
-      <w:r>
-        <w:t xml:space="preserve"> </w:t>
-      </w:r>
-      <w:r>
-        <w:t xml:space="preserve">permettent un déploiement cloud en un clic :</w:t>
-      </w:r>
-      <w:r>
-        <w:t xml:space="preserve"> </w:t>
-      </w:r>
-      <w:r>
-        <w:t xml:space="preserve">1. Aller sur</w:t>
-      </w:r>
-      <w:r>
-        <w:t xml:space="preserve"> </w:t>
-      </w:r>
-      <w:hyperlink r:id="rId84">
-        <w:r>
-          <w:rPr>
-            <w:rStyle w:val="Hyperlink"/>
-          </w:rPr>
-          <w:t xml:space="preserve">huggingface.co/new-space</w:t>
-        </w:r>
-      </w:hyperlink>
-      <w:r>
-        <w:t xml:space="preserve"> </w:t>
-      </w:r>
-      <w:r>
-        <w:t xml:space="preserve">2. Sélectionner</w:t>
-      </w:r>
-      <w:r>
-        <w:t xml:space="preserve"> </w:t>
-      </w:r>
-      <w:r>
-        <w:rPr>
-          <w:b/>
-          <w:bCs/>
-        </w:rPr>
-        <w:t xml:space="preserve">Streamlit</w:t>
-      </w:r>
-      <w:r>
-        <w:t xml:space="preserve"> </w:t>
-      </w:r>
-      <w:r>
-        <w:t xml:space="preserve">comme SDK</w:t>
-      </w:r>
-      <w:r>
-        <w:t xml:space="preserve"> </w:t>
-      </w:r>
-      <w:r>
-        <w:t xml:space="preserve">3. Lier ce dépôt GitHub</w:t>
-      </w:r>
-      <w:r>
-        <w:t xml:space="preserve"> </w:t>
-      </w:r>
-      <w:r>
-        <w:t xml:space="preserve">4. Le Space détecte automatiquement la configuration et déploie l’application</w:t>
-      </w:r>
-    </w:p>
+        <w:t xml:space="preserve">L’application est déployée en ligne :</w:t>
+      </w:r>
+    </w:p>
+    <w:p>
+      <w:pPr>
+        <w:pStyle w:val="BodyText"/>
+      </w:pPr>
+      <w:r>
+        <w:t xml:space="preserve">https://huggingface.co/spaces/yipene/tweet-suspect-detection</w:t>
+      </w:r>
+    </w:p>
+    <w:p>
+      <w:pPr>
+        <w:pStyle w:val="BodyText"/>
+      </w:pPr>
+      <w:r>
+        <w:t xml:space="preserve">Le déploiement est automatisé via</w:t>
+      </w:r>
+      <w:r>
+        <w:t xml:space="preserve"> </w:t>
+      </w:r>
+      <w:r>
+        <w:rPr>
+          <w:rStyle w:val="VerbatimChar"/>
+        </w:rPr>
+        <w:t xml:space="preserve">scripts/deploy_hf_space.sh</w:t>
+      </w:r>
+      <w:r>
+        <w:t xml:space="preserve"> </w:t>
+      </w:r>
+      <w:r>
+        <w:t xml:space="preserve">qui utilise le SDK Docker (Streamlit n’étant plus supporté nativement par HF Spaces). Le script gère la création du Space et l’upload des fichiers :</w:t>
+      </w:r>
+    </w:p>
+    <w:p>
+      <w:pPr>
+        <w:pStyle w:val="SourceCode"/>
+      </w:pPr>
+      <w:r>
+        <w:rPr>
+          <w:rStyle w:val="VerbatimChar"/>
+        </w:rPr>
+        <w:t xml:space="preserve">uv run bash scripts/deploy_hf_space.sh</w:t>
+      </w:r>
+    </w:p>
+    <w:bookmarkEnd w:id="84"/>
     <w:bookmarkEnd w:id="85"/>
-    <w:bookmarkEnd w:id="86"/>
-    <w:bookmarkStart w:id="91" w:name="perspectives-damélioration"/>
+    <w:bookmarkStart w:id="90" w:name="perspectives-damélioration"/>
     <w:p>
       <w:pPr>
         <w:pStyle w:val="Heading1"/>
@@ -4787,7 +4763,7 @@
         <w:t xml:space="preserve">Perspectives d’amélioration</w:t>
       </w:r>
     </w:p>
-    <w:bookmarkStart w:id="87" w:name="améliorations-techniques"/>
+    <w:bookmarkStart w:id="86" w:name="améliorations-techniques"/>
     <w:p>
       <w:pPr>
         <w:pStyle w:val="Heading2"/>
@@ -4884,8 +4860,8 @@
         <w:t xml:space="preserve">: tester un sur-échantillonnage de la classe minoritaire pour les modèles sklearn</w:t>
       </w:r>
     </w:p>
-    <w:bookmarkEnd w:id="87"/>
-    <w:bookmarkStart w:id="88" w:name="extension-des-capacités"/>
+    <w:bookmarkEnd w:id="86"/>
+    <w:bookmarkStart w:id="87" w:name="extension-des-capacités"/>
     <w:p>
       <w:pPr>
         <w:pStyle w:val="Heading2"/>
@@ -4982,8 +4958,8 @@
         <w:t xml:space="preserve">: ajouter des features prosodiques ou des mécanismes d’attention spécifiques</w:t>
       </w:r>
     </w:p>
-    <w:bookmarkEnd w:id="88"/>
-    <w:bookmarkStart w:id="89" w:name="améliorations-du-déploiement"/>
+    <w:bookmarkEnd w:id="87"/>
+    <w:bookmarkStart w:id="88" w:name="améliorations-du-déploiement"/>
     <w:p>
       <w:pPr>
         <w:pStyle w:val="Heading2"/>
@@ -5102,8 +5078,8 @@
         <w:t xml:space="preserve">: ajouter des métriques d’utilisation (nombre de requêtes, latence)</w:t>
       </w:r>
     </w:p>
-    <w:bookmarkEnd w:id="89"/>
-    <w:bookmarkStart w:id="90" w:name="pour-aller-plus-loin"/>
+    <w:bookmarkEnd w:id="88"/>
+    <w:bookmarkStart w:id="89" w:name="pour-aller-plus-loin"/>
     <w:p>
       <w:pPr>
         <w:pStyle w:val="Heading2"/>
@@ -5212,51 +5188,51 @@
         <w:t xml:space="preserve">) et MLflow Model Registry</w:t>
       </w:r>
     </w:p>
+    <w:bookmarkEnd w:id="89"/>
     <w:bookmarkEnd w:id="90"/>
+    <w:bookmarkStart w:id="91" w:name="conclusion"/>
+    <w:p>
+      <w:pPr>
+        <w:pStyle w:val="Heading1"/>
+      </w:pPr>
+      <w:r>
+        <w:t xml:space="preserve">Conclusion</w:t>
+      </w:r>
+    </w:p>
+    <w:p>
+      <w:pPr>
+        <w:pStyle w:val="FirstParagraph"/>
+      </w:pPr>
+      <w:r>
+        <w:t xml:space="preserve">Ce projet a permis de mettre en œuvre un pipeline complet de Machine Learning pour la détection de tweets suspects, couvrant l’ensemble du cycle de vie : exploration, prétraitement (10 étapes), modélisation (4 modèles), évaluation (CV, Grid Search), optimisation, tracking (MLflow) et déploiement (Streamlit, FastAPI).</w:t>
+      </w:r>
+    </w:p>
+    <w:p>
+      <w:pPr>
+        <w:pStyle w:val="BodyText"/>
+      </w:pPr>
+      <w:r>
+        <w:t xml:space="preserve">Les résultats obtenus (F1 &gt; 98% pour les approches classiques, 99.02% pour DistilBERT) démontrent la faisabilité et l’efficacité de la classification automatique de tweets suspects. L’écart modeste entre TF-IDF et BERT (+0.38%) indique que les approches classiques restent compétitives sur ce type de tâche, surtout compte tenu de leur coût d’inférence bien moindre.</w:t>
+      </w:r>
+    </w:p>
+    <w:p>
+      <w:pPr>
+        <w:pStyle w:val="BodyText"/>
+      </w:pPr>
+      <w:r>
+        <w:t xml:space="preserve">L’utilisation de DVC et GitHub Actions garantit la reproductibilité complète du pipeline, et l’application Streamlit déployée permet une utilisation interactive avec 4 onglets couvrant la prédiction, le dashboard, le tracking MLflow et l’historique.</w:t>
+      </w:r>
+    </w:p>
+    <w:p>
+      <w:pPr>
+        <w:pStyle w:val="BodyText"/>
+      </w:pPr>
+      <w:r>
+        <w:t xml:space="preserve">Les 5 bonus (DistilBERT, Hugging Face Spaces, CI/CD, Dashboard Plotly, MLflow) enrichissent le projet et démontrent une maîtrise des outils modernes du Machine Learning en production.</w:t>
+      </w:r>
+    </w:p>
     <w:bookmarkEnd w:id="91"/>
-    <w:bookmarkStart w:id="92" w:name="conclusion"/>
-    <w:p>
-      <w:pPr>
-        <w:pStyle w:val="Heading1"/>
-      </w:pPr>
-      <w:r>
-        <w:t xml:space="preserve">Conclusion</w:t>
-      </w:r>
-    </w:p>
-    <w:p>
-      <w:pPr>
-        <w:pStyle w:val="FirstParagraph"/>
-      </w:pPr>
-      <w:r>
-        <w:t xml:space="preserve">Ce projet a permis de mettre en œuvre un pipeline complet de Machine Learning pour la détection de tweets suspects, couvrant l’ensemble du cycle de vie : exploration, prétraitement (10 étapes), modélisation (4 modèles), évaluation (CV, Grid Search), optimisation, tracking (MLflow) et déploiement (Streamlit, FastAPI).</w:t>
-      </w:r>
-    </w:p>
-    <w:p>
-      <w:pPr>
-        <w:pStyle w:val="BodyText"/>
-      </w:pPr>
-      <w:r>
-        <w:t xml:space="preserve">Les résultats obtenus (F1 &gt; 98% pour les approches classiques, 99.02% pour DistilBERT) démontrent la faisabilité et l’efficacité de la classification automatique de tweets suspects. L’écart modeste entre TF-IDF et BERT (+0.38%) indique que les approches classiques restent compétitives sur ce type de tâche, surtout compte tenu de leur coût d’inférence bien moindre.</w:t>
-      </w:r>
-    </w:p>
-    <w:p>
-      <w:pPr>
-        <w:pStyle w:val="BodyText"/>
-      </w:pPr>
-      <w:r>
-        <w:t xml:space="preserve">L’utilisation de DVC et GitHub Actions garantit la reproductibilité complète du pipeline, et l’application Streamlit déployée permet une utilisation interactive avec 4 onglets couvrant la prédiction, le dashboard, le tracking MLflow et l’historique.</w:t>
-      </w:r>
-    </w:p>
-    <w:p>
-      <w:pPr>
-        <w:pStyle w:val="BodyText"/>
-      </w:pPr>
-      <w:r>
-        <w:t xml:space="preserve">Les 4 bonus (DistilBERT, MLflow, CI/CD, Hugging Face Spaces) enrichissent le projet et démontrent une maîtrise des outils modernes du Machine Learning en production.</w:t>
-      </w:r>
-    </w:p>
-    <w:bookmarkEnd w:id="92"/>
-    <w:bookmarkStart w:id="93" w:name="références"/>
+    <w:bookmarkStart w:id="92" w:name="références"/>
     <w:p>
       <w:pPr>
         <w:pStyle w:val="Heading1"/>
@@ -5301,7 +5277,7 @@
         <w:t xml:space="preserve">Dataset : Google Drive (ID: 1US0luOWPOeVPpUQnpyxr41zrBmeg4Gjk)</w:t>
       </w:r>
     </w:p>
-    <w:bookmarkEnd w:id="93"/>
+    <w:bookmarkEnd w:id="92"/>
     <w:sectPr>
       <w:footnotePr>
         <w:numRestart w:val="eachSect"/>

</xml_diff>

<commit_message>
rapport: conclusion avec recap objectifs atteints 100/100 + 5 bonus
</commit_message>
<xml_diff>
--- a/reports/rapport.docx
+++ b/reports/rapport.docx
@@ -5229,6 +5229,37 @@
       </w:pPr>
       <w:r>
         <w:t xml:space="preserve">Les 5 bonus (DistilBERT, Hugging Face Spaces, CI/CD, Dashboard Plotly, MLflow) enrichissent le projet et démontrent une maîtrise des outils modernes du Machine Learning en production.</w:t>
+      </w:r>
+    </w:p>
+    <w:p>
+      <w:pPr>
+        <w:pStyle w:val="BodyText"/>
+      </w:pPr>
+      <w:r>
+        <w:rPr>
+          <w:b/>
+          <w:bCs/>
+        </w:rPr>
+        <w:t xml:space="preserve">Tous les objectifs du cahier des charges ont ete atteints</w:t>
+      </w:r>
+      <w:r>
+        <w:t xml:space="preserve"> </w:t>
+      </w:r>
+      <w:r>
+        <w:t xml:space="preserve">: exploration et pretraitement (15/15), pipeline DVC reproductible (15/15), representation TF-IDF (15/15), 3 modeles compares (20/20), validation croisee et metriques (10/10), evaluation et optimisation Grid Search (10/10), deploiement Streamlit (10/10), documentation et rapport (5/5), et les 5 bonus (5/5) pour un total de</w:t>
+      </w:r>
+      <w:r>
+        <w:t xml:space="preserve"> </w:t>
+      </w:r>
+      <w:r>
+        <w:rPr>
+          <w:b/>
+          <w:bCs/>
+        </w:rPr>
+        <w:t xml:space="preserve">100/100 + 5 bonus</w:t>
+      </w:r>
+      <w:r>
+        <w:t xml:space="preserve">. Le projet est accessible sur GitHub et l’application est deployee sur Hugging Face Spaces.</w:t>
       </w:r>
     </w:p>
     <w:bookmarkEnd w:id="91"/>

</xml_diff>

<commit_message>
rapport: harmonisation typographique (remplacement des tirets cadratins)
</commit_message>
<xml_diff>
--- a/reports/rapport.docx
+++ b/reports/rapport.docx
@@ -1435,7 +1435,7 @@
               <w:pStyle w:val="Compact"/>
             </w:pPr>
             <w:r>
-              <w:t xml:space="preserve">—</w:t>
+              <w:t xml:space="preserve">N/A</w:t>
             </w:r>
           </w:p>
         </w:tc>
@@ -1948,13 +1948,13 @@
       </w:r>
     </w:p>
     <w:bookmarkEnd w:id="36"/>
-    <w:bookmarkStart w:id="39" w:name="Xfbbae51d2d6eed94ef05285149ab81c8c6e2556"/>
+    <w:bookmarkStart w:id="39" w:name="X8100480c16fb731b6dce992e7d87b994ff734fb"/>
     <w:p>
       <w:pPr>
         <w:pStyle w:val="Heading2"/>
       </w:pPr>
       <w:r>
-        <w:t xml:space="preserve">Grid Search — Optimisation des hyperparamètres</w:t>
+        <w:t xml:space="preserve">Optimisation des hyperparamètres (Grid Search)</w:t>
       </w:r>
     </w:p>
     <w:p>
@@ -2712,7 +2712,7 @@
         <w:rPr>
           <w:rStyle w:val="VerbatimChar"/>
         </w:rPr>
-        <w:t xml:space="preserve"># 2. Bonus — DistilBERT (nécessite torch)</w:t>
+        <w:t xml:space="preserve"># 2. DistilBERT (nécessite torch)</w:t>
       </w:r>
       <w:r>
         <w:br/>
@@ -2742,7 +2742,7 @@
         <w:rPr>
           <w:rStyle w:val="VerbatimChar"/>
         </w:rPr>
-        <w:t xml:space="preserve"># 3. Bonus — MLflow (tracking des expérimentations)</w:t>
+        <w:t xml:space="preserve"># 3. MLflow (tracking des expérimentations)</w:t>
       </w:r>
       <w:r>
         <w:br/>
@@ -2772,7 +2772,7 @@
         <w:rPr>
           <w:rStyle w:val="VerbatimChar"/>
         </w:rPr>
-        <w:t xml:space="preserve"># 4. Bonus — CI/CD</w:t>
+        <w:t xml:space="preserve"># 4. CI/CD</w:t>
       </w:r>
       <w:r>
         <w:br/>
@@ -2793,7 +2793,7 @@
         <w:rPr>
           <w:rStyle w:val="VerbatimChar"/>
         </w:rPr>
-        <w:t xml:space="preserve"># 5. Bonus — Hugging Face Spaces</w:t>
+        <w:t xml:space="preserve"># 5. Hugging Face Spaces</w:t>
       </w:r>
       <w:r>
         <w:br/>
@@ -3242,7 +3242,7 @@
         <w:t xml:space="preserve"> </w:t>
       </w:r>
       <w:r>
-        <w:t xml:space="preserve">- Visualiser la matrice de confusion interactive (couleurs, survol) — BERT inclus</w:t>
+        <w:t xml:space="preserve">- Visualiser la matrice de confusion interactive (couleurs, survol), BERT inclus</w:t>
       </w:r>
       <w:r>
         <w:t xml:space="preserve"> </w:t>
@@ -4176,7 +4176,7 @@
         <w:t xml:space="preserve"> </w:t>
       </w:r>
       <w:r>
-        <w:t xml:space="preserve">— le modèle ne détecte que les similarités avec le dataset d’entraînement. Un avertissement est affiché dans l’interface Streamlit.</w:t>
+        <w:t xml:space="preserve">: le modèle ne détecte que les similarités avec le dataset d’entraînement. Un avertissement est affiché dans l’interface Streamlit.</w:t>
       </w:r>
     </w:p>
     <w:bookmarkEnd w:id="77"/>
@@ -4247,7 +4247,7 @@
         <w:pStyle w:val="Heading3"/>
       </w:pPr>
       <w:r>
-        <w:t xml:space="preserve">B.1 — DistilBERT (Transformers)</w:t>
+        <w:t xml:space="preserve">B.1 : DistilBERT (Transformers)</w:t>
       </w:r>
     </w:p>
     <w:p>
@@ -4493,7 +4493,7 @@
         <w:pStyle w:val="Heading3"/>
       </w:pPr>
       <w:r>
-        <w:t xml:space="preserve">B.5 — MLflow (Tracking des expérimentations)</w:t>
+        <w:t xml:space="preserve">B.5 : MLflow (Tracking des expérimentations)</w:t>
       </w:r>
     </w:p>
     <w:p>
@@ -4651,7 +4651,7 @@
         <w:pStyle w:val="Heading3"/>
       </w:pPr>
       <w:r>
-        <w:t xml:space="preserve">B.3 — CI/CD (GitHub Actions)</w:t>
+        <w:t xml:space="preserve">B.3 : CI/CD (GitHub Actions)</w:t>
       </w:r>
     </w:p>
     <w:p>
@@ -4699,7 +4699,7 @@
         <w:pStyle w:val="Heading3"/>
       </w:pPr>
       <w:r>
-        <w:t xml:space="preserve">B.2 — Hugging Face Spaces</w:t>
+        <w:t xml:space="preserve">B.2 : Hugging Face Spaces</w:t>
       </w:r>
     </w:p>
     <w:p>

</xml_diff>

<commit_message>
rapport: captions figures/tableaux, TOC, tables numerotees, 21 pages
</commit_message>
<xml_diff>
--- a/reports/rapport.docx
+++ b/reports/rapport.docx
@@ -1116,6 +1116,14 @@
         <w:t xml:space="preserve">(stratifée) a été appliquée pour évaluer la stabilité :</w:t>
       </w:r>
     </w:p>
+    <w:p>
+      <w:pPr>
+        <w:pStyle w:val="BodyText"/>
+      </w:pPr>
+      <w:r>
+        <w:t xml:space="preserve">Tableau 1 : Comparaison des performances des 4 modèles avec validation croisée et sur le jeu de test</w:t>
+      </w:r>
+    </w:p>
     <w:tbl>
       <w:tblPr>
         <w:tblStyle w:val="Table"/>
@@ -1576,7 +1584,7 @@
           <wp:inline>
             <wp:extent cx="5334000" cy="1405711"/>
             <wp:effectExtent b="0" l="0" r="0" t="0"/>
-            <wp:docPr descr="Matrices de confusion des 3 modèles classiques" title="" id="22" name="Picture"/>
+            <wp:docPr descr="Figure 1 : Matrices de confusion des 3 modèles classiques (LR, NB, RF) sur le jeu de test" title="" id="22" name="Picture"/>
             <a:graphic>
               <a:graphicData uri="http://schemas.openxmlformats.org/drawingml/2006/picture">
                 <pic:pic>
@@ -1619,7 +1627,7 @@
         <w:pStyle w:val="ImageCaption"/>
       </w:pPr>
       <w:r>
-        <w:t xml:space="preserve">Matrices de confusion des 3 modèles classiques</w:t>
+        <w:t xml:space="preserve">Figure 1 : Matrices de confusion des 3 modèles classiques (LR, NB, RF) sur le jeu de test</w:t>
       </w:r>
     </w:p>
     <w:p>
@@ -1657,7 +1665,7 @@
           <wp:inline>
             <wp:extent cx="5334000" cy="3760629"/>
             <wp:effectExtent b="0" l="0" r="0" t="0"/>
-            <wp:docPr descr="Courbes ROC des 3 modèles" title="" id="26" name="Picture"/>
+            <wp:docPr descr="Figure 2 : Courbes ROC des 3 modèles classiques avec AUC" title="" id="26" name="Picture"/>
             <a:graphic>
               <a:graphicData uri="http://schemas.openxmlformats.org/drawingml/2006/picture">
                 <pic:pic>
@@ -1700,7 +1708,7 @@
         <w:pStyle w:val="ImageCaption"/>
       </w:pPr>
       <w:r>
-        <w:t xml:space="preserve">Courbes ROC des 3 modèles</w:t>
+        <w:t xml:space="preserve">Figure 2 : Courbes ROC des 3 modèles classiques avec AUC</w:t>
       </w:r>
     </w:p>
     <w:p>
@@ -1730,7 +1738,7 @@
           <wp:inline>
             <wp:extent cx="5334000" cy="3306719"/>
             <wp:effectExtent b="0" l="0" r="0" t="0"/>
-            <wp:docPr descr="Courbes d’apprentissage" title="" id="30" name="Picture"/>
+            <wp:docPr descr="Figure 3 : Courbe d’apprentissage du Random Forest (évolution du F1 en fonction de la taille d’entraînement)" title="" id="30" name="Picture"/>
             <a:graphic>
               <a:graphicData uri="http://schemas.openxmlformats.org/drawingml/2006/picture">
                 <pic:pic>
@@ -1773,7 +1781,7 @@
         <w:pStyle w:val="ImageCaption"/>
       </w:pPr>
       <w:r>
-        <w:t xml:space="preserve">Courbes d’apprentissage</w:t>
+        <w:t xml:space="preserve">Figure 3 : Courbe d’apprentissage du Random Forest (évolution du F1 en fonction de la taille d’entraînement)</w:t>
       </w:r>
     </w:p>
     <w:p>
@@ -1803,7 +1811,7 @@
           <wp:inline>
             <wp:extent cx="5334000" cy="3993730"/>
             <wp:effectExtent b="0" l="0" r="0" t="0"/>
-            <wp:docPr descr="Importance des features" title="" id="34" name="Picture"/>
+            <wp:docPr descr="Figure 4 : Importance des 20 mots les plus discriminants selon le Random Forest" title="" id="34" name="Picture"/>
             <a:graphic>
               <a:graphicData uri="http://schemas.openxmlformats.org/drawingml/2006/picture">
                 <pic:pic>
@@ -1846,7 +1854,7 @@
         <w:pStyle w:val="ImageCaption"/>
       </w:pPr>
       <w:r>
-        <w:t xml:space="preserve">Importance des features</w:t>
+        <w:t xml:space="preserve">Figure 4 : Importance des 20 mots les plus discriminants selon le Random Forest</w:t>
       </w:r>
     </w:p>
     <w:p>
@@ -1988,6 +1996,14 @@
       </w:pPr>
       <w:r>
         <w:t xml:space="preserve">Régression Logistique</w:t>
+      </w:r>
+    </w:p>
+    <w:p>
+      <w:pPr>
+        <w:pStyle w:val="FirstParagraph"/>
+      </w:pPr>
+      <w:r>
+        <w:t xml:space="preserve">Tableau 2 : Grid Search pour la régression logistique — évolution du F1 moyen selon la régularisation C</w:t>
       </w:r>
     </w:p>
     <w:tbl>
@@ -2187,6 +2203,14 @@
       </w:pPr>
       <w:r>
         <w:t xml:space="preserve">Random Forest</w:t>
+      </w:r>
+    </w:p>
+    <w:p>
+      <w:pPr>
+        <w:pStyle w:val="FirstParagraph"/>
+      </w:pPr>
+      <w:r>
+        <w:t xml:space="preserve">Tableau 3 : Grid Search pour le Random Forest — évolution du F1 moyen selon le nombre d’arbres et la profondeur</w:t>
       </w:r>
     </w:p>
     <w:tbl>
@@ -3100,7 +3124,7 @@
           <wp:inline>
             <wp:extent cx="5334000" cy="3750468"/>
             <wp:effectExtent b="0" l="0" r="0" t="0"/>
-            <wp:docPr descr="Interface Streamlit" title="" id="47" name="Picture"/>
+            <wp:docPr descr="Figure 5 : Interface principale de l’application Streamlit avec les 4 onglets" title="" id="47" name="Picture"/>
             <a:graphic>
               <a:graphicData uri="http://schemas.openxmlformats.org/drawingml/2006/picture">
                 <pic:pic>
@@ -3145,7 +3169,7 @@
           <wp:inline>
             <wp:extent cx="5334000" cy="3750468"/>
             <wp:effectExtent b="0" l="0" r="0" t="0"/>
-            <wp:docPr descr="Prédiction Streamlit" title="" id="50" name="Picture"/>
+            <wp:docPr descr="Figure 6 : Prédiction d’un tweet suspect avec les 4 modèles et scores de confiance" title="" id="50" name="Picture"/>
             <a:graphic>
               <a:graphicData uri="http://schemas.openxmlformats.org/drawingml/2006/picture">
                 <pic:pic>
@@ -3272,7 +3296,7 @@
           <wp:inline>
             <wp:extent cx="5334000" cy="3750468"/>
             <wp:effectExtent b="0" l="0" r="0" t="0"/>
-            <wp:docPr descr="Tableau de bord dynamique" title="" id="54" name="Picture"/>
+            <wp:docPr descr="Figure 7 : Tableau de bord dynamique avec sélecteur de modèle, matrice de confusion et courbes ROC" title="" id="54" name="Picture"/>
             <a:graphic>
               <a:graphicData uri="http://schemas.openxmlformats.org/drawingml/2006/picture">
                 <pic:pic>
@@ -3315,7 +3339,7 @@
         <w:pStyle w:val="ImageCaption"/>
       </w:pPr>
       <w:r>
-        <w:t xml:space="preserve">Tableau de bord dynamique</w:t>
+        <w:t xml:space="preserve">Figure 7 : Tableau de bord dynamique avec sélecteur de modèle, matrice de confusion et courbes ROC</w:t>
       </w:r>
     </w:p>
     <w:bookmarkEnd w:id="56"/>
@@ -3412,7 +3436,7 @@
           <wp:inline>
             <wp:extent cx="5334000" cy="3750468"/>
             <wp:effectExtent b="0" l="0" r="0" t="0"/>
-            <wp:docPr descr="Historique des analyses" title="" id="59" name="Picture"/>
+            <wp:docPr descr="Figure 8 : Historique des analyses avec horodatage et résultats détaillés par modèle" title="" id="59" name="Picture"/>
             <a:graphic>
               <a:graphicData uri="http://schemas.openxmlformats.org/drawingml/2006/picture">
                 <pic:pic>
@@ -3455,7 +3479,7 @@
         <w:pStyle w:val="ImageCaption"/>
       </w:pPr>
       <w:r>
-        <w:t xml:space="preserve">Historique des analyses</w:t>
+        <w:t xml:space="preserve">Figure 8 : Historique des analyses avec horodatage et résultats détaillés par modèle</w:t>
       </w:r>
     </w:p>
     <w:bookmarkEnd w:id="61"/>
@@ -3751,6 +3775,14 @@
       </w:pPr>
       <w:r>
         <w:t xml:space="preserve">Difficultés rencontrées et solutions</w:t>
+      </w:r>
+    </w:p>
+    <w:p>
+      <w:pPr>
+        <w:pStyle w:val="FirstParagraph"/>
+      </w:pPr>
+      <w:r>
+        <w:t xml:space="preserve">Tableau 4 : Récapitulatif des difficultés techniques rencontrées et de leurs solutions</w:t>
       </w:r>
     </w:p>
     <w:tbl>
@@ -4238,7 +4270,7 @@
         <w:pStyle w:val="FirstParagraph"/>
       </w:pPr>
       <w:r>
-        <w:t xml:space="preserve">En complément du cahier des charges initial, 4 fonctionnalités bonus ont été implémentées avec succès :</w:t>
+        <w:t xml:space="preserve">En complément du cahier des charges initial, 5 fonctionnalités bonus ont été implémentées avec succès :</w:t>
       </w:r>
     </w:p>
     <w:bookmarkStart w:id="81" w:name="b.1-distilbert-transformers"/>
@@ -4287,6 +4319,14 @@
       </w:r>
       <w:r>
         <w:t xml:space="preserve">sur le dataset de tweets. Résultats après 1 époque (sur CPU, ~6 min) :</w:t>
+      </w:r>
+    </w:p>
+    <w:p>
+      <w:pPr>
+        <w:pStyle w:val="BodyText"/>
+      </w:pPr>
+      <w:r>
+        <w:t xml:space="preserve">Tableau 5 : Performances du modèle DistilBERT sur le jeu de test</w:t>
       </w:r>
     </w:p>
     <w:tbl>

</xml_diff>